<commit_message>
docs: fleet database plan with the re-arranged areas diagram
Co-Authored-By: Claude Fable 5.1 <noreply@anthropic.com>
</commit_message>
<xml_diff>
--- a/docs/database/PikPak Fleet Database Plan.docx
+++ b/docs/database/PikPak Fleet Database Plan.docx
@@ -605,7 +605,7 @@
           <w:sz w:val="22"/>
           <w:szCs w:val="22"/>
         </w:rPr>
-        <w:t xml:space="preserve">The system table is the hub; every other area attaches to it or to customer. Each area is a box below.</w:t>
+        <w:t xml:space="preserve">The fleet's system table is the hub in the middle of the top row; everything that hangs off it fans in from the bottom row, and customers sit top-left above the products they own, so no arrow crosses another.</w:t>
       </w:r>
     </w:p>
     <w:p>
@@ -616,7 +616,7 @@
       <w:r>
         <w:drawing>
           <wp:inline distT="0" distB="0" distL="0" distR="0">
-            <wp:extent cx="6286500" cy="2828925"/>
+            <wp:extent cx="6096000" cy="2809875"/>
             <wp:effectExtent t="0" r="0" b="0" l="0"/>
             <wp:docPr id="1" name="" descr="" title=""/>
             <wp:cNvGraphicFramePr>
@@ -641,7 +641,7 @@
                   <pic:spPr bwMode="auto">
                     <a:xfrm>
                       <a:off x="0" y="0"/>
-                      <a:ext cx="6286500" cy="2828925"/>
+                      <a:ext cx="6096000" cy="2809875"/>
                     </a:xfrm>
                     <a:prstGeom prst="rect">
                       <a:avLst/>

</xml_diff>

<commit_message>
docs: fleet database plan, decisions split into now and soon
Co-Authored-By: Claude Fable 5.1 <noreply@anthropic.com>
</commit_message>
<xml_diff>
--- a/docs/database/PikPak Fleet Database Plan.docx
+++ b/docs/database/PikPak Fleet Database Plan.docx
@@ -15088,6 +15088,54 @@
           <w:sz w:val="22"/>
           <w:szCs w:val="22"/>
         </w:rPr>
+        <w:t xml:space="preserve">Identifiers. </w:t>
+      </w:r>
+      <w:r>
+        <w:rPr>
+          <w:rFonts w:ascii="Calibri" w:cs="Calibri" w:eastAsia="Calibri" w:hAnsi="Calibri"/>
+          <w:color w:val="1B2430"/>
+          <w:sz w:val="22"/>
+          <w:szCs w:val="22"/>
+        </w:rPr>
+        <w:t xml:space="preserve">Serial-number format, tray numbering, that SKU codes come from Elastic's SKU name, and the ISS / MNT / RC reference scheme.</w:t>
+      </w:r>
+    </w:p>
+    <w:p>
+      <w:pPr>
+        <w:pStyle w:val="Heading2"/>
+        <w:keepNext/>
+        <w:spacing w:after="120" w:before="260"/>
+      </w:pPr>
+      <w:r>
+        <w:rPr>
+          <w:rFonts w:ascii="Calibri" w:cs="Calibri" w:eastAsia="Calibri" w:hAnsi="Calibri"/>
+          <w:b/>
+          <w:bCs/>
+          <w:color w:val="1F6F8B"/>
+          <w:sz w:val="26"/>
+          <w:szCs w:val="26"/>
+        </w:rPr>
+        <w:t xml:space="preserve">Decisions needed soon</w:t>
+      </w:r>
+    </w:p>
+    <w:p>
+      <w:pPr>
+        <w:pStyle w:val="ListParagraph"/>
+        <w:numPr>
+          <w:ilvl w:val="0"/>
+          <w:numId w:val="2"/>
+        </w:numPr>
+        <w:spacing w:after="60" w:line="264"/>
+      </w:pPr>
+      <w:r>
+        <w:rPr>
+          <w:rFonts w:ascii="Calibri" w:cs="Calibri" w:eastAsia="Calibri" w:hAnsi="Calibri"/>
+          <w:b/>
+          <w:bCs/>
+          <w:color w:val="1B2430"/>
+          <w:sz w:val="22"/>
+          <w:szCs w:val="22"/>
+        </w:rPr>
         <w:t xml:space="preserve">Data owners. </w:t>
       </w:r>
       <w:r>
@@ -15148,36 +15196,6 @@
           <w:sz w:val="22"/>
           <w:szCs w:val="22"/>
         </w:rPr>
-        <w:t xml:space="preserve">Identifiers. </w:t>
-      </w:r>
-      <w:r>
-        <w:rPr>
-          <w:rFonts w:ascii="Calibri" w:cs="Calibri" w:eastAsia="Calibri" w:hAnsi="Calibri"/>
-          <w:color w:val="1B2430"/>
-          <w:sz w:val="22"/>
-          <w:szCs w:val="22"/>
-        </w:rPr>
-        <w:t xml:space="preserve">Serial-number format, tray numbering, that SKU codes come from Elastic's SKU name, and the ISS / MNT / RC reference scheme.</w:t>
-      </w:r>
-    </w:p>
-    <w:p>
-      <w:pPr>
-        <w:pStyle w:val="ListParagraph"/>
-        <w:numPr>
-          <w:ilvl w:val="0"/>
-          <w:numId w:val="2"/>
-        </w:numPr>
-        <w:spacing w:after="60" w:line="264"/>
-      </w:pPr>
-      <w:r>
-        <w:rPr>
-          <w:rFonts w:ascii="Calibri" w:cs="Calibri" w:eastAsia="Calibri" w:hAnsi="Calibri"/>
-          <w:b/>
-          <w:bCs/>
-          <w:color w:val="1B2430"/>
-          <w:sz w:val="22"/>
-          <w:szCs w:val="22"/>
-        </w:rPr>
         <w:t xml:space="preserve">Where Grafana reads from today, </w:t>
       </w:r>
       <w:r>
@@ -15188,81 +15206,6 @@
           <w:szCs w:val="22"/>
         </w:rPr>
         <w:t xml:space="preserve">its retention and how far back data still exists, since that decides how telemetry gets in.</w:t>
-      </w:r>
-    </w:p>
-    <w:p>
-      <w:pPr>
-        <w:pStyle w:val="Heading2"/>
-        <w:keepNext/>
-        <w:spacing w:after="120" w:before="260"/>
-      </w:pPr>
-      <w:r>
-        <w:rPr>
-          <w:rFonts w:ascii="Calibri" w:cs="Calibri" w:eastAsia="Calibri" w:hAnsi="Calibri"/>
-          <w:b/>
-          <w:bCs/>
-          <w:color w:val="1F6F8B"/>
-          <w:sz w:val="26"/>
-          <w:szCs w:val="26"/>
-        </w:rPr>
-        <w:t xml:space="preserve">Next steps</w:t>
-      </w:r>
-    </w:p>
-    <w:p>
-      <w:pPr>
-        <w:pStyle w:val="ListParagraph"/>
-        <w:numPr>
-          <w:ilvl w:val="0"/>
-          <w:numId w:val="2"/>
-        </w:numPr>
-        <w:spacing w:after="60" w:line="264"/>
-      </w:pPr>
-      <w:r>
-        <w:rPr>
-          <w:rFonts w:ascii="Calibri" w:cs="Calibri" w:eastAsia="Calibri" w:hAnsi="Calibri"/>
-          <w:color w:val="1B2430"/>
-          <w:sz w:val="22"/>
-          <w:szCs w:val="22"/>
-        </w:rPr>
-        <w:t xml:space="preserve">This week: the spreadsheet inventory (DB-001) and the Grafana backend question (DB-080) need nothing but time.</w:t>
-      </w:r>
-    </w:p>
-    <w:p>
-      <w:pPr>
-        <w:pStyle w:val="ListParagraph"/>
-        <w:numPr>
-          <w:ilvl w:val="0"/>
-          <w:numId w:val="2"/>
-        </w:numPr>
-        <w:spacing w:after="60" w:line="264"/>
-      </w:pPr>
-      <w:r>
-        <w:rPr>
-          <w:rFonts w:ascii="Calibri" w:cs="Calibri" w:eastAsia="Calibri" w:hAnsi="Calibri"/>
-          <w:color w:val="1B2430"/>
-          <w:sz w:val="22"/>
-          <w:szCs w:val="22"/>
-        </w:rPr>
-        <w:t xml:space="preserve">Next week: the hands-on trial (DB-005 to DB-009), half a day each, with a written note at the end.</w:t>
-      </w:r>
-    </w:p>
-    <w:p>
-      <w:pPr>
-        <w:pStyle w:val="ListParagraph"/>
-        <w:numPr>
-          <w:ilvl w:val="0"/>
-          <w:numId w:val="2"/>
-        </w:numPr>
-        <w:spacing w:after="60" w:line="264"/>
-      </w:pPr>
-      <w:r>
-        <w:rPr>
-          <w:rFonts w:ascii="Calibri" w:cs="Calibri" w:eastAsia="Calibri" w:hAnsi="Calibri"/>
-          <w:color w:val="1B2430"/>
-          <w:sz w:val="22"/>
-          <w:szCs w:val="22"/>
-        </w:rPr>
-        <w:t xml:space="preserve">Then Epic 1, once the decision record is signed.</w:t>
       </w:r>
     </w:p>
     <w:sectPr>

</xml_diff>

<commit_message>
docs: fleet database plan without timescales in the appendix
Co-Authored-By: Claude Fable 5.1 <noreply@anthropic.com>
</commit_message>
<xml_diff>
--- a/docs/database/PikPak Fleet Database Plan.docx
+++ b/docs/database/PikPak Fleet Database Plan.docx
@@ -196,7 +196,7 @@
                 <w:sz w:val="22"/>
                 <w:szCs w:val="22"/>
               </w:rPr>
-              <w:t xml:space="preserve">Agreement on the eight areas and the tables in them, on the engine, and on the order of work. About thirteen weeks for one engineer, and Azure costs of roughly £100 a month.</w:t>
+              <w:t xml:space="preserve">Agreement on the eight areas and the tables in them, on the engine, and on the order of work. Azure costs are roughly £100 a month.</w:t>
             </w:r>
           </w:p>
           <w:p>
@@ -221,7 +221,7 @@
                 <w:sz w:val="22"/>
                 <w:szCs w:val="22"/>
               </w:rPr>
-              <w:t xml:space="preserve">A one-week discovery to inventory the spreadsheets and name the data owners, then a two-day hands-on trial of the managed database before any real infrastructure is built.</w:t>
+              <w:t xml:space="preserve">A discovery pass to inventory the spreadsheets and name the data owners, then a short hands-on trial of the managed database before any real infrastructure is built.</w:t>
             </w:r>
           </w:p>
         </w:tc>
@@ -6058,7 +6058,7 @@
           <w:sz w:val="22"/>
           <w:szCs w:val="22"/>
         </w:rPr>
-        <w:t xml:space="preserve">Ten epics, fifty-five tickets, in dependency order. Estimates are working days for one person. Every ticket has acceptance criteria so it can be closed without discussion; the full text is in the working plan, this is the shape.</w:t>
+        <w:t xml:space="preserve">Ten epics, fifty-five tickets, in dependency order. No timescales are given: the order matters, the durations depend on who does the work and how. Every ticket has acceptance criteria so it can be closed without discussion; the full text is in the working plan, this is the shape.</w:t>
       </w:r>
     </w:p>
     <w:p>
@@ -6076,7 +6076,7 @@
           <w:sz w:val="26"/>
           <w:szCs w:val="26"/>
         </w:rPr>
-        <w:t xml:space="preserve">Epic 0 · Discovery and decisions (1 week)</w:t>
+        <w:t xml:space="preserve">Epic 0 · Discovery and decisions</w:t>
       </w:r>
     </w:p>
     <w:tbl>
@@ -6093,9 +6093,8 @@
       </w:tblPr>
       <w:tblGrid>
         <w:gridCol w:w="900"/>
-        <w:gridCol w:w="5400"/>
-        <w:gridCol w:w="1200"/>
-        <w:gridCol w:w="2138"/>
+        <w:gridCol w:w="5900"/>
+        <w:gridCol w:w="2838"/>
       </w:tblGrid>
       <w:tr>
         <w:trPr>
@@ -6137,7 +6136,7 @@
         </w:tc>
         <w:tc>
           <w:tcPr>
-            <w:tcW w:type="dxa" w:w="5400"/>
+            <w:tcW w:type="dxa" w:w="5900"/>
             <w:tcBorders>
               <w:top w:val="single" w:color="D6DAD3" w:sz="4"/>
               <w:left w:val="single" w:color="D6DAD3" w:sz="4"/>
@@ -6171,41 +6170,7 @@
         </w:tc>
         <w:tc>
           <w:tcPr>
-            <w:tcW w:type="dxa" w:w="1200"/>
-            <w:tcBorders>
-              <w:top w:val="single" w:color="D6DAD3" w:sz="4"/>
-              <w:left w:val="single" w:color="D6DAD3" w:sz="4"/>
-              <w:bottom w:val="single" w:color="D6DAD3" w:sz="4"/>
-              <w:right w:val="single" w:color="D6DAD3" w:sz="4"/>
-            </w:tcBorders>
-            <w:shd w:fill="ECEEE9" w:color="auto" w:val="clear"/>
-            <w:tcMar>
-              <w:top w:type="dxa" w:w="60"/>
-              <w:left w:type="dxa" w:w="100"/>
-              <w:bottom w:type="dxa" w:w="60"/>
-              <w:right w:type="dxa" w:w="100"/>
-            </w:tcMar>
-          </w:tcPr>
-          <w:p>
-            <w:pPr>
-              <w:spacing w:after="0" w:line="252"/>
-            </w:pPr>
-            <w:r>
-              <w:rPr>
-                <w:rFonts w:ascii="Calibri" w:cs="Calibri" w:eastAsia="Calibri" w:hAnsi="Calibri"/>
-                <w:b/>
-                <w:bCs/>
-                <w:color w:val="4A5563"/>
-                <w:sz w:val="19"/>
-                <w:szCs w:val="19"/>
-              </w:rPr>
-              <w:t xml:space="preserve">Days</w:t>
-            </w:r>
-          </w:p>
-        </w:tc>
-        <w:tc>
-          <w:tcPr>
-            <w:tcW w:type="dxa" w:w="2138"/>
+            <w:tcW w:type="dxa" w:w="2838"/>
             <w:tcBorders>
               <w:top w:val="single" w:color="D6DAD3" w:sz="4"/>
               <w:left w:val="single" w:color="D6DAD3" w:sz="4"/>
@@ -6275,7 +6240,7 @@
         </w:tc>
         <w:tc>
           <w:tcPr>
-            <w:tcW w:type="dxa" w:w="5400"/>
+            <w:tcW w:type="dxa" w:w="5900"/>
             <w:tcBorders>
               <w:top w:val="single" w:color="D6DAD3" w:sz="4"/>
               <w:left w:val="single" w:color="D6DAD3" w:sz="4"/>
@@ -6306,38 +6271,7 @@
         </w:tc>
         <w:tc>
           <w:tcPr>
-            <w:tcW w:type="dxa" w:w="1200"/>
-            <w:tcBorders>
-              <w:top w:val="single" w:color="D6DAD3" w:sz="4"/>
-              <w:left w:val="single" w:color="D6DAD3" w:sz="4"/>
-              <w:bottom w:val="single" w:color="D6DAD3" w:sz="4"/>
-              <w:right w:val="single" w:color="D6DAD3" w:sz="4"/>
-            </w:tcBorders>
-            <w:tcMar>
-              <w:top w:type="dxa" w:w="60"/>
-              <w:left w:type="dxa" w:w="100"/>
-              <w:bottom w:type="dxa" w:w="60"/>
-              <w:right w:type="dxa" w:w="100"/>
-            </w:tcMar>
-          </w:tcPr>
-          <w:p>
-            <w:pPr>
-              <w:spacing w:after="0" w:line="252"/>
-            </w:pPr>
-            <w:r>
-              <w:rPr>
-                <w:rFonts w:ascii="Calibri" w:cs="Calibri" w:eastAsia="Calibri" w:hAnsi="Calibri"/>
-                <w:color w:val="1B2430"/>
-                <w:sz w:val="22"/>
-                <w:szCs w:val="22"/>
-              </w:rPr>
-              <w:t xml:space="preserve">2</w:t>
-            </w:r>
-          </w:p>
-        </w:tc>
-        <w:tc>
-          <w:tcPr>
-            <w:tcW w:type="dxa" w:w="2138"/>
+            <w:tcW w:type="dxa" w:w="2838"/>
             <w:tcBorders>
               <w:top w:val="single" w:color="D6DAD3" w:sz="4"/>
               <w:left w:val="single" w:color="D6DAD3" w:sz="4"/>
@@ -6404,7 +6338,7 @@
         </w:tc>
         <w:tc>
           <w:tcPr>
-            <w:tcW w:type="dxa" w:w="5400"/>
+            <w:tcW w:type="dxa" w:w="5900"/>
             <w:tcBorders>
               <w:top w:val="single" w:color="D6DAD3" w:sz="4"/>
               <w:left w:val="single" w:color="D6DAD3" w:sz="4"/>
@@ -6435,38 +6369,7 @@
         </w:tc>
         <w:tc>
           <w:tcPr>
-            <w:tcW w:type="dxa" w:w="1200"/>
-            <w:tcBorders>
-              <w:top w:val="single" w:color="D6DAD3" w:sz="4"/>
-              <w:left w:val="single" w:color="D6DAD3" w:sz="4"/>
-              <w:bottom w:val="single" w:color="D6DAD3" w:sz="4"/>
-              <w:right w:val="single" w:color="D6DAD3" w:sz="4"/>
-            </w:tcBorders>
-            <w:tcMar>
-              <w:top w:type="dxa" w:w="60"/>
-              <w:left w:type="dxa" w:w="100"/>
-              <w:bottom w:type="dxa" w:w="60"/>
-              <w:right w:type="dxa" w:w="100"/>
-            </w:tcMar>
-          </w:tcPr>
-          <w:p>
-            <w:pPr>
-              <w:spacing w:after="0" w:line="252"/>
-            </w:pPr>
-            <w:r>
-              <w:rPr>
-                <w:rFonts w:ascii="Calibri" w:cs="Calibri" w:eastAsia="Calibri" w:hAnsi="Calibri"/>
-                <w:color w:val="1B2430"/>
-                <w:sz w:val="22"/>
-                <w:szCs w:val="22"/>
-              </w:rPr>
-              <w:t xml:space="preserve">1</w:t>
-            </w:r>
-          </w:p>
-        </w:tc>
-        <w:tc>
-          <w:tcPr>
-            <w:tcW w:type="dxa" w:w="2138"/>
+            <w:tcW w:type="dxa" w:w="2838"/>
             <w:tcBorders>
               <w:top w:val="single" w:color="D6DAD3" w:sz="4"/>
               <w:left w:val="single" w:color="D6DAD3" w:sz="4"/>
@@ -6533,7 +6436,7 @@
         </w:tc>
         <w:tc>
           <w:tcPr>
-            <w:tcW w:type="dxa" w:w="5400"/>
+            <w:tcW w:type="dxa" w:w="5900"/>
             <w:tcBorders>
               <w:top w:val="single" w:color="D6DAD3" w:sz="4"/>
               <w:left w:val="single" w:color="D6DAD3" w:sz="4"/>
@@ -6564,38 +6467,7 @@
         </w:tc>
         <w:tc>
           <w:tcPr>
-            <w:tcW w:type="dxa" w:w="1200"/>
-            <w:tcBorders>
-              <w:top w:val="single" w:color="D6DAD3" w:sz="4"/>
-              <w:left w:val="single" w:color="D6DAD3" w:sz="4"/>
-              <w:bottom w:val="single" w:color="D6DAD3" w:sz="4"/>
-              <w:right w:val="single" w:color="D6DAD3" w:sz="4"/>
-            </w:tcBorders>
-            <w:tcMar>
-              <w:top w:type="dxa" w:w="60"/>
-              <w:left w:type="dxa" w:w="100"/>
-              <w:bottom w:type="dxa" w:w="60"/>
-              <w:right w:type="dxa" w:w="100"/>
-            </w:tcMar>
-          </w:tcPr>
-          <w:p>
-            <w:pPr>
-              <w:spacing w:after="0" w:line="252"/>
-            </w:pPr>
-            <w:r>
-              <w:rPr>
-                <w:rFonts w:ascii="Calibri" w:cs="Calibri" w:eastAsia="Calibri" w:hAnsi="Calibri"/>
-                <w:color w:val="1B2430"/>
-                <w:sz w:val="22"/>
-                <w:szCs w:val="22"/>
-              </w:rPr>
-              <w:t xml:space="preserve">1</w:t>
-            </w:r>
-          </w:p>
-        </w:tc>
-        <w:tc>
-          <w:tcPr>
-            <w:tcW w:type="dxa" w:w="2138"/>
+            <w:tcW w:type="dxa" w:w="2838"/>
             <w:tcBorders>
               <w:top w:val="single" w:color="D6DAD3" w:sz="4"/>
               <w:left w:val="single" w:color="D6DAD3" w:sz="4"/>
@@ -6662,7 +6534,7 @@
         </w:tc>
         <w:tc>
           <w:tcPr>
-            <w:tcW w:type="dxa" w:w="5400"/>
+            <w:tcW w:type="dxa" w:w="5900"/>
             <w:tcBorders>
               <w:top w:val="single" w:color="D6DAD3" w:sz="4"/>
               <w:left w:val="single" w:color="D6DAD3" w:sz="4"/>
@@ -6693,38 +6565,7 @@
         </w:tc>
         <w:tc>
           <w:tcPr>
-            <w:tcW w:type="dxa" w:w="1200"/>
-            <w:tcBorders>
-              <w:top w:val="single" w:color="D6DAD3" w:sz="4"/>
-              <w:left w:val="single" w:color="D6DAD3" w:sz="4"/>
-              <w:bottom w:val="single" w:color="D6DAD3" w:sz="4"/>
-              <w:right w:val="single" w:color="D6DAD3" w:sz="4"/>
-            </w:tcBorders>
-            <w:tcMar>
-              <w:top w:type="dxa" w:w="60"/>
-              <w:left w:type="dxa" w:w="100"/>
-              <w:bottom w:type="dxa" w:w="60"/>
-              <w:right w:type="dxa" w:w="100"/>
-            </w:tcMar>
-          </w:tcPr>
-          <w:p>
-            <w:pPr>
-              <w:spacing w:after="0" w:line="252"/>
-            </w:pPr>
-            <w:r>
-              <w:rPr>
-                <w:rFonts w:ascii="Calibri" w:cs="Calibri" w:eastAsia="Calibri" w:hAnsi="Calibri"/>
-                <w:color w:val="1B2430"/>
-                <w:sz w:val="22"/>
-                <w:szCs w:val="22"/>
-              </w:rPr>
-              <w:t xml:space="preserve">1</w:t>
-            </w:r>
-          </w:p>
-        </w:tc>
-        <w:tc>
-          <w:tcPr>
-            <w:tcW w:type="dxa" w:w="2138"/>
+            <w:tcW w:type="dxa" w:w="2838"/>
             <w:tcBorders>
               <w:top w:val="single" w:color="D6DAD3" w:sz="4"/>
               <w:left w:val="single" w:color="D6DAD3" w:sz="4"/>
@@ -6770,7 +6611,7 @@
           <w:sz w:val="26"/>
           <w:szCs w:val="26"/>
         </w:rPr>
-        <w:t xml:space="preserve">Epic 0.5 · Hands-on trial of the managed PostgreSQL (2 to 3 days)</w:t>
+        <w:t xml:space="preserve">Epic 0.5 · Hands-on trial of the managed PostgreSQL</w:t>
       </w:r>
     </w:p>
     <w:tbl>
@@ -6787,9 +6628,8 @@
       </w:tblPr>
       <w:tblGrid>
         <w:gridCol w:w="900"/>
-        <w:gridCol w:w="5400"/>
-        <w:gridCol w:w="1200"/>
-        <w:gridCol w:w="2138"/>
+        <w:gridCol w:w="5900"/>
+        <w:gridCol w:w="2838"/>
       </w:tblGrid>
       <w:tr>
         <w:trPr>
@@ -6831,7 +6671,7 @@
         </w:tc>
         <w:tc>
           <w:tcPr>
-            <w:tcW w:type="dxa" w:w="5400"/>
+            <w:tcW w:type="dxa" w:w="5900"/>
             <w:tcBorders>
               <w:top w:val="single" w:color="D6DAD3" w:sz="4"/>
               <w:left w:val="single" w:color="D6DAD3" w:sz="4"/>
@@ -6865,41 +6705,7 @@
         </w:tc>
         <w:tc>
           <w:tcPr>
-            <w:tcW w:type="dxa" w:w="1200"/>
-            <w:tcBorders>
-              <w:top w:val="single" w:color="D6DAD3" w:sz="4"/>
-              <w:left w:val="single" w:color="D6DAD3" w:sz="4"/>
-              <w:bottom w:val="single" w:color="D6DAD3" w:sz="4"/>
-              <w:right w:val="single" w:color="D6DAD3" w:sz="4"/>
-            </w:tcBorders>
-            <w:shd w:fill="ECEEE9" w:color="auto" w:val="clear"/>
-            <w:tcMar>
-              <w:top w:type="dxa" w:w="60"/>
-              <w:left w:type="dxa" w:w="100"/>
-              <w:bottom w:type="dxa" w:w="60"/>
-              <w:right w:type="dxa" w:w="100"/>
-            </w:tcMar>
-          </w:tcPr>
-          <w:p>
-            <w:pPr>
-              <w:spacing w:after="0" w:line="252"/>
-            </w:pPr>
-            <w:r>
-              <w:rPr>
-                <w:rFonts w:ascii="Calibri" w:cs="Calibri" w:eastAsia="Calibri" w:hAnsi="Calibri"/>
-                <w:b/>
-                <w:bCs/>
-                <w:color w:val="4A5563"/>
-                <w:sz w:val="19"/>
-                <w:szCs w:val="19"/>
-              </w:rPr>
-              <w:t xml:space="preserve">Days</w:t>
-            </w:r>
-          </w:p>
-        </w:tc>
-        <w:tc>
-          <w:tcPr>
-            <w:tcW w:type="dxa" w:w="2138"/>
+            <w:tcW w:type="dxa" w:w="2838"/>
             <w:tcBorders>
               <w:top w:val="single" w:color="D6DAD3" w:sz="4"/>
               <w:left w:val="single" w:color="D6DAD3" w:sz="4"/>
@@ -6969,7 +6775,7 @@
         </w:tc>
         <w:tc>
           <w:tcPr>
-            <w:tcW w:type="dxa" w:w="5400"/>
+            <w:tcW w:type="dxa" w:w="5900"/>
             <w:tcBorders>
               <w:top w:val="single" w:color="D6DAD3" w:sz="4"/>
               <w:left w:val="single" w:color="D6DAD3" w:sz="4"/>
@@ -7000,38 +6806,7 @@
         </w:tc>
         <w:tc>
           <w:tcPr>
-            <w:tcW w:type="dxa" w:w="1200"/>
-            <w:tcBorders>
-              <w:top w:val="single" w:color="D6DAD3" w:sz="4"/>
-              <w:left w:val="single" w:color="D6DAD3" w:sz="4"/>
-              <w:bottom w:val="single" w:color="D6DAD3" w:sz="4"/>
-              <w:right w:val="single" w:color="D6DAD3" w:sz="4"/>
-            </w:tcBorders>
-            <w:tcMar>
-              <w:top w:type="dxa" w:w="60"/>
-              <w:left w:type="dxa" w:w="100"/>
-              <w:bottom w:type="dxa" w:w="60"/>
-              <w:right w:type="dxa" w:w="100"/>
-            </w:tcMar>
-          </w:tcPr>
-          <w:p>
-            <w:pPr>
-              <w:spacing w:after="0" w:line="252"/>
-            </w:pPr>
-            <w:r>
-              <w:rPr>
-                <w:rFonts w:ascii="Calibri" w:cs="Calibri" w:eastAsia="Calibri" w:hAnsi="Calibri"/>
-                <w:color w:val="1B2430"/>
-                <w:sz w:val="22"/>
-                <w:szCs w:val="22"/>
-              </w:rPr>
-              <w:t xml:space="preserve">0.5</w:t>
-            </w:r>
-          </w:p>
-        </w:tc>
-        <w:tc>
-          <w:tcPr>
-            <w:tcW w:type="dxa" w:w="2138"/>
+            <w:tcW w:type="dxa" w:w="2838"/>
             <w:tcBorders>
               <w:top w:val="single" w:color="D6DAD3" w:sz="4"/>
               <w:left w:val="single" w:color="D6DAD3" w:sz="4"/>
@@ -7098,7 +6873,7 @@
         </w:tc>
         <w:tc>
           <w:tcPr>
-            <w:tcW w:type="dxa" w:w="5400"/>
+            <w:tcW w:type="dxa" w:w="5900"/>
             <w:tcBorders>
               <w:top w:val="single" w:color="D6DAD3" w:sz="4"/>
               <w:left w:val="single" w:color="D6DAD3" w:sz="4"/>
@@ -7129,38 +6904,7 @@
         </w:tc>
         <w:tc>
           <w:tcPr>
-            <w:tcW w:type="dxa" w:w="1200"/>
-            <w:tcBorders>
-              <w:top w:val="single" w:color="D6DAD3" w:sz="4"/>
-              <w:left w:val="single" w:color="D6DAD3" w:sz="4"/>
-              <w:bottom w:val="single" w:color="D6DAD3" w:sz="4"/>
-              <w:right w:val="single" w:color="D6DAD3" w:sz="4"/>
-            </w:tcBorders>
-            <w:tcMar>
-              <w:top w:type="dxa" w:w="60"/>
-              <w:left w:type="dxa" w:w="100"/>
-              <w:bottom w:type="dxa" w:w="60"/>
-              <w:right w:type="dxa" w:w="100"/>
-            </w:tcMar>
-          </w:tcPr>
-          <w:p>
-            <w:pPr>
-              <w:spacing w:after="0" w:line="252"/>
-            </w:pPr>
-            <w:r>
-              <w:rPr>
-                <w:rFonts w:ascii="Calibri" w:cs="Calibri" w:eastAsia="Calibri" w:hAnsi="Calibri"/>
-                <w:color w:val="1B2430"/>
-                <w:sz w:val="22"/>
-                <w:szCs w:val="22"/>
-              </w:rPr>
-              <w:t xml:space="preserve">0.5</w:t>
-            </w:r>
-          </w:p>
-        </w:tc>
-        <w:tc>
-          <w:tcPr>
-            <w:tcW w:type="dxa" w:w="2138"/>
+            <w:tcW w:type="dxa" w:w="2838"/>
             <w:tcBorders>
               <w:top w:val="single" w:color="D6DAD3" w:sz="4"/>
               <w:left w:val="single" w:color="D6DAD3" w:sz="4"/>
@@ -7227,7 +6971,7 @@
         </w:tc>
         <w:tc>
           <w:tcPr>
-            <w:tcW w:type="dxa" w:w="5400"/>
+            <w:tcW w:type="dxa" w:w="5900"/>
             <w:tcBorders>
               <w:top w:val="single" w:color="D6DAD3" w:sz="4"/>
               <w:left w:val="single" w:color="D6DAD3" w:sz="4"/>
@@ -7258,38 +7002,7 @@
         </w:tc>
         <w:tc>
           <w:tcPr>
-            <w:tcW w:type="dxa" w:w="1200"/>
-            <w:tcBorders>
-              <w:top w:val="single" w:color="D6DAD3" w:sz="4"/>
-              <w:left w:val="single" w:color="D6DAD3" w:sz="4"/>
-              <w:bottom w:val="single" w:color="D6DAD3" w:sz="4"/>
-              <w:right w:val="single" w:color="D6DAD3" w:sz="4"/>
-            </w:tcBorders>
-            <w:tcMar>
-              <w:top w:type="dxa" w:w="60"/>
-              <w:left w:type="dxa" w:w="100"/>
-              <w:bottom w:type="dxa" w:w="60"/>
-              <w:right w:type="dxa" w:w="100"/>
-            </w:tcMar>
-          </w:tcPr>
-          <w:p>
-            <w:pPr>
-              <w:spacing w:after="0" w:line="252"/>
-            </w:pPr>
-            <w:r>
-              <w:rPr>
-                <w:rFonts w:ascii="Calibri" w:cs="Calibri" w:eastAsia="Calibri" w:hAnsi="Calibri"/>
-                <w:color w:val="1B2430"/>
-                <w:sz w:val="22"/>
-                <w:szCs w:val="22"/>
-              </w:rPr>
-              <w:t xml:space="preserve">0.5</w:t>
-            </w:r>
-          </w:p>
-        </w:tc>
-        <w:tc>
-          <w:tcPr>
-            <w:tcW w:type="dxa" w:w="2138"/>
+            <w:tcW w:type="dxa" w:w="2838"/>
             <w:tcBorders>
               <w:top w:val="single" w:color="D6DAD3" w:sz="4"/>
               <w:left w:val="single" w:color="D6DAD3" w:sz="4"/>
@@ -7356,7 +7069,7 @@
         </w:tc>
         <w:tc>
           <w:tcPr>
-            <w:tcW w:type="dxa" w:w="5400"/>
+            <w:tcW w:type="dxa" w:w="5900"/>
             <w:tcBorders>
               <w:top w:val="single" w:color="D6DAD3" w:sz="4"/>
               <w:left w:val="single" w:color="D6DAD3" w:sz="4"/>
@@ -7387,38 +7100,7 @@
         </w:tc>
         <w:tc>
           <w:tcPr>
-            <w:tcW w:type="dxa" w:w="1200"/>
-            <w:tcBorders>
-              <w:top w:val="single" w:color="D6DAD3" w:sz="4"/>
-              <w:left w:val="single" w:color="D6DAD3" w:sz="4"/>
-              <w:bottom w:val="single" w:color="D6DAD3" w:sz="4"/>
-              <w:right w:val="single" w:color="D6DAD3" w:sz="4"/>
-            </w:tcBorders>
-            <w:tcMar>
-              <w:top w:type="dxa" w:w="60"/>
-              <w:left w:type="dxa" w:w="100"/>
-              <w:bottom w:type="dxa" w:w="60"/>
-              <w:right w:type="dxa" w:w="100"/>
-            </w:tcMar>
-          </w:tcPr>
-          <w:p>
-            <w:pPr>
-              <w:spacing w:after="0" w:line="252"/>
-            </w:pPr>
-            <w:r>
-              <w:rPr>
-                <w:rFonts w:ascii="Calibri" w:cs="Calibri" w:eastAsia="Calibri" w:hAnsi="Calibri"/>
-                <w:color w:val="1B2430"/>
-                <w:sz w:val="22"/>
-                <w:szCs w:val="22"/>
-              </w:rPr>
-              <w:t xml:space="preserve">0.5</w:t>
-            </w:r>
-          </w:p>
-        </w:tc>
-        <w:tc>
-          <w:tcPr>
-            <w:tcW w:type="dxa" w:w="2138"/>
+            <w:tcW w:type="dxa" w:w="2838"/>
             <w:tcBorders>
               <w:top w:val="single" w:color="D6DAD3" w:sz="4"/>
               <w:left w:val="single" w:color="D6DAD3" w:sz="4"/>
@@ -7485,7 +7167,7 @@
         </w:tc>
         <w:tc>
           <w:tcPr>
-            <w:tcW w:type="dxa" w:w="5400"/>
+            <w:tcW w:type="dxa" w:w="5900"/>
             <w:tcBorders>
               <w:top w:val="single" w:color="D6DAD3" w:sz="4"/>
               <w:left w:val="single" w:color="D6DAD3" w:sz="4"/>
@@ -7516,38 +7198,7 @@
         </w:tc>
         <w:tc>
           <w:tcPr>
-            <w:tcW w:type="dxa" w:w="1200"/>
-            <w:tcBorders>
-              <w:top w:val="single" w:color="D6DAD3" w:sz="4"/>
-              <w:left w:val="single" w:color="D6DAD3" w:sz="4"/>
-              <w:bottom w:val="single" w:color="D6DAD3" w:sz="4"/>
-              <w:right w:val="single" w:color="D6DAD3" w:sz="4"/>
-            </w:tcBorders>
-            <w:tcMar>
-              <w:top w:type="dxa" w:w="60"/>
-              <w:left w:type="dxa" w:w="100"/>
-              <w:bottom w:type="dxa" w:w="60"/>
-              <w:right w:type="dxa" w:w="100"/>
-            </w:tcMar>
-          </w:tcPr>
-          <w:p>
-            <w:pPr>
-              <w:spacing w:after="0" w:line="252"/>
-            </w:pPr>
-            <w:r>
-              <w:rPr>
-                <w:rFonts w:ascii="Calibri" w:cs="Calibri" w:eastAsia="Calibri" w:hAnsi="Calibri"/>
-                <w:color w:val="1B2430"/>
-                <w:sz w:val="22"/>
-                <w:szCs w:val="22"/>
-              </w:rPr>
-              <w:t xml:space="preserve">0.5</w:t>
-            </w:r>
-          </w:p>
-        </w:tc>
-        <w:tc>
-          <w:tcPr>
-            <w:tcW w:type="dxa" w:w="2138"/>
+            <w:tcW w:type="dxa" w:w="2838"/>
             <w:tcBorders>
               <w:top w:val="single" w:color="D6DAD3" w:sz="4"/>
               <w:left w:val="single" w:color="D6DAD3" w:sz="4"/>
@@ -7593,7 +7244,7 @@
           <w:sz w:val="26"/>
           <w:szCs w:val="26"/>
         </w:rPr>
-        <w:t xml:space="preserve">Epic 1 · Azure foundation (1 week)</w:t>
+        <w:t xml:space="preserve">Epic 1 · Azure foundation</w:t>
       </w:r>
     </w:p>
     <w:tbl>
@@ -7610,9 +7261,8 @@
       </w:tblPr>
       <w:tblGrid>
         <w:gridCol w:w="900"/>
-        <w:gridCol w:w="5400"/>
-        <w:gridCol w:w="1200"/>
-        <w:gridCol w:w="2138"/>
+        <w:gridCol w:w="5900"/>
+        <w:gridCol w:w="2838"/>
       </w:tblGrid>
       <w:tr>
         <w:trPr>
@@ -7654,7 +7304,7 @@
         </w:tc>
         <w:tc>
           <w:tcPr>
-            <w:tcW w:type="dxa" w:w="5400"/>
+            <w:tcW w:type="dxa" w:w="5900"/>
             <w:tcBorders>
               <w:top w:val="single" w:color="D6DAD3" w:sz="4"/>
               <w:left w:val="single" w:color="D6DAD3" w:sz="4"/>
@@ -7688,41 +7338,7 @@
         </w:tc>
         <w:tc>
           <w:tcPr>
-            <w:tcW w:type="dxa" w:w="1200"/>
-            <w:tcBorders>
-              <w:top w:val="single" w:color="D6DAD3" w:sz="4"/>
-              <w:left w:val="single" w:color="D6DAD3" w:sz="4"/>
-              <w:bottom w:val="single" w:color="D6DAD3" w:sz="4"/>
-              <w:right w:val="single" w:color="D6DAD3" w:sz="4"/>
-            </w:tcBorders>
-            <w:shd w:fill="ECEEE9" w:color="auto" w:val="clear"/>
-            <w:tcMar>
-              <w:top w:type="dxa" w:w="60"/>
-              <w:left w:type="dxa" w:w="100"/>
-              <w:bottom w:type="dxa" w:w="60"/>
-              <w:right w:type="dxa" w:w="100"/>
-            </w:tcMar>
-          </w:tcPr>
-          <w:p>
-            <w:pPr>
-              <w:spacing w:after="0" w:line="252"/>
-            </w:pPr>
-            <w:r>
-              <w:rPr>
-                <w:rFonts w:ascii="Calibri" w:cs="Calibri" w:eastAsia="Calibri" w:hAnsi="Calibri"/>
-                <w:b/>
-                <w:bCs/>
-                <w:color w:val="4A5563"/>
-                <w:sz w:val="19"/>
-                <w:szCs w:val="19"/>
-              </w:rPr>
-              <w:t xml:space="preserve">Days</w:t>
-            </w:r>
-          </w:p>
-        </w:tc>
-        <w:tc>
-          <w:tcPr>
-            <w:tcW w:type="dxa" w:w="2138"/>
+            <w:tcW w:type="dxa" w:w="2838"/>
             <w:tcBorders>
               <w:top w:val="single" w:color="D6DAD3" w:sz="4"/>
               <w:left w:val="single" w:color="D6DAD3" w:sz="4"/>
@@ -7792,7 +7408,7 @@
         </w:tc>
         <w:tc>
           <w:tcPr>
-            <w:tcW w:type="dxa" w:w="5400"/>
+            <w:tcW w:type="dxa" w:w="5900"/>
             <w:tcBorders>
               <w:top w:val="single" w:color="D6DAD3" w:sz="4"/>
               <w:left w:val="single" w:color="D6DAD3" w:sz="4"/>
@@ -7823,38 +7439,7 @@
         </w:tc>
         <w:tc>
           <w:tcPr>
-            <w:tcW w:type="dxa" w:w="1200"/>
-            <w:tcBorders>
-              <w:top w:val="single" w:color="D6DAD3" w:sz="4"/>
-              <w:left w:val="single" w:color="D6DAD3" w:sz="4"/>
-              <w:bottom w:val="single" w:color="D6DAD3" w:sz="4"/>
-              <w:right w:val="single" w:color="D6DAD3" w:sz="4"/>
-            </w:tcBorders>
-            <w:tcMar>
-              <w:top w:type="dxa" w:w="60"/>
-              <w:left w:type="dxa" w:w="100"/>
-              <w:bottom w:type="dxa" w:w="60"/>
-              <w:right w:type="dxa" w:w="100"/>
-            </w:tcMar>
-          </w:tcPr>
-          <w:p>
-            <w:pPr>
-              <w:spacing w:after="0" w:line="252"/>
-            </w:pPr>
-            <w:r>
-              <w:rPr>
-                <w:rFonts w:ascii="Calibri" w:cs="Calibri" w:eastAsia="Calibri" w:hAnsi="Calibri"/>
-                <w:color w:val="1B2430"/>
-                <w:sz w:val="22"/>
-                <w:szCs w:val="22"/>
-              </w:rPr>
-              <w:t xml:space="preserve">2</w:t>
-            </w:r>
-          </w:p>
-        </w:tc>
-        <w:tc>
-          <w:tcPr>
-            <w:tcW w:type="dxa" w:w="2138"/>
+            <w:tcW w:type="dxa" w:w="2838"/>
             <w:tcBorders>
               <w:top w:val="single" w:color="D6DAD3" w:sz="4"/>
               <w:left w:val="single" w:color="D6DAD3" w:sz="4"/>
@@ -7921,7 +7506,7 @@
         </w:tc>
         <w:tc>
           <w:tcPr>
-            <w:tcW w:type="dxa" w:w="5400"/>
+            <w:tcW w:type="dxa" w:w="5900"/>
             <w:tcBorders>
               <w:top w:val="single" w:color="D6DAD3" w:sz="4"/>
               <w:left w:val="single" w:color="D6DAD3" w:sz="4"/>
@@ -7952,38 +7537,7 @@
         </w:tc>
         <w:tc>
           <w:tcPr>
-            <w:tcW w:type="dxa" w:w="1200"/>
-            <w:tcBorders>
-              <w:top w:val="single" w:color="D6DAD3" w:sz="4"/>
-              <w:left w:val="single" w:color="D6DAD3" w:sz="4"/>
-              <w:bottom w:val="single" w:color="D6DAD3" w:sz="4"/>
-              <w:right w:val="single" w:color="D6DAD3" w:sz="4"/>
-            </w:tcBorders>
-            <w:tcMar>
-              <w:top w:type="dxa" w:w="60"/>
-              <w:left w:type="dxa" w:w="100"/>
-              <w:bottom w:type="dxa" w:w="60"/>
-              <w:right w:type="dxa" w:w="100"/>
-            </w:tcMar>
-          </w:tcPr>
-          <w:p>
-            <w:pPr>
-              <w:spacing w:after="0" w:line="252"/>
-            </w:pPr>
-            <w:r>
-              <w:rPr>
-                <w:rFonts w:ascii="Calibri" w:cs="Calibri" w:eastAsia="Calibri" w:hAnsi="Calibri"/>
-                <w:color w:val="1B2430"/>
-                <w:sz w:val="22"/>
-                <w:szCs w:val="22"/>
-              </w:rPr>
-              <w:t xml:space="preserve">1</w:t>
-            </w:r>
-          </w:p>
-        </w:tc>
-        <w:tc>
-          <w:tcPr>
-            <w:tcW w:type="dxa" w:w="2138"/>
+            <w:tcW w:type="dxa" w:w="2838"/>
             <w:tcBorders>
               <w:top w:val="single" w:color="D6DAD3" w:sz="4"/>
               <w:left w:val="single" w:color="D6DAD3" w:sz="4"/>
@@ -8050,7 +7604,7 @@
         </w:tc>
         <w:tc>
           <w:tcPr>
-            <w:tcW w:type="dxa" w:w="5400"/>
+            <w:tcW w:type="dxa" w:w="5900"/>
             <w:tcBorders>
               <w:top w:val="single" w:color="D6DAD3" w:sz="4"/>
               <w:left w:val="single" w:color="D6DAD3" w:sz="4"/>
@@ -8081,38 +7635,7 @@
         </w:tc>
         <w:tc>
           <w:tcPr>
-            <w:tcW w:type="dxa" w:w="1200"/>
-            <w:tcBorders>
-              <w:top w:val="single" w:color="D6DAD3" w:sz="4"/>
-              <w:left w:val="single" w:color="D6DAD3" w:sz="4"/>
-              <w:bottom w:val="single" w:color="D6DAD3" w:sz="4"/>
-              <w:right w:val="single" w:color="D6DAD3" w:sz="4"/>
-            </w:tcBorders>
-            <w:tcMar>
-              <w:top w:type="dxa" w:w="60"/>
-              <w:left w:type="dxa" w:w="100"/>
-              <w:bottom w:type="dxa" w:w="60"/>
-              <w:right w:type="dxa" w:w="100"/>
-            </w:tcMar>
-          </w:tcPr>
-          <w:p>
-            <w:pPr>
-              <w:spacing w:after="0" w:line="252"/>
-            </w:pPr>
-            <w:r>
-              <w:rPr>
-                <w:rFonts w:ascii="Calibri" w:cs="Calibri" w:eastAsia="Calibri" w:hAnsi="Calibri"/>
-                <w:color w:val="1B2430"/>
-                <w:sz w:val="22"/>
-                <w:szCs w:val="22"/>
-              </w:rPr>
-              <w:t xml:space="preserve">1</w:t>
-            </w:r>
-          </w:p>
-        </w:tc>
-        <w:tc>
-          <w:tcPr>
-            <w:tcW w:type="dxa" w:w="2138"/>
+            <w:tcW w:type="dxa" w:w="2838"/>
             <w:tcBorders>
               <w:top w:val="single" w:color="D6DAD3" w:sz="4"/>
               <w:left w:val="single" w:color="D6DAD3" w:sz="4"/>
@@ -8179,7 +7702,7 @@
         </w:tc>
         <w:tc>
           <w:tcPr>
-            <w:tcW w:type="dxa" w:w="5400"/>
+            <w:tcW w:type="dxa" w:w="5900"/>
             <w:tcBorders>
               <w:top w:val="single" w:color="D6DAD3" w:sz="4"/>
               <w:left w:val="single" w:color="D6DAD3" w:sz="4"/>
@@ -8210,38 +7733,7 @@
         </w:tc>
         <w:tc>
           <w:tcPr>
-            <w:tcW w:type="dxa" w:w="1200"/>
-            <w:tcBorders>
-              <w:top w:val="single" w:color="D6DAD3" w:sz="4"/>
-              <w:left w:val="single" w:color="D6DAD3" w:sz="4"/>
-              <w:bottom w:val="single" w:color="D6DAD3" w:sz="4"/>
-              <w:right w:val="single" w:color="D6DAD3" w:sz="4"/>
-            </w:tcBorders>
-            <w:tcMar>
-              <w:top w:type="dxa" w:w="60"/>
-              <w:left w:type="dxa" w:w="100"/>
-              <w:bottom w:type="dxa" w:w="60"/>
-              <w:right w:type="dxa" w:w="100"/>
-            </w:tcMar>
-          </w:tcPr>
-          <w:p>
-            <w:pPr>
-              <w:spacing w:after="0" w:line="252"/>
-            </w:pPr>
-            <w:r>
-              <w:rPr>
-                <w:rFonts w:ascii="Calibri" w:cs="Calibri" w:eastAsia="Calibri" w:hAnsi="Calibri"/>
-                <w:color w:val="1B2430"/>
-                <w:sz w:val="22"/>
-                <w:szCs w:val="22"/>
-              </w:rPr>
-              <w:t xml:space="preserve">1</w:t>
-            </w:r>
-          </w:p>
-        </w:tc>
-        <w:tc>
-          <w:tcPr>
-            <w:tcW w:type="dxa" w:w="2138"/>
+            <w:tcW w:type="dxa" w:w="2838"/>
             <w:tcBorders>
               <w:top w:val="single" w:color="D6DAD3" w:sz="4"/>
               <w:left w:val="single" w:color="D6DAD3" w:sz="4"/>
@@ -8308,7 +7800,7 @@
         </w:tc>
         <w:tc>
           <w:tcPr>
-            <w:tcW w:type="dxa" w:w="5400"/>
+            <w:tcW w:type="dxa" w:w="5900"/>
             <w:tcBorders>
               <w:top w:val="single" w:color="D6DAD3" w:sz="4"/>
               <w:left w:val="single" w:color="D6DAD3" w:sz="4"/>
@@ -8339,38 +7831,7 @@
         </w:tc>
         <w:tc>
           <w:tcPr>
-            <w:tcW w:type="dxa" w:w="1200"/>
-            <w:tcBorders>
-              <w:top w:val="single" w:color="D6DAD3" w:sz="4"/>
-              <w:left w:val="single" w:color="D6DAD3" w:sz="4"/>
-              <w:bottom w:val="single" w:color="D6DAD3" w:sz="4"/>
-              <w:right w:val="single" w:color="D6DAD3" w:sz="4"/>
-            </w:tcBorders>
-            <w:tcMar>
-              <w:top w:type="dxa" w:w="60"/>
-              <w:left w:type="dxa" w:w="100"/>
-              <w:bottom w:type="dxa" w:w="60"/>
-              <w:right w:type="dxa" w:w="100"/>
-            </w:tcMar>
-          </w:tcPr>
-          <w:p>
-            <w:pPr>
-              <w:spacing w:after="0" w:line="252"/>
-            </w:pPr>
-            <w:r>
-              <w:rPr>
-                <w:rFonts w:ascii="Calibri" w:cs="Calibri" w:eastAsia="Calibri" w:hAnsi="Calibri"/>
-                <w:color w:val="1B2430"/>
-                <w:sz w:val="22"/>
-                <w:szCs w:val="22"/>
-              </w:rPr>
-              <w:t xml:space="preserve">0.5</w:t>
-            </w:r>
-          </w:p>
-        </w:tc>
-        <w:tc>
-          <w:tcPr>
-            <w:tcW w:type="dxa" w:w="2138"/>
+            <w:tcW w:type="dxa" w:w="2838"/>
             <w:tcBorders>
               <w:top w:val="single" w:color="D6DAD3" w:sz="4"/>
               <w:left w:val="single" w:color="D6DAD3" w:sz="4"/>
@@ -8416,7 +7877,7 @@
           <w:sz w:val="26"/>
           <w:szCs w:val="26"/>
         </w:rPr>
-        <w:t xml:space="preserve">Epic 2 · Schema v1 (1.5 weeks)</w:t>
+        <w:t xml:space="preserve">Epic 2 · Schema v1</w:t>
       </w:r>
     </w:p>
     <w:tbl>
@@ -8433,9 +7894,8 @@
       </w:tblPr>
       <w:tblGrid>
         <w:gridCol w:w="900"/>
-        <w:gridCol w:w="5400"/>
-        <w:gridCol w:w="1200"/>
-        <w:gridCol w:w="2138"/>
+        <w:gridCol w:w="5900"/>
+        <w:gridCol w:w="2838"/>
       </w:tblGrid>
       <w:tr>
         <w:trPr>
@@ -8477,7 +7937,7 @@
         </w:tc>
         <w:tc>
           <w:tcPr>
-            <w:tcW w:type="dxa" w:w="5400"/>
+            <w:tcW w:type="dxa" w:w="5900"/>
             <w:tcBorders>
               <w:top w:val="single" w:color="D6DAD3" w:sz="4"/>
               <w:left w:val="single" w:color="D6DAD3" w:sz="4"/>
@@ -8511,41 +7971,7 @@
         </w:tc>
         <w:tc>
           <w:tcPr>
-            <w:tcW w:type="dxa" w:w="1200"/>
-            <w:tcBorders>
-              <w:top w:val="single" w:color="D6DAD3" w:sz="4"/>
-              <w:left w:val="single" w:color="D6DAD3" w:sz="4"/>
-              <w:bottom w:val="single" w:color="D6DAD3" w:sz="4"/>
-              <w:right w:val="single" w:color="D6DAD3" w:sz="4"/>
-            </w:tcBorders>
-            <w:shd w:fill="ECEEE9" w:color="auto" w:val="clear"/>
-            <w:tcMar>
-              <w:top w:type="dxa" w:w="60"/>
-              <w:left w:type="dxa" w:w="100"/>
-              <w:bottom w:type="dxa" w:w="60"/>
-              <w:right w:type="dxa" w:w="100"/>
-            </w:tcMar>
-          </w:tcPr>
-          <w:p>
-            <w:pPr>
-              <w:spacing w:after="0" w:line="252"/>
-            </w:pPr>
-            <w:r>
-              <w:rPr>
-                <w:rFonts w:ascii="Calibri" w:cs="Calibri" w:eastAsia="Calibri" w:hAnsi="Calibri"/>
-                <w:b/>
-                <w:bCs/>
-                <w:color w:val="4A5563"/>
-                <w:sz w:val="19"/>
-                <w:szCs w:val="19"/>
-              </w:rPr>
-              <w:t xml:space="preserve">Days</w:t>
-            </w:r>
-          </w:p>
-        </w:tc>
-        <w:tc>
-          <w:tcPr>
-            <w:tcW w:type="dxa" w:w="2138"/>
+            <w:tcW w:type="dxa" w:w="2838"/>
             <w:tcBorders>
               <w:top w:val="single" w:color="D6DAD3" w:sz="4"/>
               <w:left w:val="single" w:color="D6DAD3" w:sz="4"/>
@@ -8615,7 +8041,7 @@
         </w:tc>
         <w:tc>
           <w:tcPr>
-            <w:tcW w:type="dxa" w:w="5400"/>
+            <w:tcW w:type="dxa" w:w="5900"/>
             <w:tcBorders>
               <w:top w:val="single" w:color="D6DAD3" w:sz="4"/>
               <w:left w:val="single" w:color="D6DAD3" w:sz="4"/>
@@ -8646,38 +8072,7 @@
         </w:tc>
         <w:tc>
           <w:tcPr>
-            <w:tcW w:type="dxa" w:w="1200"/>
-            <w:tcBorders>
-              <w:top w:val="single" w:color="D6DAD3" w:sz="4"/>
-              <w:left w:val="single" w:color="D6DAD3" w:sz="4"/>
-              <w:bottom w:val="single" w:color="D6DAD3" w:sz="4"/>
-              <w:right w:val="single" w:color="D6DAD3" w:sz="4"/>
-            </w:tcBorders>
-            <w:tcMar>
-              <w:top w:type="dxa" w:w="60"/>
-              <w:left w:type="dxa" w:w="100"/>
-              <w:bottom w:type="dxa" w:w="60"/>
-              <w:right w:type="dxa" w:w="100"/>
-            </w:tcMar>
-          </w:tcPr>
-          <w:p>
-            <w:pPr>
-              <w:spacing w:after="0" w:line="252"/>
-            </w:pPr>
-            <w:r>
-              <w:rPr>
-                <w:rFonts w:ascii="Calibri" w:cs="Calibri" w:eastAsia="Calibri" w:hAnsi="Calibri"/>
-                <w:color w:val="1B2430"/>
-                <w:sz w:val="22"/>
-                <w:szCs w:val="22"/>
-              </w:rPr>
-              <w:t xml:space="preserve">1</w:t>
-            </w:r>
-          </w:p>
-        </w:tc>
-        <w:tc>
-          <w:tcPr>
-            <w:tcW w:type="dxa" w:w="2138"/>
+            <w:tcW w:type="dxa" w:w="2838"/>
             <w:tcBorders>
               <w:top w:val="single" w:color="D6DAD3" w:sz="4"/>
               <w:left w:val="single" w:color="D6DAD3" w:sz="4"/>
@@ -8744,7 +8139,7 @@
         </w:tc>
         <w:tc>
           <w:tcPr>
-            <w:tcW w:type="dxa" w:w="5400"/>
+            <w:tcW w:type="dxa" w:w="5900"/>
             <w:tcBorders>
               <w:top w:val="single" w:color="D6DAD3" w:sz="4"/>
               <w:left w:val="single" w:color="D6DAD3" w:sz="4"/>
@@ -8775,38 +8170,7 @@
         </w:tc>
         <w:tc>
           <w:tcPr>
-            <w:tcW w:type="dxa" w:w="1200"/>
-            <w:tcBorders>
-              <w:top w:val="single" w:color="D6DAD3" w:sz="4"/>
-              <w:left w:val="single" w:color="D6DAD3" w:sz="4"/>
-              <w:bottom w:val="single" w:color="D6DAD3" w:sz="4"/>
-              <w:right w:val="single" w:color="D6DAD3" w:sz="4"/>
-            </w:tcBorders>
-            <w:tcMar>
-              <w:top w:type="dxa" w:w="60"/>
-              <w:left w:type="dxa" w:w="100"/>
-              <w:bottom w:type="dxa" w:w="60"/>
-              <w:right w:type="dxa" w:w="100"/>
-            </w:tcMar>
-          </w:tcPr>
-          <w:p>
-            <w:pPr>
-              <w:spacing w:after="0" w:line="252"/>
-            </w:pPr>
-            <w:r>
-              <w:rPr>
-                <w:rFonts w:ascii="Calibri" w:cs="Calibri" w:eastAsia="Calibri" w:hAnsi="Calibri"/>
-                <w:color w:val="1B2430"/>
-                <w:sz w:val="22"/>
-                <w:szCs w:val="22"/>
-              </w:rPr>
-              <w:t xml:space="preserve">1</w:t>
-            </w:r>
-          </w:p>
-        </w:tc>
-        <w:tc>
-          <w:tcPr>
-            <w:tcW w:type="dxa" w:w="2138"/>
+            <w:tcW w:type="dxa" w:w="2838"/>
             <w:tcBorders>
               <w:top w:val="single" w:color="D6DAD3" w:sz="4"/>
               <w:left w:val="single" w:color="D6DAD3" w:sz="4"/>
@@ -8873,7 +8237,7 @@
         </w:tc>
         <w:tc>
           <w:tcPr>
-            <w:tcW w:type="dxa" w:w="5400"/>
+            <w:tcW w:type="dxa" w:w="5900"/>
             <w:tcBorders>
               <w:top w:val="single" w:color="D6DAD3" w:sz="4"/>
               <w:left w:val="single" w:color="D6DAD3" w:sz="4"/>
@@ -8904,38 +8268,7 @@
         </w:tc>
         <w:tc>
           <w:tcPr>
-            <w:tcW w:type="dxa" w:w="1200"/>
-            <w:tcBorders>
-              <w:top w:val="single" w:color="D6DAD3" w:sz="4"/>
-              <w:left w:val="single" w:color="D6DAD3" w:sz="4"/>
-              <w:bottom w:val="single" w:color="D6DAD3" w:sz="4"/>
-              <w:right w:val="single" w:color="D6DAD3" w:sz="4"/>
-            </w:tcBorders>
-            <w:tcMar>
-              <w:top w:type="dxa" w:w="60"/>
-              <w:left w:type="dxa" w:w="100"/>
-              <w:bottom w:type="dxa" w:w="60"/>
-              <w:right w:type="dxa" w:w="100"/>
-            </w:tcMar>
-          </w:tcPr>
-          <w:p>
-            <w:pPr>
-              <w:spacing w:after="0" w:line="252"/>
-            </w:pPr>
-            <w:r>
-              <w:rPr>
-                <w:rFonts w:ascii="Calibri" w:cs="Calibri" w:eastAsia="Calibri" w:hAnsi="Calibri"/>
-                <w:color w:val="1B2430"/>
-                <w:sz w:val="22"/>
-                <w:szCs w:val="22"/>
-              </w:rPr>
-              <w:t xml:space="preserve">1</w:t>
-            </w:r>
-          </w:p>
-        </w:tc>
-        <w:tc>
-          <w:tcPr>
-            <w:tcW w:type="dxa" w:w="2138"/>
+            <w:tcW w:type="dxa" w:w="2838"/>
             <w:tcBorders>
               <w:top w:val="single" w:color="D6DAD3" w:sz="4"/>
               <w:left w:val="single" w:color="D6DAD3" w:sz="4"/>
@@ -9002,7 +8335,7 @@
         </w:tc>
         <w:tc>
           <w:tcPr>
-            <w:tcW w:type="dxa" w:w="5400"/>
+            <w:tcW w:type="dxa" w:w="5900"/>
             <w:tcBorders>
               <w:top w:val="single" w:color="D6DAD3" w:sz="4"/>
               <w:left w:val="single" w:color="D6DAD3" w:sz="4"/>
@@ -9033,38 +8366,7 @@
         </w:tc>
         <w:tc>
           <w:tcPr>
-            <w:tcW w:type="dxa" w:w="1200"/>
-            <w:tcBorders>
-              <w:top w:val="single" w:color="D6DAD3" w:sz="4"/>
-              <w:left w:val="single" w:color="D6DAD3" w:sz="4"/>
-              <w:bottom w:val="single" w:color="D6DAD3" w:sz="4"/>
-              <w:right w:val="single" w:color="D6DAD3" w:sz="4"/>
-            </w:tcBorders>
-            <w:tcMar>
-              <w:top w:type="dxa" w:w="60"/>
-              <w:left w:type="dxa" w:w="100"/>
-              <w:bottom w:type="dxa" w:w="60"/>
-              <w:right w:type="dxa" w:w="100"/>
-            </w:tcMar>
-          </w:tcPr>
-          <w:p>
-            <w:pPr>
-              <w:spacing w:after="0" w:line="252"/>
-            </w:pPr>
-            <w:r>
-              <w:rPr>
-                <w:rFonts w:ascii="Calibri" w:cs="Calibri" w:eastAsia="Calibri" w:hAnsi="Calibri"/>
-                <w:color w:val="1B2430"/>
-                <w:sz w:val="22"/>
-                <w:szCs w:val="22"/>
-              </w:rPr>
-              <w:t xml:space="preserve">1</w:t>
-            </w:r>
-          </w:p>
-        </w:tc>
-        <w:tc>
-          <w:tcPr>
-            <w:tcW w:type="dxa" w:w="2138"/>
+            <w:tcW w:type="dxa" w:w="2838"/>
             <w:tcBorders>
               <w:top w:val="single" w:color="D6DAD3" w:sz="4"/>
               <w:left w:val="single" w:color="D6DAD3" w:sz="4"/>
@@ -9131,7 +8433,7 @@
         </w:tc>
         <w:tc>
           <w:tcPr>
-            <w:tcW w:type="dxa" w:w="5400"/>
+            <w:tcW w:type="dxa" w:w="5900"/>
             <w:tcBorders>
               <w:top w:val="single" w:color="D6DAD3" w:sz="4"/>
               <w:left w:val="single" w:color="D6DAD3" w:sz="4"/>
@@ -9162,38 +8464,7 @@
         </w:tc>
         <w:tc>
           <w:tcPr>
-            <w:tcW w:type="dxa" w:w="1200"/>
-            <w:tcBorders>
-              <w:top w:val="single" w:color="D6DAD3" w:sz="4"/>
-              <w:left w:val="single" w:color="D6DAD3" w:sz="4"/>
-              <w:bottom w:val="single" w:color="D6DAD3" w:sz="4"/>
-              <w:right w:val="single" w:color="D6DAD3" w:sz="4"/>
-            </w:tcBorders>
-            <w:tcMar>
-              <w:top w:type="dxa" w:w="60"/>
-              <w:left w:type="dxa" w:w="100"/>
-              <w:bottom w:type="dxa" w:w="60"/>
-              <w:right w:type="dxa" w:w="100"/>
-            </w:tcMar>
-          </w:tcPr>
-          <w:p>
-            <w:pPr>
-              <w:spacing w:after="0" w:line="252"/>
-            </w:pPr>
-            <w:r>
-              <w:rPr>
-                <w:rFonts w:ascii="Calibri" w:cs="Calibri" w:eastAsia="Calibri" w:hAnsi="Calibri"/>
-                <w:color w:val="1B2430"/>
-                <w:sz w:val="22"/>
-                <w:szCs w:val="22"/>
-              </w:rPr>
-              <w:t xml:space="preserve">1</w:t>
-            </w:r>
-          </w:p>
-        </w:tc>
-        <w:tc>
-          <w:tcPr>
-            <w:tcW w:type="dxa" w:w="2138"/>
+            <w:tcW w:type="dxa" w:w="2838"/>
             <w:tcBorders>
               <w:top w:val="single" w:color="D6DAD3" w:sz="4"/>
               <w:left w:val="single" w:color="D6DAD3" w:sz="4"/>
@@ -9260,7 +8531,7 @@
         </w:tc>
         <w:tc>
           <w:tcPr>
-            <w:tcW w:type="dxa" w:w="5400"/>
+            <w:tcW w:type="dxa" w:w="5900"/>
             <w:tcBorders>
               <w:top w:val="single" w:color="D6DAD3" w:sz="4"/>
               <w:left w:val="single" w:color="D6DAD3" w:sz="4"/>
@@ -9291,38 +8562,7 @@
         </w:tc>
         <w:tc>
           <w:tcPr>
-            <w:tcW w:type="dxa" w:w="1200"/>
-            <w:tcBorders>
-              <w:top w:val="single" w:color="D6DAD3" w:sz="4"/>
-              <w:left w:val="single" w:color="D6DAD3" w:sz="4"/>
-              <w:bottom w:val="single" w:color="D6DAD3" w:sz="4"/>
-              <w:right w:val="single" w:color="D6DAD3" w:sz="4"/>
-            </w:tcBorders>
-            <w:tcMar>
-              <w:top w:type="dxa" w:w="60"/>
-              <w:left w:type="dxa" w:w="100"/>
-              <w:bottom w:type="dxa" w:w="60"/>
-              <w:right w:type="dxa" w:w="100"/>
-            </w:tcMar>
-          </w:tcPr>
-          <w:p>
-            <w:pPr>
-              <w:spacing w:after="0" w:line="252"/>
-            </w:pPr>
-            <w:r>
-              <w:rPr>
-                <w:rFonts w:ascii="Calibri" w:cs="Calibri" w:eastAsia="Calibri" w:hAnsi="Calibri"/>
-                <w:color w:val="1B2430"/>
-                <w:sz w:val="22"/>
-                <w:szCs w:val="22"/>
-              </w:rPr>
-              <w:t xml:space="preserve">1</w:t>
-            </w:r>
-          </w:p>
-        </w:tc>
-        <w:tc>
-          <w:tcPr>
-            <w:tcW w:type="dxa" w:w="2138"/>
+            <w:tcW w:type="dxa" w:w="2838"/>
             <w:tcBorders>
               <w:top w:val="single" w:color="D6DAD3" w:sz="4"/>
               <w:left w:val="single" w:color="D6DAD3" w:sz="4"/>
@@ -9389,7 +8629,7 @@
         </w:tc>
         <w:tc>
           <w:tcPr>
-            <w:tcW w:type="dxa" w:w="5400"/>
+            <w:tcW w:type="dxa" w:w="5900"/>
             <w:tcBorders>
               <w:top w:val="single" w:color="D6DAD3" w:sz="4"/>
               <w:left w:val="single" w:color="D6DAD3" w:sz="4"/>
@@ -9420,38 +8660,7 @@
         </w:tc>
         <w:tc>
           <w:tcPr>
-            <w:tcW w:type="dxa" w:w="1200"/>
-            <w:tcBorders>
-              <w:top w:val="single" w:color="D6DAD3" w:sz="4"/>
-              <w:left w:val="single" w:color="D6DAD3" w:sz="4"/>
-              <w:bottom w:val="single" w:color="D6DAD3" w:sz="4"/>
-              <w:right w:val="single" w:color="D6DAD3" w:sz="4"/>
-            </w:tcBorders>
-            <w:tcMar>
-              <w:top w:type="dxa" w:w="60"/>
-              <w:left w:type="dxa" w:w="100"/>
-              <w:bottom w:type="dxa" w:w="60"/>
-              <w:right w:type="dxa" w:w="100"/>
-            </w:tcMar>
-          </w:tcPr>
-          <w:p>
-            <w:pPr>
-              <w:spacing w:after="0" w:line="252"/>
-            </w:pPr>
-            <w:r>
-              <w:rPr>
-                <w:rFonts w:ascii="Calibri" w:cs="Calibri" w:eastAsia="Calibri" w:hAnsi="Calibri"/>
-                <w:color w:val="1B2430"/>
-                <w:sz w:val="22"/>
-                <w:szCs w:val="22"/>
-              </w:rPr>
-              <w:t xml:space="preserve">1</w:t>
-            </w:r>
-          </w:p>
-        </w:tc>
-        <w:tc>
-          <w:tcPr>
-            <w:tcW w:type="dxa" w:w="2138"/>
+            <w:tcW w:type="dxa" w:w="2838"/>
             <w:tcBorders>
               <w:top w:val="single" w:color="D6DAD3" w:sz="4"/>
               <w:left w:val="single" w:color="D6DAD3" w:sz="4"/>
@@ -9518,7 +8727,7 @@
         </w:tc>
         <w:tc>
           <w:tcPr>
-            <w:tcW w:type="dxa" w:w="5400"/>
+            <w:tcW w:type="dxa" w:w="5900"/>
             <w:tcBorders>
               <w:top w:val="single" w:color="D6DAD3" w:sz="4"/>
               <w:left w:val="single" w:color="D6DAD3" w:sz="4"/>
@@ -9549,38 +8758,7 @@
         </w:tc>
         <w:tc>
           <w:tcPr>
-            <w:tcW w:type="dxa" w:w="1200"/>
-            <w:tcBorders>
-              <w:top w:val="single" w:color="D6DAD3" w:sz="4"/>
-              <w:left w:val="single" w:color="D6DAD3" w:sz="4"/>
-              <w:bottom w:val="single" w:color="D6DAD3" w:sz="4"/>
-              <w:right w:val="single" w:color="D6DAD3" w:sz="4"/>
-            </w:tcBorders>
-            <w:tcMar>
-              <w:top w:type="dxa" w:w="60"/>
-              <w:left w:type="dxa" w:w="100"/>
-              <w:bottom w:type="dxa" w:w="60"/>
-              <w:right w:type="dxa" w:w="100"/>
-            </w:tcMar>
-          </w:tcPr>
-          <w:p>
-            <w:pPr>
-              <w:spacing w:after="0" w:line="252"/>
-            </w:pPr>
-            <w:r>
-              <w:rPr>
-                <w:rFonts w:ascii="Calibri" w:cs="Calibri" w:eastAsia="Calibri" w:hAnsi="Calibri"/>
-                <w:color w:val="1B2430"/>
-                <w:sz w:val="22"/>
-                <w:szCs w:val="22"/>
-              </w:rPr>
-              <w:t xml:space="preserve">0.5</w:t>
-            </w:r>
-          </w:p>
-        </w:tc>
-        <w:tc>
-          <w:tcPr>
-            <w:tcW w:type="dxa" w:w="2138"/>
+            <w:tcW w:type="dxa" w:w="2838"/>
             <w:tcBorders>
               <w:top w:val="single" w:color="D6DAD3" w:sz="4"/>
               <w:left w:val="single" w:color="D6DAD3" w:sz="4"/>
@@ -9647,7 +8825,7 @@
         </w:tc>
         <w:tc>
           <w:tcPr>
-            <w:tcW w:type="dxa" w:w="5400"/>
+            <w:tcW w:type="dxa" w:w="5900"/>
             <w:tcBorders>
               <w:top w:val="single" w:color="D6DAD3" w:sz="4"/>
               <w:left w:val="single" w:color="D6DAD3" w:sz="4"/>
@@ -9678,38 +8856,7 @@
         </w:tc>
         <w:tc>
           <w:tcPr>
-            <w:tcW w:type="dxa" w:w="1200"/>
-            <w:tcBorders>
-              <w:top w:val="single" w:color="D6DAD3" w:sz="4"/>
-              <w:left w:val="single" w:color="D6DAD3" w:sz="4"/>
-              <w:bottom w:val="single" w:color="D6DAD3" w:sz="4"/>
-              <w:right w:val="single" w:color="D6DAD3" w:sz="4"/>
-            </w:tcBorders>
-            <w:tcMar>
-              <w:top w:type="dxa" w:w="60"/>
-              <w:left w:type="dxa" w:w="100"/>
-              <w:bottom w:type="dxa" w:w="60"/>
-              <w:right w:type="dxa" w:w="100"/>
-            </w:tcMar>
-          </w:tcPr>
-          <w:p>
-            <w:pPr>
-              <w:spacing w:after="0" w:line="252"/>
-            </w:pPr>
-            <w:r>
-              <w:rPr>
-                <w:rFonts w:ascii="Calibri" w:cs="Calibri" w:eastAsia="Calibri" w:hAnsi="Calibri"/>
-                <w:color w:val="1B2430"/>
-                <w:sz w:val="22"/>
-                <w:szCs w:val="22"/>
-              </w:rPr>
-              <w:t xml:space="preserve">0.5</w:t>
-            </w:r>
-          </w:p>
-        </w:tc>
-        <w:tc>
-          <w:tcPr>
-            <w:tcW w:type="dxa" w:w="2138"/>
+            <w:tcW w:type="dxa" w:w="2838"/>
             <w:tcBorders>
               <w:top w:val="single" w:color="D6DAD3" w:sz="4"/>
               <w:left w:val="single" w:color="D6DAD3" w:sz="4"/>
@@ -9776,7 +8923,7 @@
         </w:tc>
         <w:tc>
           <w:tcPr>
-            <w:tcW w:type="dxa" w:w="5400"/>
+            <w:tcW w:type="dxa" w:w="5900"/>
             <w:tcBorders>
               <w:top w:val="single" w:color="D6DAD3" w:sz="4"/>
               <w:left w:val="single" w:color="D6DAD3" w:sz="4"/>
@@ -9807,38 +8954,7 @@
         </w:tc>
         <w:tc>
           <w:tcPr>
-            <w:tcW w:type="dxa" w:w="1200"/>
-            <w:tcBorders>
-              <w:top w:val="single" w:color="D6DAD3" w:sz="4"/>
-              <w:left w:val="single" w:color="D6DAD3" w:sz="4"/>
-              <w:bottom w:val="single" w:color="D6DAD3" w:sz="4"/>
-              <w:right w:val="single" w:color="D6DAD3" w:sz="4"/>
-            </w:tcBorders>
-            <w:tcMar>
-              <w:top w:type="dxa" w:w="60"/>
-              <w:left w:type="dxa" w:w="100"/>
-              <w:bottom w:type="dxa" w:w="60"/>
-              <w:right w:type="dxa" w:w="100"/>
-            </w:tcMar>
-          </w:tcPr>
-          <w:p>
-            <w:pPr>
-              <w:spacing w:after="0" w:line="252"/>
-            </w:pPr>
-            <w:r>
-              <w:rPr>
-                <w:rFonts w:ascii="Calibri" w:cs="Calibri" w:eastAsia="Calibri" w:hAnsi="Calibri"/>
-                <w:color w:val="1B2430"/>
-                <w:sz w:val="22"/>
-                <w:szCs w:val="22"/>
-              </w:rPr>
-              <w:t xml:space="preserve">1</w:t>
-            </w:r>
-          </w:p>
-        </w:tc>
-        <w:tc>
-          <w:tcPr>
-            <w:tcW w:type="dxa" w:w="2138"/>
+            <w:tcW w:type="dxa" w:w="2838"/>
             <w:tcBorders>
               <w:top w:val="single" w:color="D6DAD3" w:sz="4"/>
               <w:left w:val="single" w:color="D6DAD3" w:sz="4"/>
@@ -9905,7 +9021,7 @@
         </w:tc>
         <w:tc>
           <w:tcPr>
-            <w:tcW w:type="dxa" w:w="5400"/>
+            <w:tcW w:type="dxa" w:w="5900"/>
             <w:tcBorders>
               <w:top w:val="single" w:color="D6DAD3" w:sz="4"/>
               <w:left w:val="single" w:color="D6DAD3" w:sz="4"/>
@@ -9936,38 +9052,7 @@
         </w:tc>
         <w:tc>
           <w:tcPr>
-            <w:tcW w:type="dxa" w:w="1200"/>
-            <w:tcBorders>
-              <w:top w:val="single" w:color="D6DAD3" w:sz="4"/>
-              <w:left w:val="single" w:color="D6DAD3" w:sz="4"/>
-              <w:bottom w:val="single" w:color="D6DAD3" w:sz="4"/>
-              <w:right w:val="single" w:color="D6DAD3" w:sz="4"/>
-            </w:tcBorders>
-            <w:tcMar>
-              <w:top w:type="dxa" w:w="60"/>
-              <w:left w:type="dxa" w:w="100"/>
-              <w:bottom w:type="dxa" w:w="60"/>
-              <w:right w:type="dxa" w:w="100"/>
-            </w:tcMar>
-          </w:tcPr>
-          <w:p>
-            <w:pPr>
-              <w:spacing w:after="0" w:line="252"/>
-            </w:pPr>
-            <w:r>
-              <w:rPr>
-                <w:rFonts w:ascii="Calibri" w:cs="Calibri" w:eastAsia="Calibri" w:hAnsi="Calibri"/>
-                <w:color w:val="1B2430"/>
-                <w:sz w:val="22"/>
-                <w:szCs w:val="22"/>
-              </w:rPr>
-              <w:t xml:space="preserve">1</w:t>
-            </w:r>
-          </w:p>
-        </w:tc>
-        <w:tc>
-          <w:tcPr>
-            <w:tcW w:type="dxa" w:w="2138"/>
+            <w:tcW w:type="dxa" w:w="2838"/>
             <w:tcBorders>
               <w:top w:val="single" w:color="D6DAD3" w:sz="4"/>
               <w:left w:val="single" w:color="D6DAD3" w:sz="4"/>
@@ -10013,7 +9098,7 @@
           <w:sz w:val="26"/>
           <w:szCs w:val="26"/>
         </w:rPr>
-        <w:t xml:space="preserve">Epic 3 · Data migration (1.5 weeks)</w:t>
+        <w:t xml:space="preserve">Epic 3 · Data migration</w:t>
       </w:r>
     </w:p>
     <w:tbl>
@@ -10030,9 +9115,8 @@
       </w:tblPr>
       <w:tblGrid>
         <w:gridCol w:w="900"/>
-        <w:gridCol w:w="5400"/>
-        <w:gridCol w:w="1200"/>
-        <w:gridCol w:w="2138"/>
+        <w:gridCol w:w="5900"/>
+        <w:gridCol w:w="2838"/>
       </w:tblGrid>
       <w:tr>
         <w:trPr>
@@ -10074,7 +9158,7 @@
         </w:tc>
         <w:tc>
           <w:tcPr>
-            <w:tcW w:type="dxa" w:w="5400"/>
+            <w:tcW w:type="dxa" w:w="5900"/>
             <w:tcBorders>
               <w:top w:val="single" w:color="D6DAD3" w:sz="4"/>
               <w:left w:val="single" w:color="D6DAD3" w:sz="4"/>
@@ -10108,41 +9192,7 @@
         </w:tc>
         <w:tc>
           <w:tcPr>
-            <w:tcW w:type="dxa" w:w="1200"/>
-            <w:tcBorders>
-              <w:top w:val="single" w:color="D6DAD3" w:sz="4"/>
-              <w:left w:val="single" w:color="D6DAD3" w:sz="4"/>
-              <w:bottom w:val="single" w:color="D6DAD3" w:sz="4"/>
-              <w:right w:val="single" w:color="D6DAD3" w:sz="4"/>
-            </w:tcBorders>
-            <w:shd w:fill="ECEEE9" w:color="auto" w:val="clear"/>
-            <w:tcMar>
-              <w:top w:type="dxa" w:w="60"/>
-              <w:left w:type="dxa" w:w="100"/>
-              <w:bottom w:type="dxa" w:w="60"/>
-              <w:right w:type="dxa" w:w="100"/>
-            </w:tcMar>
-          </w:tcPr>
-          <w:p>
-            <w:pPr>
-              <w:spacing w:after="0" w:line="252"/>
-            </w:pPr>
-            <w:r>
-              <w:rPr>
-                <w:rFonts w:ascii="Calibri" w:cs="Calibri" w:eastAsia="Calibri" w:hAnsi="Calibri"/>
-                <w:b/>
-                <w:bCs/>
-                <w:color w:val="4A5563"/>
-                <w:sz w:val="19"/>
-                <w:szCs w:val="19"/>
-              </w:rPr>
-              <w:t xml:space="preserve">Days</w:t>
-            </w:r>
-          </w:p>
-        </w:tc>
-        <w:tc>
-          <w:tcPr>
-            <w:tcW w:type="dxa" w:w="2138"/>
+            <w:tcW w:type="dxa" w:w="2838"/>
             <w:tcBorders>
               <w:top w:val="single" w:color="D6DAD3" w:sz="4"/>
               <w:left w:val="single" w:color="D6DAD3" w:sz="4"/>
@@ -10212,7 +9262,7 @@
         </w:tc>
         <w:tc>
           <w:tcPr>
-            <w:tcW w:type="dxa" w:w="5400"/>
+            <w:tcW w:type="dxa" w:w="5900"/>
             <w:tcBorders>
               <w:top w:val="single" w:color="D6DAD3" w:sz="4"/>
               <w:left w:val="single" w:color="D6DAD3" w:sz="4"/>
@@ -10243,38 +9293,7 @@
         </w:tc>
         <w:tc>
           <w:tcPr>
-            <w:tcW w:type="dxa" w:w="1200"/>
-            <w:tcBorders>
-              <w:top w:val="single" w:color="D6DAD3" w:sz="4"/>
-              <w:left w:val="single" w:color="D6DAD3" w:sz="4"/>
-              <w:bottom w:val="single" w:color="D6DAD3" w:sz="4"/>
-              <w:right w:val="single" w:color="D6DAD3" w:sz="4"/>
-            </w:tcBorders>
-            <w:tcMar>
-              <w:top w:type="dxa" w:w="60"/>
-              <w:left w:type="dxa" w:w="100"/>
-              <w:bottom w:type="dxa" w:w="60"/>
-              <w:right w:type="dxa" w:w="100"/>
-            </w:tcMar>
-          </w:tcPr>
-          <w:p>
-            <w:pPr>
-              <w:spacing w:after="0" w:line="252"/>
-            </w:pPr>
-            <w:r>
-              <w:rPr>
-                <w:rFonts w:ascii="Calibri" w:cs="Calibri" w:eastAsia="Calibri" w:hAnsi="Calibri"/>
-                <w:color w:val="1B2430"/>
-                <w:sz w:val="22"/>
-                <w:szCs w:val="22"/>
-              </w:rPr>
-              <w:t xml:space="preserve">2</w:t>
-            </w:r>
-          </w:p>
-        </w:tc>
-        <w:tc>
-          <w:tcPr>
-            <w:tcW w:type="dxa" w:w="2138"/>
+            <w:tcW w:type="dxa" w:w="2838"/>
             <w:tcBorders>
               <w:top w:val="single" w:color="D6DAD3" w:sz="4"/>
               <w:left w:val="single" w:color="D6DAD3" w:sz="4"/>
@@ -10341,7 +9360,7 @@
         </w:tc>
         <w:tc>
           <w:tcPr>
-            <w:tcW w:type="dxa" w:w="5400"/>
+            <w:tcW w:type="dxa" w:w="5900"/>
             <w:tcBorders>
               <w:top w:val="single" w:color="D6DAD3" w:sz="4"/>
               <w:left w:val="single" w:color="D6DAD3" w:sz="4"/>
@@ -10372,38 +9391,7 @@
         </w:tc>
         <w:tc>
           <w:tcPr>
-            <w:tcW w:type="dxa" w:w="1200"/>
-            <w:tcBorders>
-              <w:top w:val="single" w:color="D6DAD3" w:sz="4"/>
-              <w:left w:val="single" w:color="D6DAD3" w:sz="4"/>
-              <w:bottom w:val="single" w:color="D6DAD3" w:sz="4"/>
-              <w:right w:val="single" w:color="D6DAD3" w:sz="4"/>
-            </w:tcBorders>
-            <w:tcMar>
-              <w:top w:type="dxa" w:w="60"/>
-              <w:left w:type="dxa" w:w="100"/>
-              <w:bottom w:type="dxa" w:w="60"/>
-              <w:right w:type="dxa" w:w="100"/>
-            </w:tcMar>
-          </w:tcPr>
-          <w:p>
-            <w:pPr>
-              <w:spacing w:after="0" w:line="252"/>
-            </w:pPr>
-            <w:r>
-              <w:rPr>
-                <w:rFonts w:ascii="Calibri" w:cs="Calibri" w:eastAsia="Calibri" w:hAnsi="Calibri"/>
-                <w:color w:val="1B2430"/>
-                <w:sz w:val="22"/>
-                <w:szCs w:val="22"/>
-              </w:rPr>
-              <w:t xml:space="preserve">3</w:t>
-            </w:r>
-          </w:p>
-        </w:tc>
-        <w:tc>
-          <w:tcPr>
-            <w:tcW w:type="dxa" w:w="2138"/>
+            <w:tcW w:type="dxa" w:w="2838"/>
             <w:tcBorders>
               <w:top w:val="single" w:color="D6DAD3" w:sz="4"/>
               <w:left w:val="single" w:color="D6DAD3" w:sz="4"/>
@@ -10470,7 +9458,7 @@
         </w:tc>
         <w:tc>
           <w:tcPr>
-            <w:tcW w:type="dxa" w:w="5400"/>
+            <w:tcW w:type="dxa" w:w="5900"/>
             <w:tcBorders>
               <w:top w:val="single" w:color="D6DAD3" w:sz="4"/>
               <w:left w:val="single" w:color="D6DAD3" w:sz="4"/>
@@ -10501,38 +9489,7 @@
         </w:tc>
         <w:tc>
           <w:tcPr>
-            <w:tcW w:type="dxa" w:w="1200"/>
-            <w:tcBorders>
-              <w:top w:val="single" w:color="D6DAD3" w:sz="4"/>
-              <w:left w:val="single" w:color="D6DAD3" w:sz="4"/>
-              <w:bottom w:val="single" w:color="D6DAD3" w:sz="4"/>
-              <w:right w:val="single" w:color="D6DAD3" w:sz="4"/>
-            </w:tcBorders>
-            <w:tcMar>
-              <w:top w:type="dxa" w:w="60"/>
-              <w:left w:type="dxa" w:w="100"/>
-              <w:bottom w:type="dxa" w:w="60"/>
-              <w:right w:type="dxa" w:w="100"/>
-            </w:tcMar>
-          </w:tcPr>
-          <w:p>
-            <w:pPr>
-              <w:spacing w:after="0" w:line="252"/>
-            </w:pPr>
-            <w:r>
-              <w:rPr>
-                <w:rFonts w:ascii="Calibri" w:cs="Calibri" w:eastAsia="Calibri" w:hAnsi="Calibri"/>
-                <w:color w:val="1B2430"/>
-                <w:sz w:val="22"/>
-                <w:szCs w:val="22"/>
-              </w:rPr>
-              <w:t xml:space="preserve">1</w:t>
-            </w:r>
-          </w:p>
-        </w:tc>
-        <w:tc>
-          <w:tcPr>
-            <w:tcW w:type="dxa" w:w="2138"/>
+            <w:tcW w:type="dxa" w:w="2838"/>
             <w:tcBorders>
               <w:top w:val="single" w:color="D6DAD3" w:sz="4"/>
               <w:left w:val="single" w:color="D6DAD3" w:sz="4"/>
@@ -10599,7 +9556,7 @@
         </w:tc>
         <w:tc>
           <w:tcPr>
-            <w:tcW w:type="dxa" w:w="5400"/>
+            <w:tcW w:type="dxa" w:w="5900"/>
             <w:tcBorders>
               <w:top w:val="single" w:color="D6DAD3" w:sz="4"/>
               <w:left w:val="single" w:color="D6DAD3" w:sz="4"/>
@@ -10630,38 +9587,7 @@
         </w:tc>
         <w:tc>
           <w:tcPr>
-            <w:tcW w:type="dxa" w:w="1200"/>
-            <w:tcBorders>
-              <w:top w:val="single" w:color="D6DAD3" w:sz="4"/>
-              <w:left w:val="single" w:color="D6DAD3" w:sz="4"/>
-              <w:bottom w:val="single" w:color="D6DAD3" w:sz="4"/>
-              <w:right w:val="single" w:color="D6DAD3" w:sz="4"/>
-            </w:tcBorders>
-            <w:tcMar>
-              <w:top w:type="dxa" w:w="60"/>
-              <w:left w:type="dxa" w:w="100"/>
-              <w:bottom w:type="dxa" w:w="60"/>
-              <w:right w:type="dxa" w:w="100"/>
-            </w:tcMar>
-          </w:tcPr>
-          <w:p>
-            <w:pPr>
-              <w:spacing w:after="0" w:line="252"/>
-            </w:pPr>
-            <w:r>
-              <w:rPr>
-                <w:rFonts w:ascii="Calibri" w:cs="Calibri" w:eastAsia="Calibri" w:hAnsi="Calibri"/>
-                <w:color w:val="1B2430"/>
-                <w:sz w:val="22"/>
-                <w:szCs w:val="22"/>
-              </w:rPr>
-              <w:t xml:space="preserve">2</w:t>
-            </w:r>
-          </w:p>
-        </w:tc>
-        <w:tc>
-          <w:tcPr>
-            <w:tcW w:type="dxa" w:w="2138"/>
+            <w:tcW w:type="dxa" w:w="2838"/>
             <w:tcBorders>
               <w:top w:val="single" w:color="D6DAD3" w:sz="4"/>
               <w:left w:val="single" w:color="D6DAD3" w:sz="4"/>
@@ -10707,7 +9633,7 @@
           <w:sz w:val="26"/>
           <w:szCs w:val="26"/>
         </w:rPr>
-        <w:t xml:space="preserve">Epic 4 · Entry app (2.5 weeks)</w:t>
+        <w:t xml:space="preserve">Epic 4 · Entry app</w:t>
       </w:r>
     </w:p>
     <w:tbl>
@@ -10724,9 +9650,8 @@
       </w:tblPr>
       <w:tblGrid>
         <w:gridCol w:w="900"/>
-        <w:gridCol w:w="5400"/>
-        <w:gridCol w:w="1200"/>
-        <w:gridCol w:w="2138"/>
+        <w:gridCol w:w="5900"/>
+        <w:gridCol w:w="2838"/>
       </w:tblGrid>
       <w:tr>
         <w:trPr>
@@ -10768,7 +9693,7 @@
         </w:tc>
         <w:tc>
           <w:tcPr>
-            <w:tcW w:type="dxa" w:w="5400"/>
+            <w:tcW w:type="dxa" w:w="5900"/>
             <w:tcBorders>
               <w:top w:val="single" w:color="D6DAD3" w:sz="4"/>
               <w:left w:val="single" w:color="D6DAD3" w:sz="4"/>
@@ -10802,41 +9727,7 @@
         </w:tc>
         <w:tc>
           <w:tcPr>
-            <w:tcW w:type="dxa" w:w="1200"/>
-            <w:tcBorders>
-              <w:top w:val="single" w:color="D6DAD3" w:sz="4"/>
-              <w:left w:val="single" w:color="D6DAD3" w:sz="4"/>
-              <w:bottom w:val="single" w:color="D6DAD3" w:sz="4"/>
-              <w:right w:val="single" w:color="D6DAD3" w:sz="4"/>
-            </w:tcBorders>
-            <w:shd w:fill="ECEEE9" w:color="auto" w:val="clear"/>
-            <w:tcMar>
-              <w:top w:type="dxa" w:w="60"/>
-              <w:left w:type="dxa" w:w="100"/>
-              <w:bottom w:type="dxa" w:w="60"/>
-              <w:right w:type="dxa" w:w="100"/>
-            </w:tcMar>
-          </w:tcPr>
-          <w:p>
-            <w:pPr>
-              <w:spacing w:after="0" w:line="252"/>
-            </w:pPr>
-            <w:r>
-              <w:rPr>
-                <w:rFonts w:ascii="Calibri" w:cs="Calibri" w:eastAsia="Calibri" w:hAnsi="Calibri"/>
-                <w:b/>
-                <w:bCs/>
-                <w:color w:val="4A5563"/>
-                <w:sz w:val="19"/>
-                <w:szCs w:val="19"/>
-              </w:rPr>
-              <w:t xml:space="preserve">Days</w:t>
-            </w:r>
-          </w:p>
-        </w:tc>
-        <w:tc>
-          <w:tcPr>
-            <w:tcW w:type="dxa" w:w="2138"/>
+            <w:tcW w:type="dxa" w:w="2838"/>
             <w:tcBorders>
               <w:top w:val="single" w:color="D6DAD3" w:sz="4"/>
               <w:left w:val="single" w:color="D6DAD3" w:sz="4"/>
@@ -10906,7 +9797,7 @@
         </w:tc>
         <w:tc>
           <w:tcPr>
-            <w:tcW w:type="dxa" w:w="5400"/>
+            <w:tcW w:type="dxa" w:w="5900"/>
             <w:tcBorders>
               <w:top w:val="single" w:color="D6DAD3" w:sz="4"/>
               <w:left w:val="single" w:color="D6DAD3" w:sz="4"/>
@@ -10937,38 +9828,7 @@
         </w:tc>
         <w:tc>
           <w:tcPr>
-            <w:tcW w:type="dxa" w:w="1200"/>
-            <w:tcBorders>
-              <w:top w:val="single" w:color="D6DAD3" w:sz="4"/>
-              <w:left w:val="single" w:color="D6DAD3" w:sz="4"/>
-              <w:bottom w:val="single" w:color="D6DAD3" w:sz="4"/>
-              <w:right w:val="single" w:color="D6DAD3" w:sz="4"/>
-            </w:tcBorders>
-            <w:tcMar>
-              <w:top w:type="dxa" w:w="60"/>
-              <w:left w:type="dxa" w:w="100"/>
-              <w:bottom w:type="dxa" w:w="60"/>
-              <w:right w:type="dxa" w:w="100"/>
-            </w:tcMar>
-          </w:tcPr>
-          <w:p>
-            <w:pPr>
-              <w:spacing w:after="0" w:line="252"/>
-            </w:pPr>
-            <w:r>
-              <w:rPr>
-                <w:rFonts w:ascii="Calibri" w:cs="Calibri" w:eastAsia="Calibri" w:hAnsi="Calibri"/>
-                <w:color w:val="1B2430"/>
-                <w:sz w:val="22"/>
-                <w:szCs w:val="22"/>
-              </w:rPr>
-              <w:t xml:space="preserve">2</w:t>
-            </w:r>
-          </w:p>
-        </w:tc>
-        <w:tc>
-          <w:tcPr>
-            <w:tcW w:type="dxa" w:w="2138"/>
+            <w:tcW w:type="dxa" w:w="2838"/>
             <w:tcBorders>
               <w:top w:val="single" w:color="D6DAD3" w:sz="4"/>
               <w:left w:val="single" w:color="D6DAD3" w:sz="4"/>
@@ -11035,7 +9895,7 @@
         </w:tc>
         <w:tc>
           <w:tcPr>
-            <w:tcW w:type="dxa" w:w="5400"/>
+            <w:tcW w:type="dxa" w:w="5900"/>
             <w:tcBorders>
               <w:top w:val="single" w:color="D6DAD3" w:sz="4"/>
               <w:left w:val="single" w:color="D6DAD3" w:sz="4"/>
@@ -11066,38 +9926,7 @@
         </w:tc>
         <w:tc>
           <w:tcPr>
-            <w:tcW w:type="dxa" w:w="1200"/>
-            <w:tcBorders>
-              <w:top w:val="single" w:color="D6DAD3" w:sz="4"/>
-              <w:left w:val="single" w:color="D6DAD3" w:sz="4"/>
-              <w:bottom w:val="single" w:color="D6DAD3" w:sz="4"/>
-              <w:right w:val="single" w:color="D6DAD3" w:sz="4"/>
-            </w:tcBorders>
-            <w:tcMar>
-              <w:top w:type="dxa" w:w="60"/>
-              <w:left w:type="dxa" w:w="100"/>
-              <w:bottom w:type="dxa" w:w="60"/>
-              <w:right w:type="dxa" w:w="100"/>
-            </w:tcMar>
-          </w:tcPr>
-          <w:p>
-            <w:pPr>
-              <w:spacing w:after="0" w:line="252"/>
-            </w:pPr>
-            <w:r>
-              <w:rPr>
-                <w:rFonts w:ascii="Calibri" w:cs="Calibri" w:eastAsia="Calibri" w:hAnsi="Calibri"/>
-                <w:color w:val="1B2430"/>
-                <w:sz w:val="22"/>
-                <w:szCs w:val="22"/>
-              </w:rPr>
-              <w:t xml:space="preserve">2</w:t>
-            </w:r>
-          </w:p>
-        </w:tc>
-        <w:tc>
-          <w:tcPr>
-            <w:tcW w:type="dxa" w:w="2138"/>
+            <w:tcW w:type="dxa" w:w="2838"/>
             <w:tcBorders>
               <w:top w:val="single" w:color="D6DAD3" w:sz="4"/>
               <w:left w:val="single" w:color="D6DAD3" w:sz="4"/>
@@ -11164,7 +9993,7 @@
         </w:tc>
         <w:tc>
           <w:tcPr>
-            <w:tcW w:type="dxa" w:w="5400"/>
+            <w:tcW w:type="dxa" w:w="5900"/>
             <w:tcBorders>
               <w:top w:val="single" w:color="D6DAD3" w:sz="4"/>
               <w:left w:val="single" w:color="D6DAD3" w:sz="4"/>
@@ -11195,38 +10024,7 @@
         </w:tc>
         <w:tc>
           <w:tcPr>
-            <w:tcW w:type="dxa" w:w="1200"/>
-            <w:tcBorders>
-              <w:top w:val="single" w:color="D6DAD3" w:sz="4"/>
-              <w:left w:val="single" w:color="D6DAD3" w:sz="4"/>
-              <w:bottom w:val="single" w:color="D6DAD3" w:sz="4"/>
-              <w:right w:val="single" w:color="D6DAD3" w:sz="4"/>
-            </w:tcBorders>
-            <w:tcMar>
-              <w:top w:type="dxa" w:w="60"/>
-              <w:left w:type="dxa" w:w="100"/>
-              <w:bottom w:type="dxa" w:w="60"/>
-              <w:right w:type="dxa" w:w="100"/>
-            </w:tcMar>
-          </w:tcPr>
-          <w:p>
-            <w:pPr>
-              <w:spacing w:after="0" w:line="252"/>
-            </w:pPr>
-            <w:r>
-              <w:rPr>
-                <w:rFonts w:ascii="Calibri" w:cs="Calibri" w:eastAsia="Calibri" w:hAnsi="Calibri"/>
-                <w:color w:val="1B2430"/>
-                <w:sz w:val="22"/>
-                <w:szCs w:val="22"/>
-              </w:rPr>
-              <w:t xml:space="preserve">1</w:t>
-            </w:r>
-          </w:p>
-        </w:tc>
-        <w:tc>
-          <w:tcPr>
-            <w:tcW w:type="dxa" w:w="2138"/>
+            <w:tcW w:type="dxa" w:w="2838"/>
             <w:tcBorders>
               <w:top w:val="single" w:color="D6DAD3" w:sz="4"/>
               <w:left w:val="single" w:color="D6DAD3" w:sz="4"/>
@@ -11293,7 +10091,7 @@
         </w:tc>
         <w:tc>
           <w:tcPr>
-            <w:tcW w:type="dxa" w:w="5400"/>
+            <w:tcW w:type="dxa" w:w="5900"/>
             <w:tcBorders>
               <w:top w:val="single" w:color="D6DAD3" w:sz="4"/>
               <w:left w:val="single" w:color="D6DAD3" w:sz="4"/>
@@ -11324,38 +10122,7 @@
         </w:tc>
         <w:tc>
           <w:tcPr>
-            <w:tcW w:type="dxa" w:w="1200"/>
-            <w:tcBorders>
-              <w:top w:val="single" w:color="D6DAD3" w:sz="4"/>
-              <w:left w:val="single" w:color="D6DAD3" w:sz="4"/>
-              <w:bottom w:val="single" w:color="D6DAD3" w:sz="4"/>
-              <w:right w:val="single" w:color="D6DAD3" w:sz="4"/>
-            </w:tcBorders>
-            <w:tcMar>
-              <w:top w:type="dxa" w:w="60"/>
-              <w:left w:type="dxa" w:w="100"/>
-              <w:bottom w:type="dxa" w:w="60"/>
-              <w:right w:type="dxa" w:w="100"/>
-            </w:tcMar>
-          </w:tcPr>
-          <w:p>
-            <w:pPr>
-              <w:spacing w:after="0" w:line="252"/>
-            </w:pPr>
-            <w:r>
-              <w:rPr>
-                <w:rFonts w:ascii="Calibri" w:cs="Calibri" w:eastAsia="Calibri" w:hAnsi="Calibri"/>
-                <w:color w:val="1B2430"/>
-                <w:sz w:val="22"/>
-                <w:szCs w:val="22"/>
-              </w:rPr>
-              <w:t xml:space="preserve">2</w:t>
-            </w:r>
-          </w:p>
-        </w:tc>
-        <w:tc>
-          <w:tcPr>
-            <w:tcW w:type="dxa" w:w="2138"/>
+            <w:tcW w:type="dxa" w:w="2838"/>
             <w:tcBorders>
               <w:top w:val="single" w:color="D6DAD3" w:sz="4"/>
               <w:left w:val="single" w:color="D6DAD3" w:sz="4"/>
@@ -11422,7 +10189,7 @@
         </w:tc>
         <w:tc>
           <w:tcPr>
-            <w:tcW w:type="dxa" w:w="5400"/>
+            <w:tcW w:type="dxa" w:w="5900"/>
             <w:tcBorders>
               <w:top w:val="single" w:color="D6DAD3" w:sz="4"/>
               <w:left w:val="single" w:color="D6DAD3" w:sz="4"/>
@@ -11453,38 +10220,7 @@
         </w:tc>
         <w:tc>
           <w:tcPr>
-            <w:tcW w:type="dxa" w:w="1200"/>
-            <w:tcBorders>
-              <w:top w:val="single" w:color="D6DAD3" w:sz="4"/>
-              <w:left w:val="single" w:color="D6DAD3" w:sz="4"/>
-              <w:bottom w:val="single" w:color="D6DAD3" w:sz="4"/>
-              <w:right w:val="single" w:color="D6DAD3" w:sz="4"/>
-            </w:tcBorders>
-            <w:tcMar>
-              <w:top w:type="dxa" w:w="60"/>
-              <w:left w:type="dxa" w:w="100"/>
-              <w:bottom w:type="dxa" w:w="60"/>
-              <w:right w:type="dxa" w:w="100"/>
-            </w:tcMar>
-          </w:tcPr>
-          <w:p>
-            <w:pPr>
-              <w:spacing w:after="0" w:line="252"/>
-            </w:pPr>
-            <w:r>
-              <w:rPr>
-                <w:rFonts w:ascii="Calibri" w:cs="Calibri" w:eastAsia="Calibri" w:hAnsi="Calibri"/>
-                <w:color w:val="1B2430"/>
-                <w:sz w:val="22"/>
-                <w:szCs w:val="22"/>
-              </w:rPr>
-              <w:t xml:space="preserve">2</w:t>
-            </w:r>
-          </w:p>
-        </w:tc>
-        <w:tc>
-          <w:tcPr>
-            <w:tcW w:type="dxa" w:w="2138"/>
+            <w:tcW w:type="dxa" w:w="2838"/>
             <w:tcBorders>
               <w:top w:val="single" w:color="D6DAD3" w:sz="4"/>
               <w:left w:val="single" w:color="D6DAD3" w:sz="4"/>
@@ -11551,7 +10287,7 @@
         </w:tc>
         <w:tc>
           <w:tcPr>
-            <w:tcW w:type="dxa" w:w="5400"/>
+            <w:tcW w:type="dxa" w:w="5900"/>
             <w:tcBorders>
               <w:top w:val="single" w:color="D6DAD3" w:sz="4"/>
               <w:left w:val="single" w:color="D6DAD3" w:sz="4"/>
@@ -11582,38 +10318,7 @@
         </w:tc>
         <w:tc>
           <w:tcPr>
-            <w:tcW w:type="dxa" w:w="1200"/>
-            <w:tcBorders>
-              <w:top w:val="single" w:color="D6DAD3" w:sz="4"/>
-              <w:left w:val="single" w:color="D6DAD3" w:sz="4"/>
-              <w:bottom w:val="single" w:color="D6DAD3" w:sz="4"/>
-              <w:right w:val="single" w:color="D6DAD3" w:sz="4"/>
-            </w:tcBorders>
-            <w:tcMar>
-              <w:top w:type="dxa" w:w="60"/>
-              <w:left w:type="dxa" w:w="100"/>
-              <w:bottom w:type="dxa" w:w="60"/>
-              <w:right w:type="dxa" w:w="100"/>
-            </w:tcMar>
-          </w:tcPr>
-          <w:p>
-            <w:pPr>
-              <w:spacing w:after="0" w:line="252"/>
-            </w:pPr>
-            <w:r>
-              <w:rPr>
-                <w:rFonts w:ascii="Calibri" w:cs="Calibri" w:eastAsia="Calibri" w:hAnsi="Calibri"/>
-                <w:color w:val="1B2430"/>
-                <w:sz w:val="22"/>
-                <w:szCs w:val="22"/>
-              </w:rPr>
-              <w:t xml:space="preserve">1</w:t>
-            </w:r>
-          </w:p>
-        </w:tc>
-        <w:tc>
-          <w:tcPr>
-            <w:tcW w:type="dxa" w:w="2138"/>
+            <w:tcW w:type="dxa" w:w="2838"/>
             <w:tcBorders>
               <w:top w:val="single" w:color="D6DAD3" w:sz="4"/>
               <w:left w:val="single" w:color="D6DAD3" w:sz="4"/>
@@ -11680,7 +10385,7 @@
         </w:tc>
         <w:tc>
           <w:tcPr>
-            <w:tcW w:type="dxa" w:w="5400"/>
+            <w:tcW w:type="dxa" w:w="5900"/>
             <w:tcBorders>
               <w:top w:val="single" w:color="D6DAD3" w:sz="4"/>
               <w:left w:val="single" w:color="D6DAD3" w:sz="4"/>
@@ -11711,38 +10416,7 @@
         </w:tc>
         <w:tc>
           <w:tcPr>
-            <w:tcW w:type="dxa" w:w="1200"/>
-            <w:tcBorders>
-              <w:top w:val="single" w:color="D6DAD3" w:sz="4"/>
-              <w:left w:val="single" w:color="D6DAD3" w:sz="4"/>
-              <w:bottom w:val="single" w:color="D6DAD3" w:sz="4"/>
-              <w:right w:val="single" w:color="D6DAD3" w:sz="4"/>
-            </w:tcBorders>
-            <w:tcMar>
-              <w:top w:type="dxa" w:w="60"/>
-              <w:left w:type="dxa" w:w="100"/>
-              <w:bottom w:type="dxa" w:w="60"/>
-              <w:right w:type="dxa" w:w="100"/>
-            </w:tcMar>
-          </w:tcPr>
-          <w:p>
-            <w:pPr>
-              <w:spacing w:after="0" w:line="252"/>
-            </w:pPr>
-            <w:r>
-              <w:rPr>
-                <w:rFonts w:ascii="Calibri" w:cs="Calibri" w:eastAsia="Calibri" w:hAnsi="Calibri"/>
-                <w:color w:val="1B2430"/>
-                <w:sz w:val="22"/>
-                <w:szCs w:val="22"/>
-              </w:rPr>
-              <w:t xml:space="preserve">1</w:t>
-            </w:r>
-          </w:p>
-        </w:tc>
-        <w:tc>
-          <w:tcPr>
-            <w:tcW w:type="dxa" w:w="2138"/>
+            <w:tcW w:type="dxa" w:w="2838"/>
             <w:tcBorders>
               <w:top w:val="single" w:color="D6DAD3" w:sz="4"/>
               <w:left w:val="single" w:color="D6DAD3" w:sz="4"/>
@@ -11788,7 +10462,7 @@
           <w:sz w:val="26"/>
           <w:szCs w:val="26"/>
         </w:rPr>
-        <w:t xml:space="preserve">Epic 5 · Excel and Power BI (0.5 week)</w:t>
+        <w:t xml:space="preserve">Epic 5 · Excel and Power BI</w:t>
       </w:r>
     </w:p>
     <w:tbl>
@@ -11805,9 +10479,8 @@
       </w:tblPr>
       <w:tblGrid>
         <w:gridCol w:w="900"/>
-        <w:gridCol w:w="5400"/>
-        <w:gridCol w:w="1200"/>
-        <w:gridCol w:w="2138"/>
+        <w:gridCol w:w="5900"/>
+        <w:gridCol w:w="2838"/>
       </w:tblGrid>
       <w:tr>
         <w:trPr>
@@ -11849,7 +10522,7 @@
         </w:tc>
         <w:tc>
           <w:tcPr>
-            <w:tcW w:type="dxa" w:w="5400"/>
+            <w:tcW w:type="dxa" w:w="5900"/>
             <w:tcBorders>
               <w:top w:val="single" w:color="D6DAD3" w:sz="4"/>
               <w:left w:val="single" w:color="D6DAD3" w:sz="4"/>
@@ -11883,41 +10556,7 @@
         </w:tc>
         <w:tc>
           <w:tcPr>
-            <w:tcW w:type="dxa" w:w="1200"/>
-            <w:tcBorders>
-              <w:top w:val="single" w:color="D6DAD3" w:sz="4"/>
-              <w:left w:val="single" w:color="D6DAD3" w:sz="4"/>
-              <w:bottom w:val="single" w:color="D6DAD3" w:sz="4"/>
-              <w:right w:val="single" w:color="D6DAD3" w:sz="4"/>
-            </w:tcBorders>
-            <w:shd w:fill="ECEEE9" w:color="auto" w:val="clear"/>
-            <w:tcMar>
-              <w:top w:type="dxa" w:w="60"/>
-              <w:left w:type="dxa" w:w="100"/>
-              <w:bottom w:type="dxa" w:w="60"/>
-              <w:right w:type="dxa" w:w="100"/>
-            </w:tcMar>
-          </w:tcPr>
-          <w:p>
-            <w:pPr>
-              <w:spacing w:after="0" w:line="252"/>
-            </w:pPr>
-            <w:r>
-              <w:rPr>
-                <w:rFonts w:ascii="Calibri" w:cs="Calibri" w:eastAsia="Calibri" w:hAnsi="Calibri"/>
-                <w:b/>
-                <w:bCs/>
-                <w:color w:val="4A5563"/>
-                <w:sz w:val="19"/>
-                <w:szCs w:val="19"/>
-              </w:rPr>
-              <w:t xml:space="preserve">Days</w:t>
-            </w:r>
-          </w:p>
-        </w:tc>
-        <w:tc>
-          <w:tcPr>
-            <w:tcW w:type="dxa" w:w="2138"/>
+            <w:tcW w:type="dxa" w:w="2838"/>
             <w:tcBorders>
               <w:top w:val="single" w:color="D6DAD3" w:sz="4"/>
               <w:left w:val="single" w:color="D6DAD3" w:sz="4"/>
@@ -11987,7 +10626,7 @@
         </w:tc>
         <w:tc>
           <w:tcPr>
-            <w:tcW w:type="dxa" w:w="5400"/>
+            <w:tcW w:type="dxa" w:w="5900"/>
             <w:tcBorders>
               <w:top w:val="single" w:color="D6DAD3" w:sz="4"/>
               <w:left w:val="single" w:color="D6DAD3" w:sz="4"/>
@@ -12018,38 +10657,7 @@
         </w:tc>
         <w:tc>
           <w:tcPr>
-            <w:tcW w:type="dxa" w:w="1200"/>
-            <w:tcBorders>
-              <w:top w:val="single" w:color="D6DAD3" w:sz="4"/>
-              <w:left w:val="single" w:color="D6DAD3" w:sz="4"/>
-              <w:bottom w:val="single" w:color="D6DAD3" w:sz="4"/>
-              <w:right w:val="single" w:color="D6DAD3" w:sz="4"/>
-            </w:tcBorders>
-            <w:tcMar>
-              <w:top w:type="dxa" w:w="60"/>
-              <w:left w:type="dxa" w:w="100"/>
-              <w:bottom w:type="dxa" w:w="60"/>
-              <w:right w:type="dxa" w:w="100"/>
-            </w:tcMar>
-          </w:tcPr>
-          <w:p>
-            <w:pPr>
-              <w:spacing w:after="0" w:line="252"/>
-            </w:pPr>
-            <w:r>
-              <w:rPr>
-                <w:rFonts w:ascii="Calibri" w:cs="Calibri" w:eastAsia="Calibri" w:hAnsi="Calibri"/>
-                <w:color w:val="1B2430"/>
-                <w:sz w:val="22"/>
-                <w:szCs w:val="22"/>
-              </w:rPr>
-              <w:t xml:space="preserve">1</w:t>
-            </w:r>
-          </w:p>
-        </w:tc>
-        <w:tc>
-          <w:tcPr>
-            <w:tcW w:type="dxa" w:w="2138"/>
+            <w:tcW w:type="dxa" w:w="2838"/>
             <w:tcBorders>
               <w:top w:val="single" w:color="D6DAD3" w:sz="4"/>
               <w:left w:val="single" w:color="D6DAD3" w:sz="4"/>
@@ -12116,7 +10724,7 @@
         </w:tc>
         <w:tc>
           <w:tcPr>
-            <w:tcW w:type="dxa" w:w="5400"/>
+            <w:tcW w:type="dxa" w:w="5900"/>
             <w:tcBorders>
               <w:top w:val="single" w:color="D6DAD3" w:sz="4"/>
               <w:left w:val="single" w:color="D6DAD3" w:sz="4"/>
@@ -12147,38 +10755,7 @@
         </w:tc>
         <w:tc>
           <w:tcPr>
-            <w:tcW w:type="dxa" w:w="1200"/>
-            <w:tcBorders>
-              <w:top w:val="single" w:color="D6DAD3" w:sz="4"/>
-              <w:left w:val="single" w:color="D6DAD3" w:sz="4"/>
-              <w:bottom w:val="single" w:color="D6DAD3" w:sz="4"/>
-              <w:right w:val="single" w:color="D6DAD3" w:sz="4"/>
-            </w:tcBorders>
-            <w:tcMar>
-              <w:top w:type="dxa" w:w="60"/>
-              <w:left w:type="dxa" w:w="100"/>
-              <w:bottom w:type="dxa" w:w="60"/>
-              <w:right w:type="dxa" w:w="100"/>
-            </w:tcMar>
-          </w:tcPr>
-          <w:p>
-            <w:pPr>
-              <w:spacing w:after="0" w:line="252"/>
-            </w:pPr>
-            <w:r>
-              <w:rPr>
-                <w:rFonts w:ascii="Calibri" w:cs="Calibri" w:eastAsia="Calibri" w:hAnsi="Calibri"/>
-                <w:color w:val="1B2430"/>
-                <w:sz w:val="22"/>
-                <w:szCs w:val="22"/>
-              </w:rPr>
-              <w:t xml:space="preserve">2</w:t>
-            </w:r>
-          </w:p>
-        </w:tc>
-        <w:tc>
-          <w:tcPr>
-            <w:tcW w:type="dxa" w:w="2138"/>
+            <w:tcW w:type="dxa" w:w="2838"/>
             <w:tcBorders>
               <w:top w:val="single" w:color="D6DAD3" w:sz="4"/>
               <w:left w:val="single" w:color="D6DAD3" w:sz="4"/>
@@ -12224,7 +10801,7 @@
           <w:sz w:val="26"/>
           <w:szCs w:val="26"/>
         </w:rPr>
-        <w:t xml:space="preserve">Epic 6 · Logfather integration (1.5 weeks)</w:t>
+        <w:t xml:space="preserve">Epic 6 · Logfather integration</w:t>
       </w:r>
     </w:p>
     <w:tbl>
@@ -12241,9 +10818,8 @@
       </w:tblPr>
       <w:tblGrid>
         <w:gridCol w:w="900"/>
-        <w:gridCol w:w="5400"/>
-        <w:gridCol w:w="1200"/>
-        <w:gridCol w:w="2138"/>
+        <w:gridCol w:w="5900"/>
+        <w:gridCol w:w="2838"/>
       </w:tblGrid>
       <w:tr>
         <w:trPr>
@@ -12285,7 +10861,7 @@
         </w:tc>
         <w:tc>
           <w:tcPr>
-            <w:tcW w:type="dxa" w:w="5400"/>
+            <w:tcW w:type="dxa" w:w="5900"/>
             <w:tcBorders>
               <w:top w:val="single" w:color="D6DAD3" w:sz="4"/>
               <w:left w:val="single" w:color="D6DAD3" w:sz="4"/>
@@ -12319,41 +10895,7 @@
         </w:tc>
         <w:tc>
           <w:tcPr>
-            <w:tcW w:type="dxa" w:w="1200"/>
-            <w:tcBorders>
-              <w:top w:val="single" w:color="D6DAD3" w:sz="4"/>
-              <w:left w:val="single" w:color="D6DAD3" w:sz="4"/>
-              <w:bottom w:val="single" w:color="D6DAD3" w:sz="4"/>
-              <w:right w:val="single" w:color="D6DAD3" w:sz="4"/>
-            </w:tcBorders>
-            <w:shd w:fill="ECEEE9" w:color="auto" w:val="clear"/>
-            <w:tcMar>
-              <w:top w:type="dxa" w:w="60"/>
-              <w:left w:type="dxa" w:w="100"/>
-              <w:bottom w:type="dxa" w:w="60"/>
-              <w:right w:type="dxa" w:w="100"/>
-            </w:tcMar>
-          </w:tcPr>
-          <w:p>
-            <w:pPr>
-              <w:spacing w:after="0" w:line="252"/>
-            </w:pPr>
-            <w:r>
-              <w:rPr>
-                <w:rFonts w:ascii="Calibri" w:cs="Calibri" w:eastAsia="Calibri" w:hAnsi="Calibri"/>
-                <w:b/>
-                <w:bCs/>
-                <w:color w:val="4A5563"/>
-                <w:sz w:val="19"/>
-                <w:szCs w:val="19"/>
-              </w:rPr>
-              <w:t xml:space="preserve">Days</w:t>
-            </w:r>
-          </w:p>
-        </w:tc>
-        <w:tc>
-          <w:tcPr>
-            <w:tcW w:type="dxa" w:w="2138"/>
+            <w:tcW w:type="dxa" w:w="2838"/>
             <w:tcBorders>
               <w:top w:val="single" w:color="D6DAD3" w:sz="4"/>
               <w:left w:val="single" w:color="D6DAD3" w:sz="4"/>
@@ -12423,7 +10965,7 @@
         </w:tc>
         <w:tc>
           <w:tcPr>
-            <w:tcW w:type="dxa" w:w="5400"/>
+            <w:tcW w:type="dxa" w:w="5900"/>
             <w:tcBorders>
               <w:top w:val="single" w:color="D6DAD3" w:sz="4"/>
               <w:left w:val="single" w:color="D6DAD3" w:sz="4"/>
@@ -12454,38 +10996,7 @@
         </w:tc>
         <w:tc>
           <w:tcPr>
-            <w:tcW w:type="dxa" w:w="1200"/>
-            <w:tcBorders>
-              <w:top w:val="single" w:color="D6DAD3" w:sz="4"/>
-              <w:left w:val="single" w:color="D6DAD3" w:sz="4"/>
-              <w:bottom w:val="single" w:color="D6DAD3" w:sz="4"/>
-              <w:right w:val="single" w:color="D6DAD3" w:sz="4"/>
-            </w:tcBorders>
-            <w:tcMar>
-              <w:top w:type="dxa" w:w="60"/>
-              <w:left w:type="dxa" w:w="100"/>
-              <w:bottom w:type="dxa" w:w="60"/>
-              <w:right w:type="dxa" w:w="100"/>
-            </w:tcMar>
-          </w:tcPr>
-          <w:p>
-            <w:pPr>
-              <w:spacing w:after="0" w:line="252"/>
-            </w:pPr>
-            <w:r>
-              <w:rPr>
-                <w:rFonts w:ascii="Calibri" w:cs="Calibri" w:eastAsia="Calibri" w:hAnsi="Calibri"/>
-                <w:color w:val="1B2430"/>
-                <w:sz w:val="22"/>
-                <w:szCs w:val="22"/>
-              </w:rPr>
-              <w:t xml:space="preserve">2</w:t>
-            </w:r>
-          </w:p>
-        </w:tc>
-        <w:tc>
-          <w:tcPr>
-            <w:tcW w:type="dxa" w:w="2138"/>
+            <w:tcW w:type="dxa" w:w="2838"/>
             <w:tcBorders>
               <w:top w:val="single" w:color="D6DAD3" w:sz="4"/>
               <w:left w:val="single" w:color="D6DAD3" w:sz="4"/>
@@ -12552,7 +11063,7 @@
         </w:tc>
         <w:tc>
           <w:tcPr>
-            <w:tcW w:type="dxa" w:w="5400"/>
+            <w:tcW w:type="dxa" w:w="5900"/>
             <w:tcBorders>
               <w:top w:val="single" w:color="D6DAD3" w:sz="4"/>
               <w:left w:val="single" w:color="D6DAD3" w:sz="4"/>
@@ -12583,38 +11094,7 @@
         </w:tc>
         <w:tc>
           <w:tcPr>
-            <w:tcW w:type="dxa" w:w="1200"/>
-            <w:tcBorders>
-              <w:top w:val="single" w:color="D6DAD3" w:sz="4"/>
-              <w:left w:val="single" w:color="D6DAD3" w:sz="4"/>
-              <w:bottom w:val="single" w:color="D6DAD3" w:sz="4"/>
-              <w:right w:val="single" w:color="D6DAD3" w:sz="4"/>
-            </w:tcBorders>
-            <w:tcMar>
-              <w:top w:type="dxa" w:w="60"/>
-              <w:left w:type="dxa" w:w="100"/>
-              <w:bottom w:type="dxa" w:w="60"/>
-              <w:right w:type="dxa" w:w="100"/>
-            </w:tcMar>
-          </w:tcPr>
-          <w:p>
-            <w:pPr>
-              <w:spacing w:after="0" w:line="252"/>
-            </w:pPr>
-            <w:r>
-              <w:rPr>
-                <w:rFonts w:ascii="Calibri" w:cs="Calibri" w:eastAsia="Calibri" w:hAnsi="Calibri"/>
-                <w:color w:val="1B2430"/>
-                <w:sz w:val="22"/>
-                <w:szCs w:val="22"/>
-              </w:rPr>
-              <w:t xml:space="preserve">2</w:t>
-            </w:r>
-          </w:p>
-        </w:tc>
-        <w:tc>
-          <w:tcPr>
-            <w:tcW w:type="dxa" w:w="2138"/>
+            <w:tcW w:type="dxa" w:w="2838"/>
             <w:tcBorders>
               <w:top w:val="single" w:color="D6DAD3" w:sz="4"/>
               <w:left w:val="single" w:color="D6DAD3" w:sz="4"/>
@@ -12681,7 +11161,7 @@
         </w:tc>
         <w:tc>
           <w:tcPr>
-            <w:tcW w:type="dxa" w:w="5400"/>
+            <w:tcW w:type="dxa" w:w="5900"/>
             <w:tcBorders>
               <w:top w:val="single" w:color="D6DAD3" w:sz="4"/>
               <w:left w:val="single" w:color="D6DAD3" w:sz="4"/>
@@ -12712,38 +11192,7 @@
         </w:tc>
         <w:tc>
           <w:tcPr>
-            <w:tcW w:type="dxa" w:w="1200"/>
-            <w:tcBorders>
-              <w:top w:val="single" w:color="D6DAD3" w:sz="4"/>
-              <w:left w:val="single" w:color="D6DAD3" w:sz="4"/>
-              <w:bottom w:val="single" w:color="D6DAD3" w:sz="4"/>
-              <w:right w:val="single" w:color="D6DAD3" w:sz="4"/>
-            </w:tcBorders>
-            <w:tcMar>
-              <w:top w:type="dxa" w:w="60"/>
-              <w:left w:type="dxa" w:w="100"/>
-              <w:bottom w:type="dxa" w:w="60"/>
-              <w:right w:type="dxa" w:w="100"/>
-            </w:tcMar>
-          </w:tcPr>
-          <w:p>
-            <w:pPr>
-              <w:spacing w:after="0" w:line="252"/>
-            </w:pPr>
-            <w:r>
-              <w:rPr>
-                <w:rFonts w:ascii="Calibri" w:cs="Calibri" w:eastAsia="Calibri" w:hAnsi="Calibri"/>
-                <w:color w:val="1B2430"/>
-                <w:sz w:val="22"/>
-                <w:szCs w:val="22"/>
-              </w:rPr>
-              <w:t xml:space="preserve">3</w:t>
-            </w:r>
-          </w:p>
-        </w:tc>
-        <w:tc>
-          <w:tcPr>
-            <w:tcW w:type="dxa" w:w="2138"/>
+            <w:tcW w:type="dxa" w:w="2838"/>
             <w:tcBorders>
               <w:top w:val="single" w:color="D6DAD3" w:sz="4"/>
               <w:left w:val="single" w:color="D6DAD3" w:sz="4"/>
@@ -12810,7 +11259,7 @@
         </w:tc>
         <w:tc>
           <w:tcPr>
-            <w:tcW w:type="dxa" w:w="5400"/>
+            <w:tcW w:type="dxa" w:w="5900"/>
             <w:tcBorders>
               <w:top w:val="single" w:color="D6DAD3" w:sz="4"/>
               <w:left w:val="single" w:color="D6DAD3" w:sz="4"/>
@@ -12841,38 +11290,7 @@
         </w:tc>
         <w:tc>
           <w:tcPr>
-            <w:tcW w:type="dxa" w:w="1200"/>
-            <w:tcBorders>
-              <w:top w:val="single" w:color="D6DAD3" w:sz="4"/>
-              <w:left w:val="single" w:color="D6DAD3" w:sz="4"/>
-              <w:bottom w:val="single" w:color="D6DAD3" w:sz="4"/>
-              <w:right w:val="single" w:color="D6DAD3" w:sz="4"/>
-            </w:tcBorders>
-            <w:tcMar>
-              <w:top w:type="dxa" w:w="60"/>
-              <w:left w:type="dxa" w:w="100"/>
-              <w:bottom w:type="dxa" w:w="60"/>
-              <w:right w:type="dxa" w:w="100"/>
-            </w:tcMar>
-          </w:tcPr>
-          <w:p>
-            <w:pPr>
-              <w:spacing w:after="0" w:line="252"/>
-            </w:pPr>
-            <w:r>
-              <w:rPr>
-                <w:rFonts w:ascii="Calibri" w:cs="Calibri" w:eastAsia="Calibri" w:hAnsi="Calibri"/>
-                <w:color w:val="1B2430"/>
-                <w:sz w:val="22"/>
-                <w:szCs w:val="22"/>
-              </w:rPr>
-              <w:t xml:space="preserve">1</w:t>
-            </w:r>
-          </w:p>
-        </w:tc>
-        <w:tc>
-          <w:tcPr>
-            <w:tcW w:type="dxa" w:w="2138"/>
+            <w:tcW w:type="dxa" w:w="2838"/>
             <w:tcBorders>
               <w:top w:val="single" w:color="D6DAD3" w:sz="4"/>
               <w:left w:val="single" w:color="D6DAD3" w:sz="4"/>
@@ -12918,7 +11336,7 @@
           <w:sz w:val="26"/>
           <w:szCs w:val="26"/>
         </w:rPr>
-        <w:t xml:space="preserve">Epic 8 · Telemetry (2 weeks, after Epic 4)</w:t>
+        <w:t xml:space="preserve">Epic 8 · Telemetry</w:t>
       </w:r>
     </w:p>
     <w:tbl>
@@ -12935,9 +11353,8 @@
       </w:tblPr>
       <w:tblGrid>
         <w:gridCol w:w="900"/>
-        <w:gridCol w:w="5400"/>
-        <w:gridCol w:w="1200"/>
-        <w:gridCol w:w="2138"/>
+        <w:gridCol w:w="5900"/>
+        <w:gridCol w:w="2838"/>
       </w:tblGrid>
       <w:tr>
         <w:trPr>
@@ -12979,7 +11396,7 @@
         </w:tc>
         <w:tc>
           <w:tcPr>
-            <w:tcW w:type="dxa" w:w="5400"/>
+            <w:tcW w:type="dxa" w:w="5900"/>
             <w:tcBorders>
               <w:top w:val="single" w:color="D6DAD3" w:sz="4"/>
               <w:left w:val="single" w:color="D6DAD3" w:sz="4"/>
@@ -13013,41 +11430,7 @@
         </w:tc>
         <w:tc>
           <w:tcPr>
-            <w:tcW w:type="dxa" w:w="1200"/>
-            <w:tcBorders>
-              <w:top w:val="single" w:color="D6DAD3" w:sz="4"/>
-              <w:left w:val="single" w:color="D6DAD3" w:sz="4"/>
-              <w:bottom w:val="single" w:color="D6DAD3" w:sz="4"/>
-              <w:right w:val="single" w:color="D6DAD3" w:sz="4"/>
-            </w:tcBorders>
-            <w:shd w:fill="ECEEE9" w:color="auto" w:val="clear"/>
-            <w:tcMar>
-              <w:top w:type="dxa" w:w="60"/>
-              <w:left w:type="dxa" w:w="100"/>
-              <w:bottom w:type="dxa" w:w="60"/>
-              <w:right w:type="dxa" w:w="100"/>
-            </w:tcMar>
-          </w:tcPr>
-          <w:p>
-            <w:pPr>
-              <w:spacing w:after="0" w:line="252"/>
-            </w:pPr>
-            <w:r>
-              <w:rPr>
-                <w:rFonts w:ascii="Calibri" w:cs="Calibri" w:eastAsia="Calibri" w:hAnsi="Calibri"/>
-                <w:b/>
-                <w:bCs/>
-                <w:color w:val="4A5563"/>
-                <w:sz w:val="19"/>
-                <w:szCs w:val="19"/>
-              </w:rPr>
-              <w:t xml:space="preserve">Days</w:t>
-            </w:r>
-          </w:p>
-        </w:tc>
-        <w:tc>
-          <w:tcPr>
-            <w:tcW w:type="dxa" w:w="2138"/>
+            <w:tcW w:type="dxa" w:w="2838"/>
             <w:tcBorders>
               <w:top w:val="single" w:color="D6DAD3" w:sz="4"/>
               <w:left w:val="single" w:color="D6DAD3" w:sz="4"/>
@@ -13117,7 +11500,7 @@
         </w:tc>
         <w:tc>
           <w:tcPr>
-            <w:tcW w:type="dxa" w:w="5400"/>
+            <w:tcW w:type="dxa" w:w="5900"/>
             <w:tcBorders>
               <w:top w:val="single" w:color="D6DAD3" w:sz="4"/>
               <w:left w:val="single" w:color="D6DAD3" w:sz="4"/>
@@ -13148,38 +11531,7 @@
         </w:tc>
         <w:tc>
           <w:tcPr>
-            <w:tcW w:type="dxa" w:w="1200"/>
-            <w:tcBorders>
-              <w:top w:val="single" w:color="D6DAD3" w:sz="4"/>
-              <w:left w:val="single" w:color="D6DAD3" w:sz="4"/>
-              <w:bottom w:val="single" w:color="D6DAD3" w:sz="4"/>
-              <w:right w:val="single" w:color="D6DAD3" w:sz="4"/>
-            </w:tcBorders>
-            <w:tcMar>
-              <w:top w:type="dxa" w:w="60"/>
-              <w:left w:type="dxa" w:w="100"/>
-              <w:bottom w:type="dxa" w:w="60"/>
-              <w:right w:type="dxa" w:w="100"/>
-            </w:tcMar>
-          </w:tcPr>
-          <w:p>
-            <w:pPr>
-              <w:spacing w:after="0" w:line="252"/>
-            </w:pPr>
-            <w:r>
-              <w:rPr>
-                <w:rFonts w:ascii="Calibri" w:cs="Calibri" w:eastAsia="Calibri" w:hAnsi="Calibri"/>
-                <w:color w:val="1B2430"/>
-                <w:sz w:val="22"/>
-                <w:szCs w:val="22"/>
-              </w:rPr>
-              <w:t xml:space="preserve">1</w:t>
-            </w:r>
-          </w:p>
-        </w:tc>
-        <w:tc>
-          <w:tcPr>
-            <w:tcW w:type="dxa" w:w="2138"/>
+            <w:tcW w:type="dxa" w:w="2838"/>
             <w:tcBorders>
               <w:top w:val="single" w:color="D6DAD3" w:sz="4"/>
               <w:left w:val="single" w:color="D6DAD3" w:sz="4"/>
@@ -13246,7 +11598,7 @@
         </w:tc>
         <w:tc>
           <w:tcPr>
-            <w:tcW w:type="dxa" w:w="5400"/>
+            <w:tcW w:type="dxa" w:w="5900"/>
             <w:tcBorders>
               <w:top w:val="single" w:color="D6DAD3" w:sz="4"/>
               <w:left w:val="single" w:color="D6DAD3" w:sz="4"/>
@@ -13277,38 +11629,7 @@
         </w:tc>
         <w:tc>
           <w:tcPr>
-            <w:tcW w:type="dxa" w:w="1200"/>
-            <w:tcBorders>
-              <w:top w:val="single" w:color="D6DAD3" w:sz="4"/>
-              <w:left w:val="single" w:color="D6DAD3" w:sz="4"/>
-              <w:bottom w:val="single" w:color="D6DAD3" w:sz="4"/>
-              <w:right w:val="single" w:color="D6DAD3" w:sz="4"/>
-            </w:tcBorders>
-            <w:tcMar>
-              <w:top w:type="dxa" w:w="60"/>
-              <w:left w:type="dxa" w:w="100"/>
-              <w:bottom w:type="dxa" w:w="60"/>
-              <w:right w:type="dxa" w:w="100"/>
-            </w:tcMar>
-          </w:tcPr>
-          <w:p>
-            <w:pPr>
-              <w:spacing w:after="0" w:line="252"/>
-            </w:pPr>
-            <w:r>
-              <w:rPr>
-                <w:rFonts w:ascii="Calibri" w:cs="Calibri" w:eastAsia="Calibri" w:hAnsi="Calibri"/>
-                <w:color w:val="1B2430"/>
-                <w:sz w:val="22"/>
-                <w:szCs w:val="22"/>
-              </w:rPr>
-              <w:t xml:space="preserve">1</w:t>
-            </w:r>
-          </w:p>
-        </w:tc>
-        <w:tc>
-          <w:tcPr>
-            <w:tcW w:type="dxa" w:w="2138"/>
+            <w:tcW w:type="dxa" w:w="2838"/>
             <w:tcBorders>
               <w:top w:val="single" w:color="D6DAD3" w:sz="4"/>
               <w:left w:val="single" w:color="D6DAD3" w:sz="4"/>
@@ -13375,7 +11696,7 @@
         </w:tc>
         <w:tc>
           <w:tcPr>
-            <w:tcW w:type="dxa" w:w="5400"/>
+            <w:tcW w:type="dxa" w:w="5900"/>
             <w:tcBorders>
               <w:top w:val="single" w:color="D6DAD3" w:sz="4"/>
               <w:left w:val="single" w:color="D6DAD3" w:sz="4"/>
@@ -13406,38 +11727,7 @@
         </w:tc>
         <w:tc>
           <w:tcPr>
-            <w:tcW w:type="dxa" w:w="1200"/>
-            <w:tcBorders>
-              <w:top w:val="single" w:color="D6DAD3" w:sz="4"/>
-              <w:left w:val="single" w:color="D6DAD3" w:sz="4"/>
-              <w:bottom w:val="single" w:color="D6DAD3" w:sz="4"/>
-              <w:right w:val="single" w:color="D6DAD3" w:sz="4"/>
-            </w:tcBorders>
-            <w:tcMar>
-              <w:top w:type="dxa" w:w="60"/>
-              <w:left w:type="dxa" w:w="100"/>
-              <w:bottom w:type="dxa" w:w="60"/>
-              <w:right w:type="dxa" w:w="100"/>
-            </w:tcMar>
-          </w:tcPr>
-          <w:p>
-            <w:pPr>
-              <w:spacing w:after="0" w:line="252"/>
-            </w:pPr>
-            <w:r>
-              <w:rPr>
-                <w:rFonts w:ascii="Calibri" w:cs="Calibri" w:eastAsia="Calibri" w:hAnsi="Calibri"/>
-                <w:color w:val="1B2430"/>
-                <w:sz w:val="22"/>
-                <w:szCs w:val="22"/>
-              </w:rPr>
-              <w:t xml:space="preserve">3</w:t>
-            </w:r>
-          </w:p>
-        </w:tc>
-        <w:tc>
-          <w:tcPr>
-            <w:tcW w:type="dxa" w:w="2138"/>
+            <w:tcW w:type="dxa" w:w="2838"/>
             <w:tcBorders>
               <w:top w:val="single" w:color="D6DAD3" w:sz="4"/>
               <w:left w:val="single" w:color="D6DAD3" w:sz="4"/>
@@ -13504,7 +11794,7 @@
         </w:tc>
         <w:tc>
           <w:tcPr>
-            <w:tcW w:type="dxa" w:w="5400"/>
+            <w:tcW w:type="dxa" w:w="5900"/>
             <w:tcBorders>
               <w:top w:val="single" w:color="D6DAD3" w:sz="4"/>
               <w:left w:val="single" w:color="D6DAD3" w:sz="4"/>
@@ -13535,38 +11825,7 @@
         </w:tc>
         <w:tc>
           <w:tcPr>
-            <w:tcW w:type="dxa" w:w="1200"/>
-            <w:tcBorders>
-              <w:top w:val="single" w:color="D6DAD3" w:sz="4"/>
-              <w:left w:val="single" w:color="D6DAD3" w:sz="4"/>
-              <w:bottom w:val="single" w:color="D6DAD3" w:sz="4"/>
-              <w:right w:val="single" w:color="D6DAD3" w:sz="4"/>
-            </w:tcBorders>
-            <w:tcMar>
-              <w:top w:type="dxa" w:w="60"/>
-              <w:left w:type="dxa" w:w="100"/>
-              <w:bottom w:type="dxa" w:w="60"/>
-              <w:right w:type="dxa" w:w="100"/>
-            </w:tcMar>
-          </w:tcPr>
-          <w:p>
-            <w:pPr>
-              <w:spacing w:after="0" w:line="252"/>
-            </w:pPr>
-            <w:r>
-              <w:rPr>
-                <w:rFonts w:ascii="Calibri" w:cs="Calibri" w:eastAsia="Calibri" w:hAnsi="Calibri"/>
-                <w:color w:val="1B2430"/>
-                <w:sz w:val="22"/>
-                <w:szCs w:val="22"/>
-              </w:rPr>
-              <w:t xml:space="preserve">1</w:t>
-            </w:r>
-          </w:p>
-        </w:tc>
-        <w:tc>
-          <w:tcPr>
-            <w:tcW w:type="dxa" w:w="2138"/>
+            <w:tcW w:type="dxa" w:w="2838"/>
             <w:tcBorders>
               <w:top w:val="single" w:color="D6DAD3" w:sz="4"/>
               <w:left w:val="single" w:color="D6DAD3" w:sz="4"/>
@@ -13633,7 +11892,7 @@
         </w:tc>
         <w:tc>
           <w:tcPr>
-            <w:tcW w:type="dxa" w:w="5400"/>
+            <w:tcW w:type="dxa" w:w="5900"/>
             <w:tcBorders>
               <w:top w:val="single" w:color="D6DAD3" w:sz="4"/>
               <w:left w:val="single" w:color="D6DAD3" w:sz="4"/>
@@ -13664,38 +11923,7 @@
         </w:tc>
         <w:tc>
           <w:tcPr>
-            <w:tcW w:type="dxa" w:w="1200"/>
-            <w:tcBorders>
-              <w:top w:val="single" w:color="D6DAD3" w:sz="4"/>
-              <w:left w:val="single" w:color="D6DAD3" w:sz="4"/>
-              <w:bottom w:val="single" w:color="D6DAD3" w:sz="4"/>
-              <w:right w:val="single" w:color="D6DAD3" w:sz="4"/>
-            </w:tcBorders>
-            <w:tcMar>
-              <w:top w:type="dxa" w:w="60"/>
-              <w:left w:type="dxa" w:w="100"/>
-              <w:bottom w:type="dxa" w:w="60"/>
-              <w:right w:type="dxa" w:w="100"/>
-            </w:tcMar>
-          </w:tcPr>
-          <w:p>
-            <w:pPr>
-              <w:spacing w:after="0" w:line="252"/>
-            </w:pPr>
-            <w:r>
-              <w:rPr>
-                <w:rFonts w:ascii="Calibri" w:cs="Calibri" w:eastAsia="Calibri" w:hAnsi="Calibri"/>
-                <w:color w:val="1B2430"/>
-                <w:sz w:val="22"/>
-                <w:szCs w:val="22"/>
-              </w:rPr>
-              <w:t xml:space="preserve">2</w:t>
-            </w:r>
-          </w:p>
-        </w:tc>
-        <w:tc>
-          <w:tcPr>
-            <w:tcW w:type="dxa" w:w="2138"/>
+            <w:tcW w:type="dxa" w:w="2838"/>
             <w:tcBorders>
               <w:top w:val="single" w:color="D6DAD3" w:sz="4"/>
               <w:left w:val="single" w:color="D6DAD3" w:sz="4"/>
@@ -13762,7 +11990,7 @@
         </w:tc>
         <w:tc>
           <w:tcPr>
-            <w:tcW w:type="dxa" w:w="5400"/>
+            <w:tcW w:type="dxa" w:w="5900"/>
             <w:tcBorders>
               <w:top w:val="single" w:color="D6DAD3" w:sz="4"/>
               <w:left w:val="single" w:color="D6DAD3" w:sz="4"/>
@@ -13793,38 +12021,7 @@
         </w:tc>
         <w:tc>
           <w:tcPr>
-            <w:tcW w:type="dxa" w:w="1200"/>
-            <w:tcBorders>
-              <w:top w:val="single" w:color="D6DAD3" w:sz="4"/>
-              <w:left w:val="single" w:color="D6DAD3" w:sz="4"/>
-              <w:bottom w:val="single" w:color="D6DAD3" w:sz="4"/>
-              <w:right w:val="single" w:color="D6DAD3" w:sz="4"/>
-            </w:tcBorders>
-            <w:tcMar>
-              <w:top w:type="dxa" w:w="60"/>
-              <w:left w:type="dxa" w:w="100"/>
-              <w:bottom w:type="dxa" w:w="60"/>
-              <w:right w:type="dxa" w:w="100"/>
-            </w:tcMar>
-          </w:tcPr>
-          <w:p>
-            <w:pPr>
-              <w:spacing w:after="0" w:line="252"/>
-            </w:pPr>
-            <w:r>
-              <w:rPr>
-                <w:rFonts w:ascii="Calibri" w:cs="Calibri" w:eastAsia="Calibri" w:hAnsi="Calibri"/>
-                <w:color w:val="1B2430"/>
-                <w:sz w:val="22"/>
-                <w:szCs w:val="22"/>
-              </w:rPr>
-              <w:t xml:space="preserve">2</w:t>
-            </w:r>
-          </w:p>
-        </w:tc>
-        <w:tc>
-          <w:tcPr>
-            <w:tcW w:type="dxa" w:w="2138"/>
+            <w:tcW w:type="dxa" w:w="2838"/>
             <w:tcBorders>
               <w:top w:val="single" w:color="D6DAD3" w:sz="4"/>
               <w:left w:val="single" w:color="D6DAD3" w:sz="4"/>
@@ -13891,7 +12088,7 @@
         </w:tc>
         <w:tc>
           <w:tcPr>
-            <w:tcW w:type="dxa" w:w="5400"/>
+            <w:tcW w:type="dxa" w:w="5900"/>
             <w:tcBorders>
               <w:top w:val="single" w:color="D6DAD3" w:sz="4"/>
               <w:left w:val="single" w:color="D6DAD3" w:sz="4"/>
@@ -13922,38 +12119,7 @@
         </w:tc>
         <w:tc>
           <w:tcPr>
-            <w:tcW w:type="dxa" w:w="1200"/>
-            <w:tcBorders>
-              <w:top w:val="single" w:color="D6DAD3" w:sz="4"/>
-              <w:left w:val="single" w:color="D6DAD3" w:sz="4"/>
-              <w:bottom w:val="single" w:color="D6DAD3" w:sz="4"/>
-              <w:right w:val="single" w:color="D6DAD3" w:sz="4"/>
-            </w:tcBorders>
-            <w:tcMar>
-              <w:top w:type="dxa" w:w="60"/>
-              <w:left w:type="dxa" w:w="100"/>
-              <w:bottom w:type="dxa" w:w="60"/>
-              <w:right w:type="dxa" w:w="100"/>
-            </w:tcMar>
-          </w:tcPr>
-          <w:p>
-            <w:pPr>
-              <w:spacing w:after="0" w:line="252"/>
-            </w:pPr>
-            <w:r>
-              <w:rPr>
-                <w:rFonts w:ascii="Calibri" w:cs="Calibri" w:eastAsia="Calibri" w:hAnsi="Calibri"/>
-                <w:color w:val="1B2430"/>
-                <w:sz w:val="22"/>
-                <w:szCs w:val="22"/>
-              </w:rPr>
-              <w:t xml:space="preserve">1</w:t>
-            </w:r>
-          </w:p>
-        </w:tc>
-        <w:tc>
-          <w:tcPr>
-            <w:tcW w:type="dxa" w:w="2138"/>
+            <w:tcW w:type="dxa" w:w="2838"/>
             <w:tcBorders>
               <w:top w:val="single" w:color="D6DAD3" w:sz="4"/>
               <w:left w:val="single" w:color="D6DAD3" w:sz="4"/>
@@ -13999,7 +12165,7 @@
           <w:sz w:val="26"/>
           <w:szCs w:val="26"/>
         </w:rPr>
-        <w:t xml:space="preserve">Epic 7 · Operations and cutover (1 week)</w:t>
+        <w:t xml:space="preserve">Epic 7 · Operations and cutover</w:t>
       </w:r>
     </w:p>
     <w:tbl>
@@ -14016,9 +12182,8 @@
       </w:tblPr>
       <w:tblGrid>
         <w:gridCol w:w="900"/>
-        <w:gridCol w:w="5400"/>
-        <w:gridCol w:w="1200"/>
-        <w:gridCol w:w="2138"/>
+        <w:gridCol w:w="5900"/>
+        <w:gridCol w:w="2838"/>
       </w:tblGrid>
       <w:tr>
         <w:trPr>
@@ -14060,7 +12225,7 @@
         </w:tc>
         <w:tc>
           <w:tcPr>
-            <w:tcW w:type="dxa" w:w="5400"/>
+            <w:tcW w:type="dxa" w:w="5900"/>
             <w:tcBorders>
               <w:top w:val="single" w:color="D6DAD3" w:sz="4"/>
               <w:left w:val="single" w:color="D6DAD3" w:sz="4"/>
@@ -14094,41 +12259,7 @@
         </w:tc>
         <w:tc>
           <w:tcPr>
-            <w:tcW w:type="dxa" w:w="1200"/>
-            <w:tcBorders>
-              <w:top w:val="single" w:color="D6DAD3" w:sz="4"/>
-              <w:left w:val="single" w:color="D6DAD3" w:sz="4"/>
-              <w:bottom w:val="single" w:color="D6DAD3" w:sz="4"/>
-              <w:right w:val="single" w:color="D6DAD3" w:sz="4"/>
-            </w:tcBorders>
-            <w:shd w:fill="ECEEE9" w:color="auto" w:val="clear"/>
-            <w:tcMar>
-              <w:top w:type="dxa" w:w="60"/>
-              <w:left w:type="dxa" w:w="100"/>
-              <w:bottom w:type="dxa" w:w="60"/>
-              <w:right w:type="dxa" w:w="100"/>
-            </w:tcMar>
-          </w:tcPr>
-          <w:p>
-            <w:pPr>
-              <w:spacing w:after="0" w:line="252"/>
-            </w:pPr>
-            <w:r>
-              <w:rPr>
-                <w:rFonts w:ascii="Calibri" w:cs="Calibri" w:eastAsia="Calibri" w:hAnsi="Calibri"/>
-                <w:b/>
-                <w:bCs/>
-                <w:color w:val="4A5563"/>
-                <w:sz w:val="19"/>
-                <w:szCs w:val="19"/>
-              </w:rPr>
-              <w:t xml:space="preserve">Days</w:t>
-            </w:r>
-          </w:p>
-        </w:tc>
-        <w:tc>
-          <w:tcPr>
-            <w:tcW w:type="dxa" w:w="2138"/>
+            <w:tcW w:type="dxa" w:w="2838"/>
             <w:tcBorders>
               <w:top w:val="single" w:color="D6DAD3" w:sz="4"/>
               <w:left w:val="single" w:color="D6DAD3" w:sz="4"/>
@@ -14198,7 +12329,7 @@
         </w:tc>
         <w:tc>
           <w:tcPr>
-            <w:tcW w:type="dxa" w:w="5400"/>
+            <w:tcW w:type="dxa" w:w="5900"/>
             <w:tcBorders>
               <w:top w:val="single" w:color="D6DAD3" w:sz="4"/>
               <w:left w:val="single" w:color="D6DAD3" w:sz="4"/>
@@ -14229,38 +12360,7 @@
         </w:tc>
         <w:tc>
           <w:tcPr>
-            <w:tcW w:type="dxa" w:w="1200"/>
-            <w:tcBorders>
-              <w:top w:val="single" w:color="D6DAD3" w:sz="4"/>
-              <w:left w:val="single" w:color="D6DAD3" w:sz="4"/>
-              <w:bottom w:val="single" w:color="D6DAD3" w:sz="4"/>
-              <w:right w:val="single" w:color="D6DAD3" w:sz="4"/>
-            </w:tcBorders>
-            <w:tcMar>
-              <w:top w:type="dxa" w:w="60"/>
-              <w:left w:type="dxa" w:w="100"/>
-              <w:bottom w:type="dxa" w:w="60"/>
-              <w:right w:type="dxa" w:w="100"/>
-            </w:tcMar>
-          </w:tcPr>
-          <w:p>
-            <w:pPr>
-              <w:spacing w:after="0" w:line="252"/>
-            </w:pPr>
-            <w:r>
-              <w:rPr>
-                <w:rFonts w:ascii="Calibri" w:cs="Calibri" w:eastAsia="Calibri" w:hAnsi="Calibri"/>
-                <w:color w:val="1B2430"/>
-                <w:sz w:val="22"/>
-                <w:szCs w:val="22"/>
-              </w:rPr>
-              <w:t xml:space="preserve">1</w:t>
-            </w:r>
-          </w:p>
-        </w:tc>
-        <w:tc>
-          <w:tcPr>
-            <w:tcW w:type="dxa" w:w="2138"/>
+            <w:tcW w:type="dxa" w:w="2838"/>
             <w:tcBorders>
               <w:top w:val="single" w:color="D6DAD3" w:sz="4"/>
               <w:left w:val="single" w:color="D6DAD3" w:sz="4"/>
@@ -14327,7 +12427,7 @@
         </w:tc>
         <w:tc>
           <w:tcPr>
-            <w:tcW w:type="dxa" w:w="5400"/>
+            <w:tcW w:type="dxa" w:w="5900"/>
             <w:tcBorders>
               <w:top w:val="single" w:color="D6DAD3" w:sz="4"/>
               <w:left w:val="single" w:color="D6DAD3" w:sz="4"/>
@@ -14358,38 +12458,7 @@
         </w:tc>
         <w:tc>
           <w:tcPr>
-            <w:tcW w:type="dxa" w:w="1200"/>
-            <w:tcBorders>
-              <w:top w:val="single" w:color="D6DAD3" w:sz="4"/>
-              <w:left w:val="single" w:color="D6DAD3" w:sz="4"/>
-              <w:bottom w:val="single" w:color="D6DAD3" w:sz="4"/>
-              <w:right w:val="single" w:color="D6DAD3" w:sz="4"/>
-            </w:tcBorders>
-            <w:tcMar>
-              <w:top w:type="dxa" w:w="60"/>
-              <w:left w:type="dxa" w:w="100"/>
-              <w:bottom w:type="dxa" w:w="60"/>
-              <w:right w:type="dxa" w:w="100"/>
-            </w:tcMar>
-          </w:tcPr>
-          <w:p>
-            <w:pPr>
-              <w:spacing w:after="0" w:line="252"/>
-            </w:pPr>
-            <w:r>
-              <w:rPr>
-                <w:rFonts w:ascii="Calibri" w:cs="Calibri" w:eastAsia="Calibri" w:hAnsi="Calibri"/>
-                <w:color w:val="1B2430"/>
-                <w:sz w:val="22"/>
-                <w:szCs w:val="22"/>
-              </w:rPr>
-              <w:t xml:space="preserve">0.5</w:t>
-            </w:r>
-          </w:p>
-        </w:tc>
-        <w:tc>
-          <w:tcPr>
-            <w:tcW w:type="dxa" w:w="2138"/>
+            <w:tcW w:type="dxa" w:w="2838"/>
             <w:tcBorders>
               <w:top w:val="single" w:color="D6DAD3" w:sz="4"/>
               <w:left w:val="single" w:color="D6DAD3" w:sz="4"/>
@@ -14456,7 +12525,7 @@
         </w:tc>
         <w:tc>
           <w:tcPr>
-            <w:tcW w:type="dxa" w:w="5400"/>
+            <w:tcW w:type="dxa" w:w="5900"/>
             <w:tcBorders>
               <w:top w:val="single" w:color="D6DAD3" w:sz="4"/>
               <w:left w:val="single" w:color="D6DAD3" w:sz="4"/>
@@ -14481,44 +12550,13 @@
                 <w:sz w:val="22"/>
                 <w:szCs w:val="22"/>
               </w:rPr>
-              <w:t xml:space="preserve">Training and a two-week parallel run with the spreadsheets frozen</w:t>
-            </w:r>
-          </w:p>
-        </w:tc>
-        <w:tc>
-          <w:tcPr>
-            <w:tcW w:type="dxa" w:w="1200"/>
-            <w:tcBorders>
-              <w:top w:val="single" w:color="D6DAD3" w:sz="4"/>
-              <w:left w:val="single" w:color="D6DAD3" w:sz="4"/>
-              <w:bottom w:val="single" w:color="D6DAD3" w:sz="4"/>
-              <w:right w:val="single" w:color="D6DAD3" w:sz="4"/>
-            </w:tcBorders>
-            <w:tcMar>
-              <w:top w:type="dxa" w:w="60"/>
-              <w:left w:type="dxa" w:w="100"/>
-              <w:bottom w:type="dxa" w:w="60"/>
-              <w:right w:type="dxa" w:w="100"/>
-            </w:tcMar>
-          </w:tcPr>
-          <w:p>
-            <w:pPr>
-              <w:spacing w:after="0" w:line="252"/>
-            </w:pPr>
-            <w:r>
-              <w:rPr>
-                <w:rFonts w:ascii="Calibri" w:cs="Calibri" w:eastAsia="Calibri" w:hAnsi="Calibri"/>
-                <w:color w:val="1B2430"/>
-                <w:sz w:val="22"/>
-                <w:szCs w:val="22"/>
-              </w:rPr>
-              <w:t xml:space="preserve">2</w:t>
-            </w:r>
-          </w:p>
-        </w:tc>
-        <w:tc>
-          <w:tcPr>
-            <w:tcW w:type="dxa" w:w="2138"/>
+              <w:t xml:space="preserve">Training and a parallel run with the spreadsheets frozen</w:t>
+            </w:r>
+          </w:p>
+        </w:tc>
+        <w:tc>
+          <w:tcPr>
+            <w:tcW w:type="dxa" w:w="2838"/>
             <w:tcBorders>
               <w:top w:val="single" w:color="D6DAD3" w:sz="4"/>
               <w:left w:val="single" w:color="D6DAD3" w:sz="4"/>
@@ -14585,7 +12623,7 @@
         </w:tc>
         <w:tc>
           <w:tcPr>
-            <w:tcW w:type="dxa" w:w="5400"/>
+            <w:tcW w:type="dxa" w:w="5900"/>
             <w:tcBorders>
               <w:top w:val="single" w:color="D6DAD3" w:sz="4"/>
               <w:left w:val="single" w:color="D6DAD3" w:sz="4"/>
@@ -14616,38 +12654,7 @@
         </w:tc>
         <w:tc>
           <w:tcPr>
-            <w:tcW w:type="dxa" w:w="1200"/>
-            <w:tcBorders>
-              <w:top w:val="single" w:color="D6DAD3" w:sz="4"/>
-              <w:left w:val="single" w:color="D6DAD3" w:sz="4"/>
-              <w:bottom w:val="single" w:color="D6DAD3" w:sz="4"/>
-              <w:right w:val="single" w:color="D6DAD3" w:sz="4"/>
-            </w:tcBorders>
-            <w:tcMar>
-              <w:top w:type="dxa" w:w="60"/>
-              <w:left w:type="dxa" w:w="100"/>
-              <w:bottom w:type="dxa" w:w="60"/>
-              <w:right w:type="dxa" w:w="100"/>
-            </w:tcMar>
-          </w:tcPr>
-          <w:p>
-            <w:pPr>
-              <w:spacing w:after="0" w:line="252"/>
-            </w:pPr>
-            <w:r>
-              <w:rPr>
-                <w:rFonts w:ascii="Calibri" w:cs="Calibri" w:eastAsia="Calibri" w:hAnsi="Calibri"/>
-                <w:color w:val="1B2430"/>
-                <w:sz w:val="22"/>
-                <w:szCs w:val="22"/>
-              </w:rPr>
-              <w:t xml:space="preserve">0.5</w:t>
-            </w:r>
-          </w:p>
-        </w:tc>
-        <w:tc>
-          <w:tcPr>
-            <w:tcW w:type="dxa" w:w="2138"/>
+            <w:tcW w:type="dxa" w:w="2838"/>
             <w:tcBorders>
               <w:top w:val="single" w:color="D6DAD3" w:sz="4"/>
               <w:left w:val="single" w:color="D6DAD3" w:sz="4"/>
@@ -14693,7 +12700,7 @@
           <w:sz w:val="32"/>
           <w:szCs w:val="32"/>
         </w:rPr>
-        <w:t xml:space="preserve">Appendix: cost and timeline</w:t>
+        <w:t xml:space="preserve">Appendix: cost</w:t>
       </w:r>
     </w:p>
     <w:tbl>
@@ -15065,7 +13072,7 @@
           <w:sz w:val="22"/>
           <w:szCs w:val="22"/>
         </w:rPr>
-        <w:t xml:space="preserve">Everything together stays around £100 a month, which is the budget alert in the plan. The largest cost is people, not Azure: about thirteen weeks for one engineer, with the Excel, Logfather and telemetry epics able to overlap.</w:t>
+        <w:t xml:space="preserve">Everything together stays around £100 a month, which is the budget alert in the plan. The largest cost is people, not Azure.</w:t>
       </w:r>
     </w:p>
     <w:p>
@@ -15153,7 +13160,7 @@
           <w:sz w:val="22"/>
           <w:szCs w:val="22"/>
         </w:rPr>
-        <w:t xml:space="preserve">Two sources of truth during the parallel run: the spreadsheets are frozen read-only for those two weeks.</w:t>
+        <w:t xml:space="preserve">Two sources of truth during the parallel run: the spreadsheets are frozen read-only until cutover.</w:t>
       </w:r>
     </w:p>
     <w:p>

</xml_diff>

<commit_message>
Fleet database plan: Epic 9 LeapHQ / customer portal integration; engine worded as suggested
Co-Authored-By: Claude Fable 5.1 <noreply@anthropic.com>
</commit_message>
<xml_diff>
--- a/docs/database/PikPak Fleet Database Plan.docx
+++ b/docs/database/PikPak Fleet Database Plan.docx
@@ -523,7 +523,7 @@
                 <w:sz w:val="22"/>
                 <w:szCs w:val="22"/>
               </w:rPr>
-              <w:t xml:space="preserve">Decided: Azure Database for PostgreSQL Flexible Server, with the TimescaleDB extension, one database for everything.</w:t>
+              <w:t xml:space="preserve">Suggested: Azure Database for PostgreSQL Flexible Server, with the TimescaleDB extension, one database for everything.</w:t>
             </w:r>
           </w:p>
           <w:p>
@@ -5883,7 +5883,7 @@
           <w:sz w:val="22"/>
           <w:szCs w:val="22"/>
         </w:rPr>
-        <w:t xml:space="preserve">PostgreSQL with TimescaleDB, one database for records and telemetry, in place of Azure SQL plus a separate time-series service.</w:t>
+        <w:t xml:space="preserve">The suggestion is PostgreSQL with TimescaleDB, one database for records and telemetry, in place of Azure SQL plus a separate time-series service.</w:t>
       </w:r>
     </w:p>
     <w:p>
@@ -6058,7 +6058,7 @@
           <w:sz w:val="22"/>
           <w:szCs w:val="22"/>
         </w:rPr>
-        <w:t xml:space="preserve">Ten epics, fifty-five tickets, in dependency order. No timescales are given: the order matters, the durations depend on who does the work and how. Every ticket has acceptance criteria so it can be closed without discussion; the full text is in the working plan, this is the shape.</w:t>
+        <w:t xml:space="preserve">Eleven epics, sixty-two tickets, in dependency order. No timescales are given: the order matters, the durations depend on who does the work and how. Every ticket has acceptance criteria so it can be closed without discussion; the full text is in the working plan, this is the shape.</w:t>
       </w:r>
     </w:p>
     <w:p>
@@ -6461,7 +6461,7 @@
                 <w:sz w:val="22"/>
                 <w:szCs w:val="22"/>
               </w:rPr>
-              <w:t xml:space="preserve">Decision record: hosting, region, naming (engine already decided)</w:t>
+              <w:t xml:space="preserve">Decision record: engine (PostgreSQL with TimescaleDB is the suggestion), hosting, region, naming</w:t>
             </w:r>
           </w:p>
         </w:tc>
@@ -11316,6 +11316,835 @@
                 <w:szCs w:val="19"/>
               </w:rPr>
               <w:t xml:space="preserve"/>
+            </w:r>
+          </w:p>
+        </w:tc>
+      </w:tr>
+    </w:tbl>
+    <w:p>
+      <w:pPr>
+        <w:pStyle w:val="Heading2"/>
+        <w:keepNext/>
+        <w:spacing w:after="120" w:before="260"/>
+      </w:pPr>
+      <w:r>
+        <w:rPr>
+          <w:rFonts w:ascii="Calibri" w:cs="Calibri" w:eastAsia="Calibri" w:hAnsi="Calibri"/>
+          <w:b/>
+          <w:bCs/>
+          <w:color w:val="1F6F8B"/>
+          <w:sz w:val="26"/>
+          <w:szCs w:val="26"/>
+        </w:rPr>
+        <w:t xml:space="preserve">Epic 9 · LeapHQ / customer portal integration, after Epic 4</w:t>
+      </w:r>
+    </w:p>
+    <w:tbl>
+      <w:tblPr>
+        <w:tblW w:type="dxa" w:w="9638"/>
+        <w:tblBorders>
+          <w:top w:val="single" w:color="auto" w:sz="4"/>
+          <w:left w:val="single" w:color="auto" w:sz="4"/>
+          <w:bottom w:val="single" w:color="auto" w:sz="4"/>
+          <w:right w:val="single" w:color="auto" w:sz="4"/>
+          <w:insideH w:val="single" w:color="auto" w:sz="4"/>
+          <w:insideV w:val="single" w:color="auto" w:sz="4"/>
+        </w:tblBorders>
+      </w:tblPr>
+      <w:tblGrid>
+        <w:gridCol w:w="900"/>
+        <w:gridCol w:w="5900"/>
+        <w:gridCol w:w="2838"/>
+      </w:tblGrid>
+      <w:tr>
+        <w:trPr>
+          <w:tblHeader/>
+        </w:trPr>
+        <w:tc>
+          <w:tcPr>
+            <w:tcW w:type="dxa" w:w="900"/>
+            <w:tcBorders>
+              <w:top w:val="single" w:color="D6DAD3" w:sz="4"/>
+              <w:left w:val="single" w:color="D6DAD3" w:sz="4"/>
+              <w:bottom w:val="single" w:color="D6DAD3" w:sz="4"/>
+              <w:right w:val="single" w:color="D6DAD3" w:sz="4"/>
+            </w:tcBorders>
+            <w:shd w:fill="ECEEE9" w:color="auto" w:val="clear"/>
+            <w:tcMar>
+              <w:top w:type="dxa" w:w="60"/>
+              <w:left w:type="dxa" w:w="100"/>
+              <w:bottom w:type="dxa" w:w="60"/>
+              <w:right w:type="dxa" w:w="100"/>
+            </w:tcMar>
+          </w:tcPr>
+          <w:p>
+            <w:pPr>
+              <w:spacing w:after="0" w:line="252"/>
+            </w:pPr>
+            <w:r>
+              <w:rPr>
+                <w:rFonts w:ascii="Calibri" w:cs="Calibri" w:eastAsia="Calibri" w:hAnsi="Calibri"/>
+                <w:b/>
+                <w:bCs/>
+                <w:color w:val="4A5563"/>
+                <w:sz w:val="19"/>
+                <w:szCs w:val="19"/>
+              </w:rPr>
+              <w:t xml:space="preserve">ID</w:t>
+            </w:r>
+          </w:p>
+        </w:tc>
+        <w:tc>
+          <w:tcPr>
+            <w:tcW w:type="dxa" w:w="5900"/>
+            <w:tcBorders>
+              <w:top w:val="single" w:color="D6DAD3" w:sz="4"/>
+              <w:left w:val="single" w:color="D6DAD3" w:sz="4"/>
+              <w:bottom w:val="single" w:color="D6DAD3" w:sz="4"/>
+              <w:right w:val="single" w:color="D6DAD3" w:sz="4"/>
+            </w:tcBorders>
+            <w:shd w:fill="ECEEE9" w:color="auto" w:val="clear"/>
+            <w:tcMar>
+              <w:top w:type="dxa" w:w="60"/>
+              <w:left w:type="dxa" w:w="100"/>
+              <w:bottom w:type="dxa" w:w="60"/>
+              <w:right w:type="dxa" w:w="100"/>
+            </w:tcMar>
+          </w:tcPr>
+          <w:p>
+            <w:pPr>
+              <w:spacing w:after="0" w:line="252"/>
+            </w:pPr>
+            <w:r>
+              <w:rPr>
+                <w:rFonts w:ascii="Calibri" w:cs="Calibri" w:eastAsia="Calibri" w:hAnsi="Calibri"/>
+                <w:b/>
+                <w:bCs/>
+                <w:color w:val="4A5563"/>
+                <w:sz w:val="19"/>
+                <w:szCs w:val="19"/>
+              </w:rPr>
+              <w:t xml:space="preserve">Ticket</w:t>
+            </w:r>
+          </w:p>
+        </w:tc>
+        <w:tc>
+          <w:tcPr>
+            <w:tcW w:type="dxa" w:w="2838"/>
+            <w:tcBorders>
+              <w:top w:val="single" w:color="D6DAD3" w:sz="4"/>
+              <w:left w:val="single" w:color="D6DAD3" w:sz="4"/>
+              <w:bottom w:val="single" w:color="D6DAD3" w:sz="4"/>
+              <w:right w:val="single" w:color="D6DAD3" w:sz="4"/>
+            </w:tcBorders>
+            <w:shd w:fill="ECEEE9" w:color="auto" w:val="clear"/>
+            <w:tcMar>
+              <w:top w:type="dxa" w:w="60"/>
+              <w:left w:type="dxa" w:w="100"/>
+              <w:bottom w:type="dxa" w:w="60"/>
+              <w:right w:type="dxa" w:w="100"/>
+            </w:tcMar>
+          </w:tcPr>
+          <w:p>
+            <w:pPr>
+              <w:spacing w:after="0" w:line="252"/>
+            </w:pPr>
+            <w:r>
+              <w:rPr>
+                <w:rFonts w:ascii="Calibri" w:cs="Calibri" w:eastAsia="Calibri" w:hAnsi="Calibri"/>
+                <w:b/>
+                <w:bCs/>
+                <w:color w:val="4A5563"/>
+                <w:sz w:val="19"/>
+                <w:szCs w:val="19"/>
+              </w:rPr>
+              <w:t xml:space="preserve">Done when</w:t>
+            </w:r>
+          </w:p>
+        </w:tc>
+      </w:tr>
+      <w:tr>
+        <w:trPr>
+          <w:cantSplit/>
+        </w:trPr>
+        <w:tc>
+          <w:tcPr>
+            <w:tcW w:type="dxa" w:w="900"/>
+            <w:tcBorders>
+              <w:top w:val="single" w:color="D6DAD3" w:sz="4"/>
+              <w:left w:val="single" w:color="D6DAD3" w:sz="4"/>
+              <w:bottom w:val="single" w:color="D6DAD3" w:sz="4"/>
+              <w:right w:val="single" w:color="D6DAD3" w:sz="4"/>
+            </w:tcBorders>
+            <w:tcMar>
+              <w:top w:type="dxa" w:w="60"/>
+              <w:left w:type="dxa" w:w="100"/>
+              <w:bottom w:type="dxa" w:w="60"/>
+              <w:right w:type="dxa" w:w="100"/>
+            </w:tcMar>
+          </w:tcPr>
+          <w:p>
+            <w:pPr>
+              <w:spacing w:after="0" w:line="252"/>
+            </w:pPr>
+            <w:r>
+              <w:rPr>
+                <w:rFonts w:ascii="Consolas" w:cs="Consolas" w:eastAsia="Consolas" w:hAnsi="Consolas"/>
+                <w:color w:val="1B2430"/>
+                <w:sz w:val="19"/>
+                <w:szCs w:val="19"/>
+              </w:rPr>
+              <w:t xml:space="preserve">DB-090</w:t>
+            </w:r>
+          </w:p>
+        </w:tc>
+        <w:tc>
+          <w:tcPr>
+            <w:tcW w:type="dxa" w:w="5900"/>
+            <w:tcBorders>
+              <w:top w:val="single" w:color="D6DAD3" w:sz="4"/>
+              <w:left w:val="single" w:color="D6DAD3" w:sz="4"/>
+              <w:bottom w:val="single" w:color="D6DAD3" w:sz="4"/>
+              <w:right w:val="single" w:color="D6DAD3" w:sz="4"/>
+            </w:tcBorders>
+            <w:tcMar>
+              <w:top w:type="dxa" w:w="60"/>
+              <w:left w:type="dxa" w:w="100"/>
+              <w:bottom w:type="dxa" w:w="60"/>
+              <w:right w:type="dxa" w:w="100"/>
+            </w:tcMar>
+          </w:tcPr>
+          <w:p>
+            <w:pPr>
+              <w:spacing w:after="0" w:line="252"/>
+            </w:pPr>
+            <w:r>
+              <w:rPr>
+                <w:rFonts w:ascii="Calibri" w:cs="Calibri" w:eastAsia="Calibri" w:hAnsi="Calibri"/>
+                <w:color w:val="1B2430"/>
+                <w:sz w:val="22"/>
+                <w:szCs w:val="22"/>
+              </w:rPr>
+              <w:t xml:space="preserve">Agree the contract with the LeapHQ developer: what the portal reads (a customer's fleet, production, issues, contacts) and what it writes (issues raised by customers, attachments)</w:t>
+            </w:r>
+          </w:p>
+        </w:tc>
+        <w:tc>
+          <w:tcPr>
+            <w:tcW w:type="dxa" w:w="2838"/>
+            <w:tcBorders>
+              <w:top w:val="single" w:color="D6DAD3" w:sz="4"/>
+              <w:left w:val="single" w:color="D6DAD3" w:sz="4"/>
+              <w:bottom w:val="single" w:color="D6DAD3" w:sz="4"/>
+              <w:right w:val="single" w:color="D6DAD3" w:sz="4"/>
+            </w:tcBorders>
+            <w:tcMar>
+              <w:top w:type="dxa" w:w="60"/>
+              <w:left w:type="dxa" w:w="100"/>
+              <w:bottom w:type="dxa" w:w="60"/>
+              <w:right w:type="dxa" w:w="100"/>
+            </w:tcMar>
+          </w:tcPr>
+          <w:p>
+            <w:pPr>
+              <w:spacing w:after="0" w:line="252"/>
+            </w:pPr>
+            <w:r>
+              <w:rPr>
+                <w:rFonts w:ascii="Calibri" w:cs="Calibri" w:eastAsia="Calibri" w:hAnsi="Calibri"/>
+                <w:color w:val="4A5563"/>
+                <w:sz w:val="19"/>
+                <w:szCs w:val="19"/>
+              </w:rPr>
+              <w:t xml:space="preserve">One-page interface note agreed by both sides</w:t>
+            </w:r>
+          </w:p>
+        </w:tc>
+      </w:tr>
+      <w:tr>
+        <w:trPr>
+          <w:cantSplit/>
+        </w:trPr>
+        <w:tc>
+          <w:tcPr>
+            <w:tcW w:type="dxa" w:w="900"/>
+            <w:tcBorders>
+              <w:top w:val="single" w:color="D6DAD3" w:sz="4"/>
+              <w:left w:val="single" w:color="D6DAD3" w:sz="4"/>
+              <w:bottom w:val="single" w:color="D6DAD3" w:sz="4"/>
+              <w:right w:val="single" w:color="D6DAD3" w:sz="4"/>
+            </w:tcBorders>
+            <w:tcMar>
+              <w:top w:type="dxa" w:w="60"/>
+              <w:left w:type="dxa" w:w="100"/>
+              <w:bottom w:type="dxa" w:w="60"/>
+              <w:right w:type="dxa" w:w="100"/>
+            </w:tcMar>
+          </w:tcPr>
+          <w:p>
+            <w:pPr>
+              <w:spacing w:after="0" w:line="252"/>
+            </w:pPr>
+            <w:r>
+              <w:rPr>
+                <w:rFonts w:ascii="Consolas" w:cs="Consolas" w:eastAsia="Consolas" w:hAnsi="Consolas"/>
+                <w:color w:val="1B2430"/>
+                <w:sz w:val="19"/>
+                <w:szCs w:val="19"/>
+              </w:rPr>
+              <w:t xml:space="preserve">DB-091</w:t>
+            </w:r>
+          </w:p>
+        </w:tc>
+        <w:tc>
+          <w:tcPr>
+            <w:tcW w:type="dxa" w:w="5900"/>
+            <w:tcBorders>
+              <w:top w:val="single" w:color="D6DAD3" w:sz="4"/>
+              <w:left w:val="single" w:color="D6DAD3" w:sz="4"/>
+              <w:bottom w:val="single" w:color="D6DAD3" w:sz="4"/>
+              <w:right w:val="single" w:color="D6DAD3" w:sz="4"/>
+            </w:tcBorders>
+            <w:tcMar>
+              <w:top w:type="dxa" w:w="60"/>
+              <w:left w:type="dxa" w:w="100"/>
+              <w:bottom w:type="dxa" w:w="60"/>
+              <w:right w:type="dxa" w:w="100"/>
+            </w:tcMar>
+          </w:tcPr>
+          <w:p>
+            <w:pPr>
+              <w:spacing w:after="0" w:line="252"/>
+            </w:pPr>
+            <w:r>
+              <w:rPr>
+                <w:rFonts w:ascii="Calibri" w:cs="Calibri" w:eastAsia="Calibri" w:hAnsi="Calibri"/>
+                <w:color w:val="1B2430"/>
+                <w:sz w:val="22"/>
+                <w:szCs w:val="22"/>
+              </w:rPr>
+              <w:t xml:space="preserve">Customer-scoped access: a portal role plus PostgreSQL row-level security so a customer session sees only its own sites, systems, production and issues</w:t>
+            </w:r>
+          </w:p>
+        </w:tc>
+        <w:tc>
+          <w:tcPr>
+            <w:tcW w:type="dxa" w:w="2838"/>
+            <w:tcBorders>
+              <w:top w:val="single" w:color="D6DAD3" w:sz="4"/>
+              <w:left w:val="single" w:color="D6DAD3" w:sz="4"/>
+              <w:bottom w:val="single" w:color="D6DAD3" w:sz="4"/>
+              <w:right w:val="single" w:color="D6DAD3" w:sz="4"/>
+            </w:tcBorders>
+            <w:tcMar>
+              <w:top w:type="dxa" w:w="60"/>
+              <w:left w:type="dxa" w:w="100"/>
+              <w:bottom w:type="dxa" w:w="60"/>
+              <w:right w:type="dxa" w:w="100"/>
+            </w:tcMar>
+          </w:tcPr>
+          <w:p>
+            <w:pPr>
+              <w:spacing w:after="0" w:line="252"/>
+            </w:pPr>
+            <w:r>
+              <w:rPr>
+                <w:rFonts w:ascii="Calibri" w:cs="Calibri" w:eastAsia="Calibri" w:hAnsi="Calibri"/>
+                <w:color w:val="4A5563"/>
+                <w:sz w:val="19"/>
+                <w:szCs w:val="19"/>
+              </w:rPr>
+              <w:t xml:space="preserve">A test customer cannot read another customer's rows, proven by a query</w:t>
+            </w:r>
+          </w:p>
+        </w:tc>
+      </w:tr>
+      <w:tr>
+        <w:trPr>
+          <w:cantSplit/>
+        </w:trPr>
+        <w:tc>
+          <w:tcPr>
+            <w:tcW w:type="dxa" w:w="900"/>
+            <w:tcBorders>
+              <w:top w:val="single" w:color="D6DAD3" w:sz="4"/>
+              <w:left w:val="single" w:color="D6DAD3" w:sz="4"/>
+              <w:bottom w:val="single" w:color="D6DAD3" w:sz="4"/>
+              <w:right w:val="single" w:color="D6DAD3" w:sz="4"/>
+            </w:tcBorders>
+            <w:tcMar>
+              <w:top w:type="dxa" w:w="60"/>
+              <w:left w:type="dxa" w:w="100"/>
+              <w:bottom w:type="dxa" w:w="60"/>
+              <w:right w:type="dxa" w:w="100"/>
+            </w:tcMar>
+          </w:tcPr>
+          <w:p>
+            <w:pPr>
+              <w:spacing w:after="0" w:line="252"/>
+            </w:pPr>
+            <w:r>
+              <w:rPr>
+                <w:rFonts w:ascii="Consolas" w:cs="Consolas" w:eastAsia="Consolas" w:hAnsi="Consolas"/>
+                <w:color w:val="1B2430"/>
+                <w:sz w:val="19"/>
+                <w:szCs w:val="19"/>
+              </w:rPr>
+              <w:t xml:space="preserve">DB-092</w:t>
+            </w:r>
+          </w:p>
+        </w:tc>
+        <w:tc>
+          <w:tcPr>
+            <w:tcW w:type="dxa" w:w="5900"/>
+            <w:tcBorders>
+              <w:top w:val="single" w:color="D6DAD3" w:sz="4"/>
+              <w:left w:val="single" w:color="D6DAD3" w:sz="4"/>
+              <w:bottom w:val="single" w:color="D6DAD3" w:sz="4"/>
+              <w:right w:val="single" w:color="D6DAD3" w:sz="4"/>
+            </w:tcBorders>
+            <w:tcMar>
+              <w:top w:type="dxa" w:w="60"/>
+              <w:left w:type="dxa" w:w="100"/>
+              <w:bottom w:type="dxa" w:w="60"/>
+              <w:right w:type="dxa" w:w="100"/>
+            </w:tcMar>
+          </w:tcPr>
+          <w:p>
+            <w:pPr>
+              <w:spacing w:after="0" w:line="252"/>
+            </w:pPr>
+            <w:r>
+              <w:rPr>
+                <w:rFonts w:ascii="Calibri" w:cs="Calibri" w:eastAsia="Calibri" w:hAnsi="Calibri"/>
+                <w:color w:val="1B2430"/>
+                <w:sz w:val="22"/>
+                <w:szCs w:val="22"/>
+              </w:rPr>
+              <w:t xml:space="preserve">Customer-facing views: v_customer_fleet, v_customer_production_day, v_customer_issues, with internal notes and root-cause internals removed</w:t>
+            </w:r>
+          </w:p>
+        </w:tc>
+        <w:tc>
+          <w:tcPr>
+            <w:tcW w:type="dxa" w:w="2838"/>
+            <w:tcBorders>
+              <w:top w:val="single" w:color="D6DAD3" w:sz="4"/>
+              <w:left w:val="single" w:color="D6DAD3" w:sz="4"/>
+              <w:bottom w:val="single" w:color="D6DAD3" w:sz="4"/>
+              <w:right w:val="single" w:color="D6DAD3" w:sz="4"/>
+            </w:tcBorders>
+            <w:tcMar>
+              <w:top w:type="dxa" w:w="60"/>
+              <w:left w:type="dxa" w:w="100"/>
+              <w:bottom w:type="dxa" w:w="60"/>
+              <w:right w:type="dxa" w:w="100"/>
+            </w:tcMar>
+          </w:tcPr>
+          <w:p>
+            <w:pPr>
+              <w:spacing w:after="0" w:line="252"/>
+            </w:pPr>
+            <w:r>
+              <w:rPr>
+                <w:rFonts w:ascii="Calibri" w:cs="Calibri" w:eastAsia="Calibri" w:hAnsi="Calibri"/>
+                <w:color w:val="4A5563"/>
+                <w:sz w:val="19"/>
+                <w:szCs w:val="19"/>
+              </w:rPr>
+              <w:t xml:space="preserve">Views return only the agreed columns</w:t>
+            </w:r>
+          </w:p>
+        </w:tc>
+      </w:tr>
+      <w:tr>
+        <w:trPr>
+          <w:cantSplit/>
+        </w:trPr>
+        <w:tc>
+          <w:tcPr>
+            <w:tcW w:type="dxa" w:w="900"/>
+            <w:tcBorders>
+              <w:top w:val="single" w:color="D6DAD3" w:sz="4"/>
+              <w:left w:val="single" w:color="D6DAD3" w:sz="4"/>
+              <w:bottom w:val="single" w:color="D6DAD3" w:sz="4"/>
+              <w:right w:val="single" w:color="D6DAD3" w:sz="4"/>
+            </w:tcBorders>
+            <w:tcMar>
+              <w:top w:type="dxa" w:w="60"/>
+              <w:left w:type="dxa" w:w="100"/>
+              <w:bottom w:type="dxa" w:w="60"/>
+              <w:right w:type="dxa" w:w="100"/>
+            </w:tcMar>
+          </w:tcPr>
+          <w:p>
+            <w:pPr>
+              <w:spacing w:after="0" w:line="252"/>
+            </w:pPr>
+            <w:r>
+              <w:rPr>
+                <w:rFonts w:ascii="Consolas" w:cs="Consolas" w:eastAsia="Consolas" w:hAnsi="Consolas"/>
+                <w:color w:val="1B2430"/>
+                <w:sz w:val="19"/>
+                <w:szCs w:val="19"/>
+              </w:rPr>
+              <w:t xml:space="preserve">DB-093</w:t>
+            </w:r>
+          </w:p>
+        </w:tc>
+        <w:tc>
+          <w:tcPr>
+            <w:tcW w:type="dxa" w:w="5900"/>
+            <w:tcBorders>
+              <w:top w:val="single" w:color="D6DAD3" w:sz="4"/>
+              <w:left w:val="single" w:color="D6DAD3" w:sz="4"/>
+              <w:bottom w:val="single" w:color="D6DAD3" w:sz="4"/>
+              <w:right w:val="single" w:color="D6DAD3" w:sz="4"/>
+            </w:tcBorders>
+            <w:tcMar>
+              <w:top w:type="dxa" w:w="60"/>
+              <w:left w:type="dxa" w:w="100"/>
+              <w:bottom w:type="dxa" w:w="60"/>
+              <w:right w:type="dxa" w:w="100"/>
+            </w:tcMar>
+          </w:tcPr>
+          <w:p>
+            <w:pPr>
+              <w:spacing w:after="0" w:line="252"/>
+            </w:pPr>
+            <w:r>
+              <w:rPr>
+                <w:rFonts w:ascii="Calibri" w:cs="Calibri" w:eastAsia="Calibri" w:hAnsi="Calibri"/>
+                <w:color w:val="1B2430"/>
+                <w:sz w:val="22"/>
+                <w:szCs w:val="22"/>
+              </w:rPr>
+              <w:t xml:space="preserve">Portal API: the JSON API from DB-046 gains a customer scope and a service identity for LeapHQ (Entra app registration, no shared secrets)</w:t>
+            </w:r>
+          </w:p>
+        </w:tc>
+        <w:tc>
+          <w:tcPr>
+            <w:tcW w:type="dxa" w:w="2838"/>
+            <w:tcBorders>
+              <w:top w:val="single" w:color="D6DAD3" w:sz="4"/>
+              <w:left w:val="single" w:color="D6DAD3" w:sz="4"/>
+              <w:bottom w:val="single" w:color="D6DAD3" w:sz="4"/>
+              <w:right w:val="single" w:color="D6DAD3" w:sz="4"/>
+            </w:tcBorders>
+            <w:tcMar>
+              <w:top w:type="dxa" w:w="60"/>
+              <w:left w:type="dxa" w:w="100"/>
+              <w:bottom w:type="dxa" w:w="60"/>
+              <w:right w:type="dxa" w:w="100"/>
+            </w:tcMar>
+          </w:tcPr>
+          <w:p>
+            <w:pPr>
+              <w:spacing w:after="0" w:line="252"/>
+            </w:pPr>
+            <w:r>
+              <w:rPr>
+                <w:rFonts w:ascii="Calibri" w:cs="Calibri" w:eastAsia="Calibri" w:hAnsi="Calibri"/>
+                <w:color w:val="4A5563"/>
+                <w:sz w:val="19"/>
+                <w:szCs w:val="19"/>
+              </w:rPr>
+              <w:t xml:space="preserve">LeapHQ fetches its customer's fleet with its own identity</w:t>
+            </w:r>
+          </w:p>
+        </w:tc>
+      </w:tr>
+      <w:tr>
+        <w:trPr>
+          <w:cantSplit/>
+        </w:trPr>
+        <w:tc>
+          <w:tcPr>
+            <w:tcW w:type="dxa" w:w="900"/>
+            <w:tcBorders>
+              <w:top w:val="single" w:color="D6DAD3" w:sz="4"/>
+              <w:left w:val="single" w:color="D6DAD3" w:sz="4"/>
+              <w:bottom w:val="single" w:color="D6DAD3" w:sz="4"/>
+              <w:right w:val="single" w:color="D6DAD3" w:sz="4"/>
+            </w:tcBorders>
+            <w:tcMar>
+              <w:top w:type="dxa" w:w="60"/>
+              <w:left w:type="dxa" w:w="100"/>
+              <w:bottom w:type="dxa" w:w="60"/>
+              <w:right w:type="dxa" w:w="100"/>
+            </w:tcMar>
+          </w:tcPr>
+          <w:p>
+            <w:pPr>
+              <w:spacing w:after="0" w:line="252"/>
+            </w:pPr>
+            <w:r>
+              <w:rPr>
+                <w:rFonts w:ascii="Consolas" w:cs="Consolas" w:eastAsia="Consolas" w:hAnsi="Consolas"/>
+                <w:color w:val="1B2430"/>
+                <w:sz w:val="19"/>
+                <w:szCs w:val="19"/>
+              </w:rPr>
+              <w:t xml:space="preserve">DB-094</w:t>
+            </w:r>
+          </w:p>
+        </w:tc>
+        <w:tc>
+          <w:tcPr>
+            <w:tcW w:type="dxa" w:w="5900"/>
+            <w:tcBorders>
+              <w:top w:val="single" w:color="D6DAD3" w:sz="4"/>
+              <w:left w:val="single" w:color="D6DAD3" w:sz="4"/>
+              <w:bottom w:val="single" w:color="D6DAD3" w:sz="4"/>
+              <w:right w:val="single" w:color="D6DAD3" w:sz="4"/>
+            </w:tcBorders>
+            <w:tcMar>
+              <w:top w:type="dxa" w:w="60"/>
+              <w:left w:type="dxa" w:w="100"/>
+              <w:bottom w:type="dxa" w:w="60"/>
+              <w:right w:type="dxa" w:w="100"/>
+            </w:tcMar>
+          </w:tcPr>
+          <w:p>
+            <w:pPr>
+              <w:spacing w:after="0" w:line="252"/>
+            </w:pPr>
+            <w:r>
+              <w:rPr>
+                <w:rFonts w:ascii="Calibri" w:cs="Calibri" w:eastAsia="Calibri" w:hAnsi="Calibri"/>
+                <w:color w:val="1B2430"/>
+                <w:sz w:val="22"/>
+                <w:szCs w:val="22"/>
+              </w:rPr>
+              <w:t xml:space="preserve">Issues raised from the portal: reported_by set to the customer contact, photos to Blob, severity limited to the customer's choices, ISS reference returned</w:t>
+            </w:r>
+          </w:p>
+        </w:tc>
+        <w:tc>
+          <w:tcPr>
+            <w:tcW w:type="dxa" w:w="2838"/>
+            <w:tcBorders>
+              <w:top w:val="single" w:color="D6DAD3" w:sz="4"/>
+              <w:left w:val="single" w:color="D6DAD3" w:sz="4"/>
+              <w:bottom w:val="single" w:color="D6DAD3" w:sz="4"/>
+              <w:right w:val="single" w:color="D6DAD3" w:sz="4"/>
+            </w:tcBorders>
+            <w:tcMar>
+              <w:top w:type="dxa" w:w="60"/>
+              <w:left w:type="dxa" w:w="100"/>
+              <w:bottom w:type="dxa" w:w="60"/>
+              <w:right w:type="dxa" w:w="100"/>
+            </w:tcMar>
+          </w:tcPr>
+          <w:p>
+            <w:pPr>
+              <w:spacing w:after="0" w:line="252"/>
+            </w:pPr>
+            <w:r>
+              <w:rPr>
+                <w:rFonts w:ascii="Calibri" w:cs="Calibri" w:eastAsia="Calibri" w:hAnsi="Calibri"/>
+                <w:color w:val="4A5563"/>
+                <w:sz w:val="19"/>
+                <w:szCs w:val="19"/>
+              </w:rPr>
+              <w:t xml:space="preserve">An issue raised in LeapHQ appears in the entry app within a minute</w:t>
+            </w:r>
+          </w:p>
+        </w:tc>
+      </w:tr>
+      <w:tr>
+        <w:trPr>
+          <w:cantSplit/>
+        </w:trPr>
+        <w:tc>
+          <w:tcPr>
+            <w:tcW w:type="dxa" w:w="900"/>
+            <w:tcBorders>
+              <w:top w:val="single" w:color="D6DAD3" w:sz="4"/>
+              <w:left w:val="single" w:color="D6DAD3" w:sz="4"/>
+              <w:bottom w:val="single" w:color="D6DAD3" w:sz="4"/>
+              <w:right w:val="single" w:color="D6DAD3" w:sz="4"/>
+            </w:tcBorders>
+            <w:tcMar>
+              <w:top w:type="dxa" w:w="60"/>
+              <w:left w:type="dxa" w:w="100"/>
+              <w:bottom w:type="dxa" w:w="60"/>
+              <w:right w:type="dxa" w:w="100"/>
+            </w:tcMar>
+          </w:tcPr>
+          <w:p>
+            <w:pPr>
+              <w:spacing w:after="0" w:line="252"/>
+            </w:pPr>
+            <w:r>
+              <w:rPr>
+                <w:rFonts w:ascii="Consolas" w:cs="Consolas" w:eastAsia="Consolas" w:hAnsi="Consolas"/>
+                <w:color w:val="1B2430"/>
+                <w:sz w:val="19"/>
+                <w:szCs w:val="19"/>
+              </w:rPr>
+              <w:t xml:space="preserve">DB-095</w:t>
+            </w:r>
+          </w:p>
+        </w:tc>
+        <w:tc>
+          <w:tcPr>
+            <w:tcW w:type="dxa" w:w="5900"/>
+            <w:tcBorders>
+              <w:top w:val="single" w:color="D6DAD3" w:sz="4"/>
+              <w:left w:val="single" w:color="D6DAD3" w:sz="4"/>
+              <w:bottom w:val="single" w:color="D6DAD3" w:sz="4"/>
+              <w:right w:val="single" w:color="D6DAD3" w:sz="4"/>
+            </w:tcBorders>
+            <w:tcMar>
+              <w:top w:type="dxa" w:w="60"/>
+              <w:left w:type="dxa" w:w="100"/>
+              <w:bottom w:type="dxa" w:w="60"/>
+              <w:right w:type="dxa" w:w="100"/>
+            </w:tcMar>
+          </w:tcPr>
+          <w:p>
+            <w:pPr>
+              <w:spacing w:after="0" w:line="252"/>
+            </w:pPr>
+            <w:r>
+              <w:rPr>
+                <w:rFonts w:ascii="Calibri" w:cs="Calibri" w:eastAsia="Calibri" w:hAnsi="Calibri"/>
+                <w:color w:val="1B2430"/>
+                <w:sz w:val="22"/>
+                <w:szCs w:val="22"/>
+              </w:rPr>
+              <w:t xml:space="preserve">One naming and one reference scheme: LeapHQ shows display names, serials and ISS / MNT references straight from the database, and links to Elastic and CCTV windows the same way the Logfather does</w:t>
+            </w:r>
+          </w:p>
+        </w:tc>
+        <w:tc>
+          <w:tcPr>
+            <w:tcW w:type="dxa" w:w="2838"/>
+            <w:tcBorders>
+              <w:top w:val="single" w:color="D6DAD3" w:sz="4"/>
+              <w:left w:val="single" w:color="D6DAD3" w:sz="4"/>
+              <w:bottom w:val="single" w:color="D6DAD3" w:sz="4"/>
+              <w:right w:val="single" w:color="D6DAD3" w:sz="4"/>
+            </w:tcBorders>
+            <w:tcMar>
+              <w:top w:type="dxa" w:w="60"/>
+              <w:left w:type="dxa" w:w="100"/>
+              <w:bottom w:type="dxa" w:w="60"/>
+              <w:right w:type="dxa" w:w="100"/>
+            </w:tcMar>
+          </w:tcPr>
+          <w:p>
+            <w:pPr>
+              <w:spacing w:after="0" w:line="252"/>
+            </w:pPr>
+            <w:r>
+              <w:rPr>
+                <w:rFonts w:ascii="Calibri" w:cs="Calibri" w:eastAsia="Calibri" w:hAnsi="Calibri"/>
+                <w:color w:val="4A5563"/>
+                <w:sz w:val="19"/>
+                <w:szCs w:val="19"/>
+              </w:rPr>
+              <w:t xml:space="preserve">The same issue reads identically in both apps</w:t>
+            </w:r>
+          </w:p>
+        </w:tc>
+      </w:tr>
+      <w:tr>
+        <w:trPr>
+          <w:cantSplit/>
+        </w:trPr>
+        <w:tc>
+          <w:tcPr>
+            <w:tcW w:type="dxa" w:w="900"/>
+            <w:tcBorders>
+              <w:top w:val="single" w:color="D6DAD3" w:sz="4"/>
+              <w:left w:val="single" w:color="D6DAD3" w:sz="4"/>
+              <w:bottom w:val="single" w:color="D6DAD3" w:sz="4"/>
+              <w:right w:val="single" w:color="D6DAD3" w:sz="4"/>
+            </w:tcBorders>
+            <w:tcMar>
+              <w:top w:type="dxa" w:w="60"/>
+              <w:left w:type="dxa" w:w="100"/>
+              <w:bottom w:type="dxa" w:w="60"/>
+              <w:right w:type="dxa" w:w="100"/>
+            </w:tcMar>
+          </w:tcPr>
+          <w:p>
+            <w:pPr>
+              <w:spacing w:after="0" w:line="252"/>
+            </w:pPr>
+            <w:r>
+              <w:rPr>
+                <w:rFonts w:ascii="Consolas" w:cs="Consolas" w:eastAsia="Consolas" w:hAnsi="Consolas"/>
+                <w:color w:val="1B2430"/>
+                <w:sz w:val="19"/>
+                <w:szCs w:val="19"/>
+              </w:rPr>
+              <w:t xml:space="preserve">DB-096</w:t>
+            </w:r>
+          </w:p>
+        </w:tc>
+        <w:tc>
+          <w:tcPr>
+            <w:tcW w:type="dxa" w:w="5900"/>
+            <w:tcBorders>
+              <w:top w:val="single" w:color="D6DAD3" w:sz="4"/>
+              <w:left w:val="single" w:color="D6DAD3" w:sz="4"/>
+              <w:bottom w:val="single" w:color="D6DAD3" w:sz="4"/>
+              <w:right w:val="single" w:color="D6DAD3" w:sz="4"/>
+            </w:tcBorders>
+            <w:tcMar>
+              <w:top w:type="dxa" w:w="60"/>
+              <w:left w:type="dxa" w:w="100"/>
+              <w:bottom w:type="dxa" w:w="60"/>
+              <w:right w:type="dxa" w:w="100"/>
+            </w:tcMar>
+          </w:tcPr>
+          <w:p>
+            <w:pPr>
+              <w:spacing w:after="0" w:line="252"/>
+            </w:pPr>
+            <w:r>
+              <w:rPr>
+                <w:rFonts w:ascii="Calibri" w:cs="Calibri" w:eastAsia="Calibri" w:hAnsi="Calibri"/>
+                <w:color w:val="1B2430"/>
+                <w:sz w:val="22"/>
+                <w:szCs w:val="22"/>
+              </w:rPr>
+              <w:t xml:space="preserve">Shared dev environment: the dev database seeded with a demo customer, sites, systems and a month of production for the LeapHQ developer to build against</w:t>
+            </w:r>
+          </w:p>
+        </w:tc>
+        <w:tc>
+          <w:tcPr>
+            <w:tcW w:type="dxa" w:w="2838"/>
+            <w:tcBorders>
+              <w:top w:val="single" w:color="D6DAD3" w:sz="4"/>
+              <w:left w:val="single" w:color="D6DAD3" w:sz="4"/>
+              <w:bottom w:val="single" w:color="D6DAD3" w:sz="4"/>
+              <w:right w:val="single" w:color="D6DAD3" w:sz="4"/>
+            </w:tcBorders>
+            <w:tcMar>
+              <w:top w:type="dxa" w:w="60"/>
+              <w:left w:type="dxa" w:w="100"/>
+              <w:bottom w:type="dxa" w:w="60"/>
+              <w:right w:type="dxa" w:w="100"/>
+            </w:tcMar>
+          </w:tcPr>
+          <w:p>
+            <w:pPr>
+              <w:spacing w:after="0" w:line="252"/>
+            </w:pPr>
+            <w:r>
+              <w:rPr>
+                <w:rFonts w:ascii="Calibri" w:cs="Calibri" w:eastAsia="Calibri" w:hAnsi="Calibri"/>
+                <w:color w:val="4A5563"/>
+                <w:sz w:val="19"/>
+                <w:szCs w:val="19"/>
+              </w:rPr>
+              <w:t xml:space="preserve">Seed script runs clean on a fresh dev database</w:t>
             </w:r>
           </w:p>
         </w:tc>

</xml_diff>

<commit_message>
Fleet database plan: Data block diagram (SQL, Grafana time series, Elastic, camera footage); near-term and suggested long-term engine
Co-Authored-By: Claude Fable 5.1 <noreply@anthropic.com>
</commit_message>
<xml_diff>
--- a/docs/database/PikPak Fleet Database Plan.docx
+++ b/docs/database/PikPak Fleet Database Plan.docx
@@ -357,7 +357,7 @@
       <w:r>
         <w:drawing>
           <wp:inline distT="0" distB="0" distL="0" distR="0">
-            <wp:extent cx="5905500" cy="2657475"/>
+            <wp:extent cx="5905500" cy="2867025"/>
             <wp:effectExtent t="0" r="0" b="0" l="0"/>
             <wp:docPr id="1" name="" descr="" title=""/>
             <wp:cNvGraphicFramePr>
@@ -382,7 +382,7 @@
                   <pic:spPr bwMode="auto">
                     <a:xfrm>
                       <a:off x="0" y="0"/>
-                      <a:ext cx="5905500" cy="2657475"/>
+                      <a:ext cx="5905500" cy="2867025"/>
                     </a:xfrm>
                     <a:prstGeom prst="rect">
                       <a:avLst/>
@@ -523,7 +523,23 @@
                 <w:sz w:val="22"/>
                 <w:szCs w:val="22"/>
               </w:rPr>
-              <w:t xml:space="preserve">Suggested: Azure Database for PostgreSQL Flexible Server, with the TimescaleDB extension, one database for everything.</w:t>
+              <w:t xml:space="preserve">Near term: Azure Database for PostgreSQL for the records; Grafana keeps the time series it holds today.</w:t>
+            </w:r>
+          </w:p>
+          <w:p>
+            <w:pPr>
+              <w:spacing w:after="80" w:line="264"/>
+            </w:pPr>
+            <w:r>
+              <w:rPr>
+                <w:rFonts w:ascii="Calibri" w:cs="Calibri" w:eastAsia="Calibri" w:hAnsi="Calibri"/>
+                <w:b/>
+                <w:bCs/>
+                <w:color w:val="1B2430"/>
+                <w:sz w:val="22"/>
+                <w:szCs w:val="22"/>
+              </w:rPr>
+              <w:t xml:space="preserve">Suggested long-term: Azure Database for PostgreSQL Flexible Server, with the TimescaleDB extension, one database for everything.</w:t>
             </w:r>
           </w:p>
           <w:p>

</xml_diff>

<commit_message>
Fleet database plan: areas diagram without its caption; layout sentence removed
Co-Authored-By: Claude Fable 5.1 <noreply@anthropic.com>
</commit_message>
<xml_diff>
--- a/docs/database/PikPak Fleet Database Plan.docx
+++ b/docs/database/PikPak Fleet Database Plan.docx
@@ -612,27 +612,13 @@
     </w:p>
     <w:p>
       <w:pPr>
-        <w:spacing w:after="120" w:line="276"/>
-      </w:pPr>
-      <w:r>
-        <w:rPr>
-          <w:rFonts w:ascii="Calibri" w:cs="Calibri" w:eastAsia="Calibri" w:hAnsi="Calibri"/>
-          <w:color w:val="1B2430"/>
-          <w:sz w:val="22"/>
-          <w:szCs w:val="22"/>
-        </w:rPr>
-        <w:t xml:space="preserve">The fleet's system table is the hub in the middle of the top row; everything that hangs off it fans in from the bottom row, and customers sit top-left above the products they own, so no arrow crosses another.</w:t>
-      </w:r>
-    </w:p>
-    <w:p>
-      <w:pPr>
         <w:spacing w:after="120" w:before="120"/>
         <w:jc w:val="center"/>
       </w:pPr>
       <w:r>
         <w:drawing>
           <wp:inline distT="0" distB="0" distL="0" distR="0">
-            <wp:extent cx="6096000" cy="2809875"/>
+            <wp:extent cx="6096000" cy="2638425"/>
             <wp:effectExtent t="0" r="0" b="0" l="0"/>
             <wp:docPr id="1" name="" descr="" title=""/>
             <wp:cNvGraphicFramePr>
@@ -657,7 +643,7 @@
                   <pic:spPr bwMode="auto">
                     <a:xfrm>
                       <a:off x="0" y="0"/>
-                      <a:ext cx="6096000" cy="2809875"/>
+                      <a:ext cx="6096000" cy="2638425"/>
                     </a:xfrm>
                     <a:prstGeom prst="rect">
                       <a:avLst/>

</xml_diff>

<commit_message>
Fleet database plan: production intro sentence removed
Co-Authored-By: Claude Fable 5.1 <noreply@anthropic.com>
</commit_message>
<xml_diff>
--- a/docs/database/PikPak Fleet Database Plan.docx
+++ b/docs/database/PikPak Fleet Database Plan.docx
@@ -4989,21 +4989,6 @@
           <w:szCs w:val="26"/>
         </w:rPr>
         <w:t xml:space="preserve">7 · Production</w:t>
-      </w:r>
-    </w:p>
-    <w:p>
-      <w:pPr>
-        <w:keepNext/>
-        <w:spacing w:after="120" w:line="276"/>
-      </w:pPr>
-      <w:r>
-        <w:rPr>
-          <w:rFonts w:ascii="Calibri" w:cs="Calibri" w:eastAsia="Calibri" w:hAnsi="Calibri"/>
-          <w:color w:val="1B2430"/>
-          <w:sz w:val="22"/>
-          <w:szCs w:val="22"/>
-        </w:rPr>
-        <w:t xml:space="preserve">Nobody types this: the Logfather reads runs, SKUs and the pick-and-place counters from Elastic and writes them here nightly.</w:t>
       </w:r>
     </w:p>
     <w:tbl>

</xml_diff>

<commit_message>
Fleet database plan: cost appendix removed from the meeting document
Co-Authored-By: Claude Fable 5.1 <noreply@anthropic.com>
</commit_message>
<xml_diff>
--- a/docs/database/PikPak Fleet Database Plan.docx
+++ b/docs/database/PikPak Fleet Database Plan.docx
@@ -5977,546 +5977,6 @@
           <w:szCs w:val="22"/>
         </w:rPr>
         <w:t xml:space="preserve">its retention and how far back data still exists, since that decides how telemetry gets in.</w:t>
-      </w:r>
-    </w:p>
-    <w:p>
-      <w:r>
-        <w:br w:type="page"/>
-      </w:r>
-    </w:p>
-    <w:p>
-      <w:pPr>
-        <w:pStyle w:val="Heading1"/>
-        <w:keepNext/>
-        <w:spacing w:after="160" w:before="360"/>
-      </w:pPr>
-      <w:r>
-        <w:rPr>
-          <w:rFonts w:ascii="Calibri" w:cs="Calibri" w:eastAsia="Calibri" w:hAnsi="Calibri"/>
-          <w:b/>
-          <w:bCs/>
-          <w:color w:val="1B2430"/>
-          <w:sz w:val="32"/>
-          <w:szCs w:val="32"/>
-        </w:rPr>
-        <w:t xml:space="preserve">Appendix: cost</w:t>
-      </w:r>
-    </w:p>
-    <w:tbl>
-      <w:tblPr>
-        <w:tblW w:type="dxa" w:w="9638"/>
-        <w:tblBorders>
-          <w:top w:val="single" w:color="auto" w:sz="4"/>
-          <w:left w:val="single" w:color="auto" w:sz="4"/>
-          <w:bottom w:val="single" w:color="auto" w:sz="4"/>
-          <w:right w:val="single" w:color="auto" w:sz="4"/>
-          <w:insideH w:val="single" w:color="auto" w:sz="4"/>
-          <w:insideV w:val="single" w:color="auto" w:sz="4"/>
-        </w:tblBorders>
-      </w:tblPr>
-      <w:tblGrid>
-        <w:gridCol w:w="3200"/>
-        <w:gridCol w:w="6438"/>
-      </w:tblGrid>
-      <w:tr>
-        <w:trPr>
-          <w:tblHeader/>
-        </w:trPr>
-        <w:tc>
-          <w:tcPr>
-            <w:tcW w:type="dxa" w:w="3200"/>
-            <w:tcBorders>
-              <w:top w:val="single" w:color="D6DAD3" w:sz="4"/>
-              <w:left w:val="single" w:color="D6DAD3" w:sz="4"/>
-              <w:bottom w:val="single" w:color="D6DAD3" w:sz="4"/>
-              <w:right w:val="single" w:color="D6DAD3" w:sz="4"/>
-            </w:tcBorders>
-            <w:shd w:fill="ECEEE9" w:color="auto" w:val="clear"/>
-            <w:tcMar>
-              <w:top w:type="dxa" w:w="60"/>
-              <w:left w:type="dxa" w:w="100"/>
-              <w:bottom w:type="dxa" w:w="60"/>
-              <w:right w:type="dxa" w:w="100"/>
-            </w:tcMar>
-          </w:tcPr>
-          <w:p>
-            <w:pPr>
-              <w:spacing w:after="0" w:line="252"/>
-            </w:pPr>
-            <w:r>
-              <w:rPr>
-                <w:rFonts w:ascii="Calibri" w:cs="Calibri" w:eastAsia="Calibri" w:hAnsi="Calibri"/>
-                <w:b/>
-                <w:bCs/>
-                <w:color w:val="4A5563"/>
-                <w:sz w:val="19"/>
-                <w:szCs w:val="19"/>
-              </w:rPr>
-              <w:t xml:space="preserve">Per month</w:t>
-            </w:r>
-          </w:p>
-        </w:tc>
-        <w:tc>
-          <w:tcPr>
-            <w:tcW w:type="dxa" w:w="6438"/>
-            <w:tcBorders>
-              <w:top w:val="single" w:color="D6DAD3" w:sz="4"/>
-              <w:left w:val="single" w:color="D6DAD3" w:sz="4"/>
-              <w:bottom w:val="single" w:color="D6DAD3" w:sz="4"/>
-              <w:right w:val="single" w:color="D6DAD3" w:sz="4"/>
-            </w:tcBorders>
-            <w:shd w:fill="ECEEE9" w:color="auto" w:val="clear"/>
-            <w:tcMar>
-              <w:top w:type="dxa" w:w="60"/>
-              <w:left w:type="dxa" w:w="100"/>
-              <w:bottom w:type="dxa" w:w="60"/>
-              <w:right w:type="dxa" w:w="100"/>
-            </w:tcMar>
-          </w:tcPr>
-          <w:p>
-            <w:pPr>
-              <w:spacing w:after="0" w:line="252"/>
-            </w:pPr>
-            <w:r>
-              <w:rPr>
-                <w:rFonts w:ascii="Calibri" w:cs="Calibri" w:eastAsia="Calibri" w:hAnsi="Calibri"/>
-                <w:b/>
-                <w:bCs/>
-                <w:color w:val="4A5563"/>
-                <w:sz w:val="19"/>
-                <w:szCs w:val="19"/>
-              </w:rPr>
-              <w:t xml:space="preserve">What</w:t>
-            </w:r>
-          </w:p>
-        </w:tc>
-      </w:tr>
-      <w:tr>
-        <w:trPr>
-          <w:cantSplit/>
-        </w:trPr>
-        <w:tc>
-          <w:tcPr>
-            <w:tcW w:type="dxa" w:w="3200"/>
-            <w:tcBorders>
-              <w:top w:val="single" w:color="D6DAD3" w:sz="4"/>
-              <w:left w:val="single" w:color="D6DAD3" w:sz="4"/>
-              <w:bottom w:val="single" w:color="D6DAD3" w:sz="4"/>
-              <w:right w:val="single" w:color="D6DAD3" w:sz="4"/>
-            </w:tcBorders>
-            <w:tcMar>
-              <w:top w:type="dxa" w:w="60"/>
-              <w:left w:type="dxa" w:w="100"/>
-              <w:bottom w:type="dxa" w:w="60"/>
-              <w:right w:type="dxa" w:w="100"/>
-            </w:tcMar>
-          </w:tcPr>
-          <w:p>
-            <w:pPr>
-              <w:spacing w:after="0" w:line="252"/>
-            </w:pPr>
-            <w:r>
-              <w:rPr>
-                <w:rFonts w:ascii="Calibri" w:cs="Calibri" w:eastAsia="Calibri" w:hAnsi="Calibri"/>
-                <w:color w:val="1B2430"/>
-                <w:sz w:val="22"/>
-                <w:szCs w:val="22"/>
-              </w:rPr>
-              <w:t xml:space="preserve">£15–45</w:t>
-            </w:r>
-          </w:p>
-        </w:tc>
-        <w:tc>
-          <w:tcPr>
-            <w:tcW w:type="dxa" w:w="6438"/>
-            <w:tcBorders>
-              <w:top w:val="single" w:color="D6DAD3" w:sz="4"/>
-              <w:left w:val="single" w:color="D6DAD3" w:sz="4"/>
-              <w:bottom w:val="single" w:color="D6DAD3" w:sz="4"/>
-              <w:right w:val="single" w:color="D6DAD3" w:sz="4"/>
-            </w:tcBorders>
-            <w:tcMar>
-              <w:top w:type="dxa" w:w="60"/>
-              <w:left w:type="dxa" w:w="100"/>
-              <w:bottom w:type="dxa" w:w="60"/>
-              <w:right w:type="dxa" w:w="100"/>
-            </w:tcMar>
-          </w:tcPr>
-          <w:p>
-            <w:pPr>
-              <w:spacing w:after="0" w:line="252"/>
-            </w:pPr>
-            <w:r>
-              <w:rPr>
-                <w:rFonts w:ascii="Calibri" w:cs="Calibri" w:eastAsia="Calibri" w:hAnsi="Calibri"/>
-                <w:color w:val="1B2430"/>
-                <w:sz w:val="22"/>
-                <w:szCs w:val="22"/>
-              </w:rPr>
-              <w:t xml:space="preserve">PostgreSQL Flexible Server, Burstable tier for dev and prod, 64 GB, backups included</w:t>
-            </w:r>
-          </w:p>
-        </w:tc>
-      </w:tr>
-      <w:tr>
-        <w:trPr>
-          <w:cantSplit/>
-        </w:trPr>
-        <w:tc>
-          <w:tcPr>
-            <w:tcW w:type="dxa" w:w="3200"/>
-            <w:tcBorders>
-              <w:top w:val="single" w:color="D6DAD3" w:sz="4"/>
-              <w:left w:val="single" w:color="D6DAD3" w:sz="4"/>
-              <w:bottom w:val="single" w:color="D6DAD3" w:sz="4"/>
-              <w:right w:val="single" w:color="D6DAD3" w:sz="4"/>
-            </w:tcBorders>
-            <w:tcMar>
-              <w:top w:type="dxa" w:w="60"/>
-              <w:left w:type="dxa" w:w="100"/>
-              <w:bottom w:type="dxa" w:w="60"/>
-              <w:right w:type="dxa" w:w="100"/>
-            </w:tcMar>
-          </w:tcPr>
-          <w:p>
-            <w:pPr>
-              <w:spacing w:after="0" w:line="252"/>
-            </w:pPr>
-            <w:r>
-              <w:rPr>
-                <w:rFonts w:ascii="Calibri" w:cs="Calibri" w:eastAsia="Calibri" w:hAnsi="Calibri"/>
-                <w:color w:val="1B2430"/>
-                <w:sz w:val="22"/>
-                <w:szCs w:val="22"/>
-              </w:rPr>
-              <w:t xml:space="preserve">£12</w:t>
-            </w:r>
-          </w:p>
-        </w:tc>
-        <w:tc>
-          <w:tcPr>
-            <w:tcW w:type="dxa" w:w="6438"/>
-            <w:tcBorders>
-              <w:top w:val="single" w:color="D6DAD3" w:sz="4"/>
-              <w:left w:val="single" w:color="D6DAD3" w:sz="4"/>
-              <w:bottom w:val="single" w:color="D6DAD3" w:sz="4"/>
-              <w:right w:val="single" w:color="D6DAD3" w:sz="4"/>
-            </w:tcBorders>
-            <w:tcMar>
-              <w:top w:type="dxa" w:w="60"/>
-              <w:left w:type="dxa" w:w="100"/>
-              <w:bottom w:type="dxa" w:w="60"/>
-              <w:right w:type="dxa" w:w="100"/>
-            </w:tcMar>
-          </w:tcPr>
-          <w:p>
-            <w:pPr>
-              <w:spacing w:after="0" w:line="252"/>
-            </w:pPr>
-            <w:r>
-              <w:rPr>
-                <w:rFonts w:ascii="Calibri" w:cs="Calibri" w:eastAsia="Calibri" w:hAnsi="Calibri"/>
-                <w:color w:val="1B2430"/>
-                <w:sz w:val="22"/>
-                <w:szCs w:val="22"/>
-              </w:rPr>
-              <w:t xml:space="preserve">App Service B1 for the entry app and the sync jobs</w:t>
-            </w:r>
-          </w:p>
-        </w:tc>
-      </w:tr>
-      <w:tr>
-        <w:trPr>
-          <w:cantSplit/>
-        </w:trPr>
-        <w:tc>
-          <w:tcPr>
-            <w:tcW w:type="dxa" w:w="3200"/>
-            <w:tcBorders>
-              <w:top w:val="single" w:color="D6DAD3" w:sz="4"/>
-              <w:left w:val="single" w:color="D6DAD3" w:sz="4"/>
-              <w:bottom w:val="single" w:color="D6DAD3" w:sz="4"/>
-              <w:right w:val="single" w:color="D6DAD3" w:sz="4"/>
-            </w:tcBorders>
-            <w:tcMar>
-              <w:top w:type="dxa" w:w="60"/>
-              <w:left w:type="dxa" w:w="100"/>
-              <w:bottom w:type="dxa" w:w="60"/>
-              <w:right w:type="dxa" w:w="100"/>
-            </w:tcMar>
-          </w:tcPr>
-          <w:p>
-            <w:pPr>
-              <w:spacing w:after="0" w:line="252"/>
-            </w:pPr>
-            <w:r>
-              <w:rPr>
-                <w:rFonts w:ascii="Calibri" w:cs="Calibri" w:eastAsia="Calibri" w:hAnsi="Calibri"/>
-                <w:color w:val="1B2430"/>
-                <w:sz w:val="22"/>
-                <w:szCs w:val="22"/>
-              </w:rPr>
-              <w:t xml:space="preserve">£2–8</w:t>
-            </w:r>
-          </w:p>
-        </w:tc>
-        <w:tc>
-          <w:tcPr>
-            <w:tcW w:type="dxa" w:w="6438"/>
-            <w:tcBorders>
-              <w:top w:val="single" w:color="D6DAD3" w:sz="4"/>
-              <w:left w:val="single" w:color="D6DAD3" w:sz="4"/>
-              <w:bottom w:val="single" w:color="D6DAD3" w:sz="4"/>
-              <w:right w:val="single" w:color="D6DAD3" w:sz="4"/>
-            </w:tcBorders>
-            <w:tcMar>
-              <w:top w:type="dxa" w:w="60"/>
-              <w:left w:type="dxa" w:w="100"/>
-              <w:bottom w:type="dxa" w:w="60"/>
-              <w:right w:type="dxa" w:w="100"/>
-            </w:tcMar>
-          </w:tcPr>
-          <w:p>
-            <w:pPr>
-              <w:spacing w:after="0" w:line="252"/>
-            </w:pPr>
-            <w:r>
-              <w:rPr>
-                <w:rFonts w:ascii="Calibri" w:cs="Calibri" w:eastAsia="Calibri" w:hAnsi="Calibri"/>
-                <w:color w:val="1B2430"/>
-                <w:sz w:val="22"/>
-                <w:szCs w:val="22"/>
-              </w:rPr>
-              <w:t xml:space="preserve">Blob Storage including weekly dumps, Key Vault, Log Analytics</w:t>
-            </w:r>
-          </w:p>
-        </w:tc>
-      </w:tr>
-      <w:tr>
-        <w:trPr>
-          <w:cantSplit/>
-        </w:trPr>
-        <w:tc>
-          <w:tcPr>
-            <w:tcW w:type="dxa" w:w="3200"/>
-            <w:tcBorders>
-              <w:top w:val="single" w:color="D6DAD3" w:sz="4"/>
-              <w:left w:val="single" w:color="D6DAD3" w:sz="4"/>
-              <w:bottom w:val="single" w:color="D6DAD3" w:sz="4"/>
-              <w:right w:val="single" w:color="D6DAD3" w:sz="4"/>
-            </w:tcBorders>
-            <w:tcMar>
-              <w:top w:type="dxa" w:w="60"/>
-              <w:left w:type="dxa" w:w="100"/>
-              <w:bottom w:type="dxa" w:w="60"/>
-              <w:right w:type="dxa" w:w="100"/>
-            </w:tcMar>
-          </w:tcPr>
-          <w:p>
-            <w:pPr>
-              <w:spacing w:after="0" w:line="252"/>
-            </w:pPr>
-            <w:r>
-              <w:rPr>
-                <w:rFonts w:ascii="Calibri" w:cs="Calibri" w:eastAsia="Calibri" w:hAnsi="Calibri"/>
-                <w:color w:val="1B2430"/>
-                <w:sz w:val="22"/>
-                <w:szCs w:val="22"/>
-              </w:rPr>
-              <w:t xml:space="preserve">+£10–40</w:t>
-            </w:r>
-          </w:p>
-        </w:tc>
-        <w:tc>
-          <w:tcPr>
-            <w:tcW w:type="dxa" w:w="6438"/>
-            <w:tcBorders>
-              <w:top w:val="single" w:color="D6DAD3" w:sz="4"/>
-              <w:left w:val="single" w:color="D6DAD3" w:sz="4"/>
-              <w:bottom w:val="single" w:color="D6DAD3" w:sz="4"/>
-              <w:right w:val="single" w:color="D6DAD3" w:sz="4"/>
-            </w:tcBorders>
-            <w:tcMar>
-              <w:top w:type="dxa" w:w="60"/>
-              <w:left w:type="dxa" w:w="100"/>
-              <w:bottom w:type="dxa" w:w="60"/>
-              <w:right w:type="dxa" w:w="100"/>
-            </w:tcMar>
-          </w:tcPr>
-          <w:p>
-            <w:pPr>
-              <w:spacing w:after="0" w:line="252"/>
-            </w:pPr>
-            <w:r>
-              <w:rPr>
-                <w:rFonts w:ascii="Calibri" w:cs="Calibri" w:eastAsia="Calibri" w:hAnsi="Calibri"/>
-                <w:color w:val="1B2430"/>
-                <w:sz w:val="22"/>
-                <w:szCs w:val="22"/>
-              </w:rPr>
-              <w:t xml:space="preserve">once telemetry lands: storage growth and a step up to a General Purpose tier if ingest needs it</w:t>
-            </w:r>
-          </w:p>
-        </w:tc>
-      </w:tr>
-    </w:tbl>
-    <w:p>
-      <w:pPr>
-        <w:spacing w:after="120" w:line="276"/>
-      </w:pPr>
-      <w:r>
-        <w:rPr>
-          <w:rFonts w:ascii="Calibri" w:cs="Calibri" w:eastAsia="Calibri" w:hAnsi="Calibri"/>
-          <w:color w:val="1B2430"/>
-          <w:sz w:val="22"/>
-          <w:szCs w:val="22"/>
-        </w:rPr>
-        <w:t xml:space="preserve">Everything together stays around £100 a month, which is the budget alert. The largest cost is people, not Azure.</w:t>
-      </w:r>
-    </w:p>
-    <w:p>
-      <w:pPr>
-        <w:pStyle w:val="Heading2"/>
-        <w:keepNext/>
-        <w:spacing w:after="120" w:before="260"/>
-      </w:pPr>
-      <w:r>
-        <w:rPr>
-          <w:rFonts w:ascii="Calibri" w:cs="Calibri" w:eastAsia="Calibri" w:hAnsi="Calibri"/>
-          <w:b/>
-          <w:bCs/>
-          <w:color w:val="1F6F8B"/>
-          <w:sz w:val="26"/>
-          <w:szCs w:val="26"/>
-        </w:rPr>
-        <w:t xml:space="preserve">Order of value</w:t>
-      </w:r>
-    </w:p>
-    <w:p>
-      <w:pPr>
-        <w:spacing w:after="120" w:line="276"/>
-      </w:pPr>
-      <w:r>
-        <w:rPr>
-          <w:rFonts w:ascii="Calibri" w:cs="Calibri" w:eastAsia="Calibri" w:hAnsi="Calibri"/>
-          <w:color w:val="1B2430"/>
-          <w:sz w:val="22"/>
-          <w:szCs w:val="22"/>
-        </w:rPr>
-        <w:t xml:space="preserve">After the schema and the fleet part of the migration, the database already answers the questions the spreadsheets cannot: where each system is and was, what is fitted in it, and what it runs. Issues and the root cause catalogue are the next most valuable and the most used day to day. Production and telemetry follow, fed by jobs rather than typing.</w:t>
-      </w:r>
-    </w:p>
-    <w:p>
-      <w:pPr>
-        <w:pStyle w:val="Heading2"/>
-        <w:keepNext/>
-        <w:spacing w:after="120" w:before="260"/>
-      </w:pPr>
-      <w:r>
-        <w:rPr>
-          <w:rFonts w:ascii="Calibri" w:cs="Calibri" w:eastAsia="Calibri" w:hAnsi="Calibri"/>
-          <w:b/>
-          <w:bCs/>
-          <w:color w:val="1F6F8B"/>
-          <w:sz w:val="26"/>
-          <w:szCs w:val="26"/>
-        </w:rPr>
-        <w:t xml:space="preserve">Risks</w:t>
-      </w:r>
-    </w:p>
-    <w:p>
-      <w:pPr>
-        <w:pStyle w:val="ListParagraph"/>
-        <w:numPr>
-          <w:ilvl w:val="0"/>
-          <w:numId w:val="2"/>
-        </w:numPr>
-        <w:spacing w:after="60" w:line="264"/>
-      </w:pPr>
-      <w:r>
-        <w:rPr>
-          <w:rFonts w:ascii="Calibri" w:cs="Calibri" w:eastAsia="Calibri" w:hAnsi="Calibri"/>
-          <w:color w:val="1B2430"/>
-          <w:sz w:val="22"/>
-          <w:szCs w:val="22"/>
-        </w:rPr>
-        <w:t xml:space="preserve">Spreadsheet data that does not reconcile: the import includes a reconciliation step, and each data owner signs off their entity.</w:t>
-      </w:r>
-    </w:p>
-    <w:p>
-      <w:pPr>
-        <w:pStyle w:val="ListParagraph"/>
-        <w:numPr>
-          <w:ilvl w:val="0"/>
-          <w:numId w:val="2"/>
-        </w:numPr>
-        <w:spacing w:after="60" w:line="264"/>
-      </w:pPr>
-      <w:r>
-        <w:rPr>
-          <w:rFonts w:ascii="Calibri" w:cs="Calibri" w:eastAsia="Calibri" w:hAnsi="Calibri"/>
-          <w:color w:val="1B2430"/>
-          <w:sz w:val="22"/>
-          <w:szCs w:val="22"/>
-        </w:rPr>
-        <w:t xml:space="preserve">Two sources of truth during the parallel run: the spreadsheets are frozen read-only until cutover.</w:t>
-      </w:r>
-    </w:p>
-    <w:p>
-      <w:pPr>
-        <w:pStyle w:val="ListParagraph"/>
-        <w:numPr>
-          <w:ilvl w:val="0"/>
-          <w:numId w:val="2"/>
-        </w:numPr>
-        <w:spacing w:after="60" w:line="264"/>
-      </w:pPr>
-      <w:r>
-        <w:rPr>
-          <w:rFonts w:ascii="Calibri" w:cs="Calibri" w:eastAsia="Calibri" w:hAnsi="Calibri"/>
-          <w:color w:val="1B2430"/>
-          <w:sz w:val="22"/>
-          <w:szCs w:val="22"/>
-        </w:rPr>
-        <w:t xml:space="preserve">Microsoft group management landing with nobody: an owner is named when the roles are agreed.</w:t>
-      </w:r>
-    </w:p>
-    <w:p>
-      <w:pPr>
-        <w:pStyle w:val="ListParagraph"/>
-        <w:numPr>
-          <w:ilvl w:val="0"/>
-          <w:numId w:val="2"/>
-        </w:numPr>
-        <w:spacing w:after="60" w:line="264"/>
-      </w:pPr>
-      <w:r>
-        <w:rPr>
-          <w:rFonts w:ascii="Calibri" w:cs="Calibri" w:eastAsia="Calibri" w:hAnsi="Calibri"/>
-          <w:color w:val="1B2430"/>
-          <w:sz w:val="22"/>
-          <w:szCs w:val="22"/>
-        </w:rPr>
-        <w:t xml:space="preserve">Telemetry volume outgrowing the burstable tier: CPU is monitored, and the step up is a portal change, not a migration.</w:t>
-      </w:r>
-    </w:p>
-    <w:p>
-      <w:pPr>
-        <w:pStyle w:val="ListParagraph"/>
-        <w:numPr>
-          <w:ilvl w:val="0"/>
-          <w:numId w:val="2"/>
-        </w:numPr>
-        <w:spacing w:after="60" w:line="264"/>
-      </w:pPr>
-      <w:r>
-        <w:rPr>
-          <w:rFonts w:ascii="Calibri" w:cs="Calibri" w:eastAsia="Calibri" w:hAnsi="Calibri"/>
-          <w:color w:val="1B2430"/>
-          <w:sz w:val="22"/>
-          <w:szCs w:val="22"/>
-        </w:rPr>
-        <w:t xml:space="preserve">Building bespoke screens before the generated admin has been used for a month: resist it.</w:t>
       </w:r>
     </w:p>
     <w:sectPr>

</xml_diff>

<commit_message>
Fleet database plan: summary cut to the problem and the answer
Co-Authored-By: Claude Fable 5.1 <noreply@anthropic.com>
</commit_message>
<xml_diff>
--- a/docs/database/PikPak Fleet Database Plan.docx
+++ b/docs/database/PikPak Fleet Database Plan.docx
@@ -124,109 +124,9 @@
           <w:sz w:val="22"/>
           <w:szCs w:val="22"/>
         </w:rPr>
-        <w:t xml:space="preserve">This plan replaces them with one database in Azure. It is a PostgreSQL database, the same engine behind most modern web systems, run for us as a managed service so backups, patching and failover are Microsoft's job. A small internal web app is where people add and edit records, with Microsoft sign-in and a change history on every row. Excel, Power BI and Grafana read from it. The Logfather reads its master data from it and writes back what each system packed and which software it runs, without anyone typing.</w:t>
+        <w:t xml:space="preserve">This plan replaces them with one database in Azure. It is a PostgreSQL database, the same engine behind most modern web systems, run for us as a managed service so backups, patching and failover are Microsoft's job.</w:t>
       </w:r>
     </w:p>
-    <w:p>
-      <w:pPr>
-        <w:spacing w:after="120" w:line="276"/>
-      </w:pPr>
-      <w:r>
-        <w:rPr>
-          <w:rFonts w:ascii="Calibri" w:cs="Calibri" w:eastAsia="Calibri" w:hAnsi="Calibri"/>
-          <w:color w:val="1B2430"/>
-          <w:sz w:val="22"/>
-          <w:szCs w:val="22"/>
-        </w:rPr>
-        <w:t xml:space="preserve">The telemetry that Grafana shows today, component temperatures and motor currents, goes into the same database through the TimescaleDB extension, so a temperature excursion, the servo that was fitted at the time, and the issue it became are three tables apart, not three systems apart.</w:t>
-      </w:r>
-    </w:p>
-    <w:tbl>
-      <w:tblPr>
-        <w:tblW w:type="dxa" w:w="9638"/>
-        <w:tblBorders>
-          <w:top w:val="single" w:color="auto" w:sz="4"/>
-          <w:left w:val="single" w:color="auto" w:sz="4"/>
-          <w:bottom w:val="single" w:color="auto" w:sz="4"/>
-          <w:right w:val="single" w:color="auto" w:sz="4"/>
-          <w:insideH w:val="single" w:color="auto" w:sz="4"/>
-          <w:insideV w:val="single" w:color="auto" w:sz="4"/>
-        </w:tblBorders>
-      </w:tblPr>
-      <w:tblGrid>
-        <w:gridCol w:w="9638"/>
-      </w:tblGrid>
-      <w:tr>
-        <w:tc>
-          <w:tcPr>
-            <w:tcW w:type="dxa" w:w="9638"/>
-            <w:tcBorders>
-              <w:top w:val="nil"/>
-              <w:left w:val="single" w:color="1F6F8B" w:sz="24"/>
-              <w:bottom w:val="nil"/>
-              <w:right w:val="nil"/>
-            </w:tcBorders>
-            <w:shd w:fill="E3EFF3" w:color="auto" w:val="clear"/>
-            <w:tcMar>
-              <w:top w:type="dxa" w:w="120"/>
-              <w:left w:type="dxa" w:w="200"/>
-              <w:bottom w:type="dxa" w:w="120"/>
-              <w:right w:type="dxa" w:w="200"/>
-            </w:tcMar>
-          </w:tcPr>
-          <w:p>
-            <w:pPr>
-              <w:spacing w:after="80" w:line="264"/>
-            </w:pPr>
-            <w:r>
-              <w:rPr>
-                <w:rFonts w:ascii="Calibri" w:cs="Calibri" w:eastAsia="Calibri" w:hAnsi="Calibri"/>
-                <w:b/>
-                <w:bCs/>
-                <w:color w:val="1B2430"/>
-                <w:sz w:val="22"/>
-                <w:szCs w:val="22"/>
-              </w:rPr>
-              <w:t xml:space="preserve">What we are asking for. </w:t>
-            </w:r>
-            <w:r>
-              <w:rPr>
-                <w:rFonts w:ascii="Calibri" w:cs="Calibri" w:eastAsia="Calibri" w:hAnsi="Calibri"/>
-                <w:color w:val="1B2430"/>
-                <w:sz w:val="22"/>
-                <w:szCs w:val="22"/>
-              </w:rPr>
-              <w:t xml:space="preserve">Agreement on the eight areas and the tables in them, on the engine, and on the order of work. Azure costs are roughly £100 a month.</w:t>
-            </w:r>
-          </w:p>
-          <w:p>
-            <w:pPr>
-              <w:spacing w:after="80" w:line="264"/>
-            </w:pPr>
-            <w:r>
-              <w:rPr>
-                <w:rFonts w:ascii="Calibri" w:cs="Calibri" w:eastAsia="Calibri" w:hAnsi="Calibri"/>
-                <w:b/>
-                <w:bCs/>
-                <w:color w:val="1B2430"/>
-                <w:sz w:val="22"/>
-                <w:szCs w:val="22"/>
-              </w:rPr>
-              <w:t xml:space="preserve">What happens first. </w:t>
-            </w:r>
-            <w:r>
-              <w:rPr>
-                <w:rFonts w:ascii="Calibri" w:cs="Calibri" w:eastAsia="Calibri" w:hAnsi="Calibri"/>
-                <w:color w:val="1B2430"/>
-                <w:sz w:val="22"/>
-                <w:szCs w:val="22"/>
-              </w:rPr>
-              <w:t xml:space="preserve">A discovery pass to inventory the spreadsheets and name the data owners, then a short hands-on trial of the managed database before any real infrastructure is built.</w:t>
-            </w:r>
-          </w:p>
-        </w:tc>
-      </w:tr>
-    </w:tbl>
     <w:p>
       <w:pPr>
         <w:pStyle w:val="Heading1"/>

</xml_diff>

<commit_message>
Fleet database plan: Internal tools box with the Fleet maintenance app and Grafana dashboards
Co-Authored-By: Claude Fable 5.1 <noreply@anthropic.com>
</commit_message>
<xml_diff>
--- a/docs/database/PikPak Fleet Database Plan.docx
+++ b/docs/database/PikPak Fleet Database Plan.docx
@@ -257,7 +257,7 @@
       <w:r>
         <w:drawing>
           <wp:inline distT="0" distB="0" distL="0" distR="0">
-            <wp:extent cx="5905500" cy="2867025"/>
+            <wp:extent cx="5905500" cy="3571875"/>
             <wp:effectExtent t="0" r="0" b="0" l="0"/>
             <wp:docPr id="1" name="" descr="" title=""/>
             <wp:cNvGraphicFramePr>
@@ -282,7 +282,7 @@
                   <pic:spPr bwMode="auto">
                     <a:xfrm>
                       <a:off x="0" y="0"/>
-                      <a:ext cx="5905500" cy="2867025"/>
+                      <a:ext cx="5905500" cy="3571875"/>
                     </a:xfrm>
                     <a:prstGeom prst="rect">
                       <a:avLst/>

</xml_diff>

<commit_message>
Fleet database plan: Cloud data / Local site data / Internal tools diagram; Consumers bullet removed
Co-Authored-By: Claude Fable 5.1 <noreply@anthropic.com>
</commit_message>
<xml_diff>
--- a/docs/database/PikPak Fleet Database Plan.docx
+++ b/docs/database/PikPak Fleet Database Plan.docx
@@ -156,7 +156,7 @@
           <w:sz w:val="22"/>
           <w:szCs w:val="22"/>
         </w:rPr>
-        <w:t xml:space="preserve">Three layers, each replaceable on its own.</w:t>
+        <w:t xml:space="preserve">Two layers, each replaceable on its own.</w:t>
       </w:r>
     </w:p>
     <w:p>
@@ -221,43 +221,13 @@
     </w:p>
     <w:p>
       <w:pPr>
-        <w:pStyle w:val="ListParagraph"/>
-        <w:numPr>
-          <w:ilvl w:val="0"/>
-          <w:numId w:val="2"/>
-        </w:numPr>
-        <w:spacing w:after="60" w:line="264"/>
-      </w:pPr>
-      <w:r>
-        <w:rPr>
-          <w:rFonts w:ascii="Calibri" w:cs="Calibri" w:eastAsia="Calibri" w:hAnsi="Calibri"/>
-          <w:b/>
-          <w:bCs/>
-          <w:color w:val="1B2430"/>
-          <w:sz w:val="22"/>
-          <w:szCs w:val="22"/>
-        </w:rPr>
-        <w:t xml:space="preserve">Consumers. </w:t>
-      </w:r>
-      <w:r>
-        <w:rPr>
-          <w:rFonts w:ascii="Calibri" w:cs="Calibri" w:eastAsia="Calibri" w:hAnsi="Calibri"/>
-          <w:color w:val="1B2430"/>
-          <w:sz w:val="22"/>
-          <w:szCs w:val="22"/>
-        </w:rPr>
-        <w:t xml:space="preserve">Excel and Power BI read from views with a read-only login. Grafana reads the telemetry tables directly. The Logfather reads customers, lines, systems and SKUs from the database, writes production and software history into it, and can raise an issue from its Errors / Stops window with the system and day filled in. LeapHQ, the customer portal being built separately, uses the same database for its customer-facing views and keeps reading Elastic and the CCTV share directly, as the Logfather does.</w:t>
-      </w:r>
-    </w:p>
-    <w:p>
-      <w:pPr>
         <w:spacing w:after="120" w:before="120"/>
         <w:jc w:val="center"/>
       </w:pPr>
       <w:r>
         <w:drawing>
           <wp:inline distT="0" distB="0" distL="0" distR="0">
-            <wp:extent cx="5905500" cy="3571875"/>
+            <wp:extent cx="5905500" cy="3838575"/>
             <wp:effectExtent t="0" r="0" b="0" l="0"/>
             <wp:docPr id="1" name="" descr="" title=""/>
             <wp:cNvGraphicFramePr>
@@ -282,7 +252,7 @@
                   <pic:spPr bwMode="auto">
                     <a:xfrm>
                       <a:off x="0" y="0"/>
-                      <a:ext cx="5905500" cy="3571875"/>
+                      <a:ext cx="5905500" cy="3838575"/>
                     </a:xfrm>
                     <a:prstGeom prst="rect">
                       <a:avLst/>

</xml_diff>

<commit_message>
Fleet database plan: telemetry area and decisions section removed; seven areas
Co-Authored-By: Claude Fable 5.1 <noreply@anthropic.com>
</commit_message>
<xml_diff>
--- a/docs/database/PikPak Fleet Database Plan.docx
+++ b/docs/database/PikPak Fleet Database Plan.docx
@@ -477,7 +477,7 @@
           <w:sz w:val="32"/>
           <w:szCs w:val="32"/>
         </w:rPr>
-        <w:t xml:space="preserve">The eight areas</w:t>
+        <w:t xml:space="preserve">The seven areas</w:t>
       </w:r>
     </w:p>
     <w:p>
@@ -488,7 +488,7 @@
       <w:r>
         <w:drawing>
           <wp:inline distT="0" distB="0" distL="0" distR="0">
-            <wp:extent cx="6096000" cy="2638425"/>
+            <wp:extent cx="6096000" cy="3248025"/>
             <wp:effectExtent t="0" r="0" b="0" l="0"/>
             <wp:docPr id="1" name="" descr="" title=""/>
             <wp:cNvGraphicFramePr>
@@ -513,7 +513,7 @@
                   <pic:spPr bwMode="auto">
                     <a:xfrm>
                       <a:off x="0" y="0"/>
-                      <a:ext cx="6096000" cy="2638425"/>
+                      <a:ext cx="6096000" cy="3248025"/>
                     </a:xfrm>
                     <a:prstGeom prst="rect">
                       <a:avLst/>
@@ -1336,104 +1336,6 @@
           </w:p>
         </w:tc>
       </w:tr>
-      <w:tr>
-        <w:trPr>
-          <w:cantSplit/>
-        </w:trPr>
-        <w:tc>
-          <w:tcPr>
-            <w:tcW w:type="dxa" w:w="2400"/>
-            <w:tcBorders>
-              <w:top w:val="single" w:color="D6DAD3" w:sz="4"/>
-              <w:left w:val="single" w:color="D6DAD3" w:sz="4"/>
-              <w:bottom w:val="single" w:color="D6DAD3" w:sz="4"/>
-              <w:right w:val="single" w:color="D6DAD3" w:sz="4"/>
-            </w:tcBorders>
-            <w:tcMar>
-              <w:top w:type="dxa" w:w="60"/>
-              <w:left w:type="dxa" w:w="100"/>
-              <w:bottom w:type="dxa" w:w="60"/>
-              <w:right w:type="dxa" w:w="100"/>
-            </w:tcMar>
-          </w:tcPr>
-          <w:p>
-            <w:pPr>
-              <w:spacing w:after="0" w:line="252"/>
-            </w:pPr>
-            <w:r>
-              <w:rPr>
-                <w:rFonts w:ascii="Calibri" w:cs="Calibri" w:eastAsia="Calibri" w:hAnsi="Calibri"/>
-                <w:color w:val="1B2430"/>
-                <w:sz w:val="22"/>
-                <w:szCs w:val="22"/>
-              </w:rPr>
-              <w:t xml:space="preserve">8 · Telemetry</w:t>
-            </w:r>
-          </w:p>
-        </w:tc>
-        <w:tc>
-          <w:tcPr>
-            <w:tcW w:type="dxa" w:w="3200"/>
-            <w:tcBorders>
-              <w:top w:val="single" w:color="D6DAD3" w:sz="4"/>
-              <w:left w:val="single" w:color="D6DAD3" w:sz="4"/>
-              <w:bottom w:val="single" w:color="D6DAD3" w:sz="4"/>
-              <w:right w:val="single" w:color="D6DAD3" w:sz="4"/>
-            </w:tcBorders>
-            <w:tcMar>
-              <w:top w:type="dxa" w:w="60"/>
-              <w:left w:type="dxa" w:w="100"/>
-              <w:bottom w:type="dxa" w:w="60"/>
-              <w:right w:type="dxa" w:w="100"/>
-            </w:tcMar>
-          </w:tcPr>
-          <w:p>
-            <w:pPr>
-              <w:spacing w:after="0" w:line="252"/>
-            </w:pPr>
-            <w:r>
-              <w:rPr>
-                <w:rFonts w:ascii="Consolas" w:cs="Consolas" w:eastAsia="Consolas" w:hAnsi="Consolas"/>
-                <w:color w:val="1B2430"/>
-                <w:sz w:val="19"/>
-                <w:szCs w:val="19"/>
-              </w:rPr>
-              <w:t xml:space="preserve">telemetry, telemetry_day, telemetry_threshold</w:t>
-            </w:r>
-          </w:p>
-        </w:tc>
-        <w:tc>
-          <w:tcPr>
-            <w:tcW w:type="dxa" w:w="4038"/>
-            <w:tcBorders>
-              <w:top w:val="single" w:color="D6DAD3" w:sz="4"/>
-              <w:left w:val="single" w:color="D6DAD3" w:sz="4"/>
-              <w:bottom w:val="single" w:color="D6DAD3" w:sz="4"/>
-              <w:right w:val="single" w:color="D6DAD3" w:sz="4"/>
-            </w:tcBorders>
-            <w:tcMar>
-              <w:top w:type="dxa" w:w="60"/>
-              <w:left w:type="dxa" w:w="100"/>
-              <w:bottom w:type="dxa" w:w="60"/>
-              <w:right w:type="dxa" w:w="100"/>
-            </w:tcMar>
-          </w:tcPr>
-          <w:p>
-            <w:pPr>
-              <w:spacing w:after="0" w:line="252"/>
-            </w:pPr>
-            <w:r>
-              <w:rPr>
-                <w:rFonts w:ascii="Calibri" w:cs="Calibri" w:eastAsia="Calibri" w:hAnsi="Calibri"/>
-                <w:color w:val="1B2430"/>
-                <w:sz w:val="22"/>
-                <w:szCs w:val="22"/>
-              </w:rPr>
-              <w:t xml:space="preserve">Every temperature, current and pressure reading, and the daily summary per component that issues and maintenance planning use.</w:t>
-            </w:r>
-          </w:p>
-        </w:tc>
-      </w:tr>
     </w:tbl>
     <w:p>
       <w:pPr>
@@ -1631,36 +1533,6 @@
           <w:szCs w:val="22"/>
         </w:rPr>
         <w:t xml:space="preserve">plus a history table per core entity, giving the same "as of" queries a temporal table would.</w:t>
-      </w:r>
-    </w:p>
-    <w:p>
-      <w:pPr>
-        <w:pStyle w:val="ListParagraph"/>
-        <w:numPr>
-          <w:ilvl w:val="0"/>
-          <w:numId w:val="2"/>
-        </w:numPr>
-        <w:spacing w:after="60" w:line="264"/>
-      </w:pPr>
-      <w:r>
-        <w:rPr>
-          <w:rFonts w:ascii="Calibri" w:cs="Calibri" w:eastAsia="Calibri" w:hAnsi="Calibri"/>
-          <w:b/>
-          <w:bCs/>
-          <w:color w:val="1B2430"/>
-          <w:sz w:val="22"/>
-          <w:szCs w:val="22"/>
-        </w:rPr>
-        <w:t xml:space="preserve">Time series are hypertables: </w:t>
-      </w:r>
-      <w:r>
-        <w:rPr>
-          <w:rFonts w:ascii="Calibri" w:cs="Calibri" w:eastAsia="Calibri" w:hAnsi="Calibri"/>
-          <w:color w:val="1B2430"/>
-          <w:sz w:val="22"/>
-          <w:szCs w:val="22"/>
-        </w:rPr>
-        <w:t xml:space="preserve">partitioned by time automatically, compressed after 30 days, kept for years.</w:t>
       </w:r>
     </w:p>
     <w:p>
@@ -2963,7 +2835,7 @@
                 <w:sz w:val="22"/>
                 <w:szCs w:val="22"/>
               </w:rPr>
-              <w:t xml:space="preserve">system, component, position ("servo 2", "pick camera"), fitted_on, removed_on, the maintenance event that fitted it. Telemetry joins to this row, so a reading is attributed to the exact servo in that slot at the time.</w:t>
+              <w:t xml:space="preserve">system, component, position ("servo 2", "pick camera"), fitted_on, removed_on, the maintenance event that fitted it.</w:t>
             </w:r>
           </w:p>
         </w:tc>
@@ -5182,673 +5054,6 @@
         </w:tc>
       </w:tr>
     </w:tbl>
-    <w:p>
-      <w:pPr>
-        <w:pStyle w:val="Heading2"/>
-        <w:keepNext/>
-        <w:spacing w:after="120" w:before="260"/>
-      </w:pPr>
-      <w:r>
-        <w:rPr>
-          <w:rFonts w:ascii="Calibri" w:cs="Calibri" w:eastAsia="Calibri" w:hAnsi="Calibri"/>
-          <w:b/>
-          <w:bCs/>
-          <w:color w:val="1F6F8B"/>
-          <w:sz w:val="26"/>
-          <w:szCs w:val="26"/>
-        </w:rPr>
-        <w:t xml:space="preserve">8 · Telemetry</w:t>
-      </w:r>
-    </w:p>
-    <w:p>
-      <w:pPr>
-        <w:spacing w:after="120" w:line="276"/>
-      </w:pPr>
-      <w:r>
-        <w:rPr>
-          <w:rFonts w:ascii="Calibri" w:cs="Calibri" w:eastAsia="Calibri" w:hAnsi="Calibri"/>
-          <w:color w:val="1B2430"/>
-          <w:sz w:val="22"/>
-          <w:szCs w:val="22"/>
-        </w:rPr>
-        <w:t xml:space="preserve">Raw readings and their daily summary live in the same database as everything else. The raw table is a TimescaleDB hypertable: an ordinary table partitioned by time behind the scenes, compressed after 30 days, with old chunks dropped past the retention we set.</w:t>
-      </w:r>
-    </w:p>
-    <w:tbl>
-      <w:tblPr>
-        <w:tblW w:type="dxa" w:w="9638"/>
-        <w:tblBorders>
-          <w:top w:val="single" w:color="auto" w:sz="4"/>
-          <w:left w:val="single" w:color="auto" w:sz="4"/>
-          <w:bottom w:val="single" w:color="auto" w:sz="4"/>
-          <w:right w:val="single" w:color="auto" w:sz="4"/>
-          <w:insideH w:val="single" w:color="auto" w:sz="4"/>
-          <w:insideV w:val="single" w:color="auto" w:sz="4"/>
-        </w:tblBorders>
-      </w:tblPr>
-      <w:tblGrid>
-        <w:gridCol w:w="1900"/>
-        <w:gridCol w:w="2200"/>
-        <w:gridCol w:w="5538"/>
-      </w:tblGrid>
-      <w:tr>
-        <w:trPr>
-          <w:tblHeader/>
-        </w:trPr>
-        <w:tc>
-          <w:tcPr>
-            <w:tcW w:type="dxa" w:w="1900"/>
-            <w:tcBorders>
-              <w:top w:val="single" w:color="D6DAD3" w:sz="4"/>
-              <w:left w:val="single" w:color="D6DAD3" w:sz="4"/>
-              <w:bottom w:val="single" w:color="D6DAD3" w:sz="4"/>
-              <w:right w:val="single" w:color="D6DAD3" w:sz="4"/>
-            </w:tcBorders>
-            <w:shd w:fill="ECEEE9" w:color="auto" w:val="clear"/>
-            <w:tcMar>
-              <w:top w:type="dxa" w:w="60"/>
-              <w:left w:type="dxa" w:w="100"/>
-              <w:bottom w:type="dxa" w:w="60"/>
-              <w:right w:type="dxa" w:w="100"/>
-            </w:tcMar>
-          </w:tcPr>
-          <w:p>
-            <w:pPr>
-              <w:spacing w:after="0" w:line="252"/>
-            </w:pPr>
-            <w:r>
-              <w:rPr>
-                <w:rFonts w:ascii="Calibri" w:cs="Calibri" w:eastAsia="Calibri" w:hAnsi="Calibri"/>
-                <w:b/>
-                <w:bCs/>
-                <w:color w:val="4A5563"/>
-                <w:sz w:val="19"/>
-                <w:szCs w:val="19"/>
-              </w:rPr>
-              <w:t xml:space="preserve">Table</w:t>
-            </w:r>
-          </w:p>
-        </w:tc>
-        <w:tc>
-          <w:tcPr>
-            <w:tcW w:type="dxa" w:w="2200"/>
-            <w:tcBorders>
-              <w:top w:val="single" w:color="D6DAD3" w:sz="4"/>
-              <w:left w:val="single" w:color="D6DAD3" w:sz="4"/>
-              <w:bottom w:val="single" w:color="D6DAD3" w:sz="4"/>
-              <w:right w:val="single" w:color="D6DAD3" w:sz="4"/>
-            </w:tcBorders>
-            <w:shd w:fill="ECEEE9" w:color="auto" w:val="clear"/>
-            <w:tcMar>
-              <w:top w:type="dxa" w:w="60"/>
-              <w:left w:type="dxa" w:w="100"/>
-              <w:bottom w:type="dxa" w:w="60"/>
-              <w:right w:type="dxa" w:w="100"/>
-            </w:tcMar>
-          </w:tcPr>
-          <w:p>
-            <w:pPr>
-              <w:spacing w:after="0" w:line="252"/>
-            </w:pPr>
-            <w:r>
-              <w:rPr>
-                <w:rFonts w:ascii="Calibri" w:cs="Calibri" w:eastAsia="Calibri" w:hAnsi="Calibri"/>
-                <w:b/>
-                <w:bCs/>
-                <w:color w:val="4A5563"/>
-                <w:sz w:val="19"/>
-                <w:szCs w:val="19"/>
-              </w:rPr>
-              <w:t xml:space="preserve">Key</w:t>
-            </w:r>
-          </w:p>
-        </w:tc>
-        <w:tc>
-          <w:tcPr>
-            <w:tcW w:type="dxa" w:w="5538"/>
-            <w:tcBorders>
-              <w:top w:val="single" w:color="D6DAD3" w:sz="4"/>
-              <w:left w:val="single" w:color="D6DAD3" w:sz="4"/>
-              <w:bottom w:val="single" w:color="D6DAD3" w:sz="4"/>
-              <w:right w:val="single" w:color="D6DAD3" w:sz="4"/>
-            </w:tcBorders>
-            <w:shd w:fill="ECEEE9" w:color="auto" w:val="clear"/>
-            <w:tcMar>
-              <w:top w:type="dxa" w:w="60"/>
-              <w:left w:type="dxa" w:w="100"/>
-              <w:bottom w:type="dxa" w:w="60"/>
-              <w:right w:type="dxa" w:w="100"/>
-            </w:tcMar>
-          </w:tcPr>
-          <w:p>
-            <w:pPr>
-              <w:spacing w:after="0" w:line="252"/>
-            </w:pPr>
-            <w:r>
-              <w:rPr>
-                <w:rFonts w:ascii="Calibri" w:cs="Calibri" w:eastAsia="Calibri" w:hAnsi="Calibri"/>
-                <w:b/>
-                <w:bCs/>
-                <w:color w:val="4A5563"/>
-                <w:sz w:val="19"/>
-                <w:szCs w:val="19"/>
-              </w:rPr>
-              <w:t xml:space="preserve">Columns worth naming</w:t>
-            </w:r>
-          </w:p>
-        </w:tc>
-      </w:tr>
-      <w:tr>
-        <w:trPr>
-          <w:cantSplit/>
-        </w:trPr>
-        <w:tc>
-          <w:tcPr>
-            <w:tcW w:type="dxa" w:w="1900"/>
-            <w:tcBorders>
-              <w:top w:val="single" w:color="D6DAD3" w:sz="4"/>
-              <w:left w:val="single" w:color="D6DAD3" w:sz="4"/>
-              <w:bottom w:val="single" w:color="D6DAD3" w:sz="4"/>
-              <w:right w:val="single" w:color="D6DAD3" w:sz="4"/>
-            </w:tcBorders>
-            <w:tcMar>
-              <w:top w:type="dxa" w:w="60"/>
-              <w:left w:type="dxa" w:w="100"/>
-              <w:bottom w:type="dxa" w:w="60"/>
-              <w:right w:type="dxa" w:w="100"/>
-            </w:tcMar>
-          </w:tcPr>
-          <w:p>
-            <w:pPr>
-              <w:spacing w:after="0" w:line="252"/>
-            </w:pPr>
-            <w:r>
-              <w:rPr>
-                <w:rFonts w:ascii="Consolas" w:cs="Consolas" w:eastAsia="Consolas" w:hAnsi="Consolas"/>
-                <w:color w:val="1B2430"/>
-                <w:sz w:val="19"/>
-                <w:szCs w:val="19"/>
-              </w:rPr>
-              <w:t xml:space="preserve">telemetry</w:t>
-            </w:r>
-          </w:p>
-        </w:tc>
-        <w:tc>
-          <w:tcPr>
-            <w:tcW w:type="dxa" w:w="2200"/>
-            <w:tcBorders>
-              <w:top w:val="single" w:color="D6DAD3" w:sz="4"/>
-              <w:left w:val="single" w:color="D6DAD3" w:sz="4"/>
-              <w:bottom w:val="single" w:color="D6DAD3" w:sz="4"/>
-              <w:right w:val="single" w:color="D6DAD3" w:sz="4"/>
-            </w:tcBorders>
-            <w:tcMar>
-              <w:top w:type="dxa" w:w="60"/>
-              <w:left w:type="dxa" w:w="100"/>
-              <w:bottom w:type="dxa" w:w="60"/>
-              <w:right w:type="dxa" w:w="100"/>
-            </w:tcMar>
-          </w:tcPr>
-          <w:p>
-            <w:pPr>
-              <w:spacing w:after="0" w:line="252"/>
-            </w:pPr>
-            <w:r>
-              <w:rPr>
-                <w:rFonts w:ascii="Consolas" w:cs="Consolas" w:eastAsia="Consolas" w:hAnsi="Consolas"/>
-                <w:color w:val="1B2430"/>
-                <w:sz w:val="19"/>
-                <w:szCs w:val="19"/>
-              </w:rPr>
-              <w:t xml:space="preserve">(time, system_id, position, metric)</w:t>
-            </w:r>
-          </w:p>
-        </w:tc>
-        <w:tc>
-          <w:tcPr>
-            <w:tcW w:type="dxa" w:w="5538"/>
-            <w:tcBorders>
-              <w:top w:val="single" w:color="D6DAD3" w:sz="4"/>
-              <w:left w:val="single" w:color="D6DAD3" w:sz="4"/>
-              <w:bottom w:val="single" w:color="D6DAD3" w:sz="4"/>
-              <w:right w:val="single" w:color="D6DAD3" w:sz="4"/>
-            </w:tcBorders>
-            <w:tcMar>
-              <w:top w:type="dxa" w:w="60"/>
-              <w:left w:type="dxa" w:w="100"/>
-              <w:bottom w:type="dxa" w:w="60"/>
-              <w:right w:type="dxa" w:w="100"/>
-            </w:tcMar>
-          </w:tcPr>
-          <w:p>
-            <w:pPr>
-              <w:spacing w:after="0" w:line="252"/>
-            </w:pPr>
-            <w:r>
-              <w:rPr>
-                <w:rFonts w:ascii="Calibri" w:cs="Calibri" w:eastAsia="Calibri" w:hAnsi="Calibri"/>
-                <w:color w:val="1B2430"/>
-                <w:sz w:val="22"/>
-                <w:szCs w:val="22"/>
-              </w:rPr>
-              <w:t xml:space="preserve">time, system, position ("servo 2", "brake resistor", "PSU 48V"), metric (temperature, current, voltage, pressure, vacuum), value, unit, source. Compression after 30 days; retention 5 years; indexed so one servo's panel is instant.</w:t>
-            </w:r>
-          </w:p>
-        </w:tc>
-      </w:tr>
-      <w:tr>
-        <w:trPr>
-          <w:cantSplit/>
-        </w:trPr>
-        <w:tc>
-          <w:tcPr>
-            <w:tcW w:type="dxa" w:w="1900"/>
-            <w:tcBorders>
-              <w:top w:val="single" w:color="D6DAD3" w:sz="4"/>
-              <w:left w:val="single" w:color="D6DAD3" w:sz="4"/>
-              <w:bottom w:val="single" w:color="D6DAD3" w:sz="4"/>
-              <w:right w:val="single" w:color="D6DAD3" w:sz="4"/>
-            </w:tcBorders>
-            <w:tcMar>
-              <w:top w:type="dxa" w:w="60"/>
-              <w:left w:type="dxa" w:w="100"/>
-              <w:bottom w:type="dxa" w:w="60"/>
-              <w:right w:type="dxa" w:w="100"/>
-            </w:tcMar>
-          </w:tcPr>
-          <w:p>
-            <w:pPr>
-              <w:spacing w:after="0" w:line="252"/>
-            </w:pPr>
-            <w:r>
-              <w:rPr>
-                <w:rFonts w:ascii="Consolas" w:cs="Consolas" w:eastAsia="Consolas" w:hAnsi="Consolas"/>
-                <w:color w:val="1B2430"/>
-                <w:sz w:val="19"/>
-                <w:szCs w:val="19"/>
-              </w:rPr>
-              <w:t xml:space="preserve">telemetry_day</w:t>
-            </w:r>
-          </w:p>
-        </w:tc>
-        <w:tc>
-          <w:tcPr>
-            <w:tcW w:type="dxa" w:w="2200"/>
-            <w:tcBorders>
-              <w:top w:val="single" w:color="D6DAD3" w:sz="4"/>
-              <w:left w:val="single" w:color="D6DAD3" w:sz="4"/>
-              <w:bottom w:val="single" w:color="D6DAD3" w:sz="4"/>
-              <w:right w:val="single" w:color="D6DAD3" w:sz="4"/>
-            </w:tcBorders>
-            <w:tcMar>
-              <w:top w:type="dxa" w:w="60"/>
-              <w:left w:type="dxa" w:w="100"/>
-              <w:bottom w:type="dxa" w:w="60"/>
-              <w:right w:type="dxa" w:w="100"/>
-            </w:tcMar>
-          </w:tcPr>
-          <w:p>
-            <w:pPr>
-              <w:spacing w:after="0" w:line="252"/>
-            </w:pPr>
-            <w:r>
-              <w:rPr>
-                <w:rFonts w:ascii="Consolas" w:cs="Consolas" w:eastAsia="Consolas" w:hAnsi="Consolas"/>
-                <w:color w:val="1B2430"/>
-                <w:sz w:val="19"/>
-                <w:szCs w:val="19"/>
-              </w:rPr>
-              <w:t xml:space="preserve">(system_id, position, metric, day)</w:t>
-            </w:r>
-          </w:p>
-        </w:tc>
-        <w:tc>
-          <w:tcPr>
-            <w:tcW w:type="dxa" w:w="5538"/>
-            <w:tcBorders>
-              <w:top w:val="single" w:color="D6DAD3" w:sz="4"/>
-              <w:left w:val="single" w:color="D6DAD3" w:sz="4"/>
-              <w:bottom w:val="single" w:color="D6DAD3" w:sz="4"/>
-              <w:right w:val="single" w:color="D6DAD3" w:sz="4"/>
-            </w:tcBorders>
-            <w:tcMar>
-              <w:top w:type="dxa" w:w="60"/>
-              <w:left w:type="dxa" w:w="100"/>
-              <w:bottom w:type="dxa" w:w="60"/>
-              <w:right w:type="dxa" w:w="100"/>
-            </w:tcMar>
-          </w:tcPr>
-          <w:p>
-            <w:pPr>
-              <w:spacing w:after="0" w:line="252"/>
-            </w:pPr>
-            <w:r>
-              <w:rPr>
-                <w:rFonts w:ascii="Calibri" w:cs="Calibri" w:eastAsia="Calibri" w:hAnsi="Calibri"/>
-                <w:color w:val="1B2430"/>
-                <w:sz w:val="22"/>
-                <w:szCs w:val="22"/>
-              </w:rPr>
-              <w:t xml:space="preserve">the fitted component that day, min, average, max, minutes above threshold, threshold used, sample count. A continuous aggregate refreshed nightly; the table issues and maintenance planning read.</w:t>
-            </w:r>
-          </w:p>
-        </w:tc>
-      </w:tr>
-      <w:tr>
-        <w:trPr>
-          <w:cantSplit/>
-        </w:trPr>
-        <w:tc>
-          <w:tcPr>
-            <w:tcW w:type="dxa" w:w="1900"/>
-            <w:tcBorders>
-              <w:top w:val="single" w:color="D6DAD3" w:sz="4"/>
-              <w:left w:val="single" w:color="D6DAD3" w:sz="4"/>
-              <w:bottom w:val="single" w:color="D6DAD3" w:sz="4"/>
-              <w:right w:val="single" w:color="D6DAD3" w:sz="4"/>
-            </w:tcBorders>
-            <w:tcMar>
-              <w:top w:type="dxa" w:w="60"/>
-              <w:left w:type="dxa" w:w="100"/>
-              <w:bottom w:type="dxa" w:w="60"/>
-              <w:right w:type="dxa" w:w="100"/>
-            </w:tcMar>
-          </w:tcPr>
-          <w:p>
-            <w:pPr>
-              <w:spacing w:after="0" w:line="252"/>
-            </w:pPr>
-            <w:r>
-              <w:rPr>
-                <w:rFonts w:ascii="Consolas" w:cs="Consolas" w:eastAsia="Consolas" w:hAnsi="Consolas"/>
-                <w:color w:val="1B2430"/>
-                <w:sz w:val="19"/>
-                <w:szCs w:val="19"/>
-              </w:rPr>
-              <w:t xml:space="preserve">telemetry_threshold</w:t>
-            </w:r>
-          </w:p>
-        </w:tc>
-        <w:tc>
-          <w:tcPr>
-            <w:tcW w:type="dxa" w:w="2200"/>
-            <w:tcBorders>
-              <w:top w:val="single" w:color="D6DAD3" w:sz="4"/>
-              <w:left w:val="single" w:color="D6DAD3" w:sz="4"/>
-              <w:bottom w:val="single" w:color="D6DAD3" w:sz="4"/>
-              <w:right w:val="single" w:color="D6DAD3" w:sz="4"/>
-            </w:tcBorders>
-            <w:tcMar>
-              <w:top w:type="dxa" w:w="60"/>
-              <w:left w:type="dxa" w:w="100"/>
-              <w:bottom w:type="dxa" w:w="60"/>
-              <w:right w:type="dxa" w:w="100"/>
-            </w:tcMar>
-          </w:tcPr>
-          <w:p>
-            <w:pPr>
-              <w:spacing w:after="0" w:line="252"/>
-            </w:pPr>
-            <w:r>
-              <w:rPr>
-                <w:rFonts w:ascii="Consolas" w:cs="Consolas" w:eastAsia="Consolas" w:hAnsi="Consolas"/>
-                <w:color w:val="1B2430"/>
-                <w:sz w:val="19"/>
-                <w:szCs w:val="19"/>
-              </w:rPr>
-              <w:t xml:space="preserve">(component_type_id, metric)</w:t>
-            </w:r>
-          </w:p>
-        </w:tc>
-        <w:tc>
-          <w:tcPr>
-            <w:tcW w:type="dxa" w:w="5538"/>
-            <w:tcBorders>
-              <w:top w:val="single" w:color="D6DAD3" w:sz="4"/>
-              <w:left w:val="single" w:color="D6DAD3" w:sz="4"/>
-              <w:bottom w:val="single" w:color="D6DAD3" w:sz="4"/>
-              <w:right w:val="single" w:color="D6DAD3" w:sz="4"/>
-            </w:tcBorders>
-            <w:tcMar>
-              <w:top w:type="dxa" w:w="60"/>
-              <w:left w:type="dxa" w:w="100"/>
-              <w:bottom w:type="dxa" w:w="60"/>
-              <w:right w:type="dxa" w:w="100"/>
-            </w:tcMar>
-          </w:tcPr>
-          <w:p>
-            <w:pPr>
-              <w:spacing w:after="0" w:line="252"/>
-            </w:pPr>
-            <w:r>
-              <w:rPr>
-                <w:rFonts w:ascii="Calibri" w:cs="Calibri" w:eastAsia="Calibri" w:hAnsi="Calibri"/>
-                <w:color w:val="1B2430"/>
-                <w:sz w:val="22"/>
-                <w:szCs w:val="22"/>
-              </w:rPr>
-              <w:t xml:space="preserve">warning and alarm levels per component type and metric, so "minutes above threshold" changes with a row edit, not a code change.</w:t>
-            </w:r>
-          </w:p>
-        </w:tc>
-      </w:tr>
-    </w:tbl>
-    <w:p>
-      <w:pPr>
-        <w:pStyle w:val="Heading1"/>
-        <w:keepNext/>
-        <w:spacing w:after="160" w:before="360"/>
-      </w:pPr>
-      <w:r>
-        <w:rPr>
-          <w:rFonts w:ascii="Calibri" w:cs="Calibri" w:eastAsia="Calibri" w:hAnsi="Calibri"/>
-          <w:b/>
-          <w:bCs/>
-          <w:color w:val="1B2430"/>
-          <w:sz w:val="32"/>
-          <w:szCs w:val="32"/>
-        </w:rPr>
-        <w:t xml:space="preserve">Decisions needed at the meeting</w:t>
-      </w:r>
-    </w:p>
-    <w:p>
-      <w:pPr>
-        <w:pStyle w:val="ListParagraph"/>
-        <w:numPr>
-          <w:ilvl w:val="0"/>
-          <w:numId w:val="2"/>
-        </w:numPr>
-        <w:spacing w:after="60" w:line="264"/>
-      </w:pPr>
-      <w:r>
-        <w:rPr>
-          <w:rFonts w:ascii="Calibri" w:cs="Calibri" w:eastAsia="Calibri" w:hAnsi="Calibri"/>
-          <w:b/>
-          <w:bCs/>
-          <w:color w:val="1B2430"/>
-          <w:sz w:val="22"/>
-          <w:szCs w:val="22"/>
-        </w:rPr>
-        <w:t xml:space="preserve">The eight areas and their tables. </w:t>
-      </w:r>
-      <w:r>
-        <w:rPr>
-          <w:rFonts w:ascii="Calibri" w:cs="Calibri" w:eastAsia="Calibri" w:hAnsi="Calibri"/>
-          <w:color w:val="1B2430"/>
-          <w:sz w:val="22"/>
-          <w:szCs w:val="22"/>
-        </w:rPr>
-        <w:t xml:space="preserve">Anything missing, anything that should not be there. Recent simplifications to confirm: no tray-type table, no SKU recipe versions, SKUs not owned by customers, root causes as a numbered catalogue, damaged trays as issues.</w:t>
-      </w:r>
-    </w:p>
-    <w:p>
-      <w:pPr>
-        <w:pStyle w:val="ListParagraph"/>
-        <w:numPr>
-          <w:ilvl w:val="0"/>
-          <w:numId w:val="2"/>
-        </w:numPr>
-        <w:spacing w:after="60" w:line="264"/>
-      </w:pPr>
-      <w:r>
-        <w:rPr>
-          <w:rFonts w:ascii="Calibri" w:cs="Calibri" w:eastAsia="Calibri" w:hAnsi="Calibri"/>
-          <w:b/>
-          <w:bCs/>
-          <w:color w:val="1B2430"/>
-          <w:sz w:val="22"/>
-          <w:szCs w:val="22"/>
-        </w:rPr>
-        <w:t xml:space="preserve">The engine. </w:t>
-      </w:r>
-      <w:r>
-        <w:rPr>
-          <w:rFonts w:ascii="Calibri" w:cs="Calibri" w:eastAsia="Calibri" w:hAnsi="Calibri"/>
-          <w:color w:val="1B2430"/>
-          <w:sz w:val="22"/>
-          <w:szCs w:val="22"/>
-        </w:rPr>
-        <w:t xml:space="preserve">The suggestion is PostgreSQL with TimescaleDB, one database for records and telemetry, in place of Azure SQL plus a separate time-series service.</w:t>
-      </w:r>
-    </w:p>
-    <w:p>
-      <w:pPr>
-        <w:pStyle w:val="ListParagraph"/>
-        <w:numPr>
-          <w:ilvl w:val="0"/>
-          <w:numId w:val="2"/>
-        </w:numPr>
-        <w:spacing w:after="60" w:line="264"/>
-      </w:pPr>
-      <w:r>
-        <w:rPr>
-          <w:rFonts w:ascii="Calibri" w:cs="Calibri" w:eastAsia="Calibri" w:hAnsi="Calibri"/>
-          <w:b/>
-          <w:bCs/>
-          <w:color w:val="1B2430"/>
-          <w:sz w:val="22"/>
-          <w:szCs w:val="22"/>
-        </w:rPr>
-        <w:t xml:space="preserve">Identifiers. </w:t>
-      </w:r>
-      <w:r>
-        <w:rPr>
-          <w:rFonts w:ascii="Calibri" w:cs="Calibri" w:eastAsia="Calibri" w:hAnsi="Calibri"/>
-          <w:color w:val="1B2430"/>
-          <w:sz w:val="22"/>
-          <w:szCs w:val="22"/>
-        </w:rPr>
-        <w:t xml:space="preserve">Serial-number format, tray numbering, that SKU codes come from Elastic's SKU name, and the ISS / MNT / RC reference scheme.</w:t>
-      </w:r>
-    </w:p>
-    <w:p>
-      <w:pPr>
-        <w:pStyle w:val="Heading2"/>
-        <w:keepNext/>
-        <w:spacing w:after="120" w:before="260"/>
-      </w:pPr>
-      <w:r>
-        <w:rPr>
-          <w:rFonts w:ascii="Calibri" w:cs="Calibri" w:eastAsia="Calibri" w:hAnsi="Calibri"/>
-          <w:b/>
-          <w:bCs/>
-          <w:color w:val="1F6F8B"/>
-          <w:sz w:val="26"/>
-          <w:szCs w:val="26"/>
-        </w:rPr>
-        <w:t xml:space="preserve">Decisions needed soon</w:t>
-      </w:r>
-    </w:p>
-    <w:p>
-      <w:pPr>
-        <w:pStyle w:val="ListParagraph"/>
-        <w:numPr>
-          <w:ilvl w:val="0"/>
-          <w:numId w:val="2"/>
-        </w:numPr>
-        <w:spacing w:after="60" w:line="264"/>
-      </w:pPr>
-      <w:r>
-        <w:rPr>
-          <w:rFonts w:ascii="Calibri" w:cs="Calibri" w:eastAsia="Calibri" w:hAnsi="Calibri"/>
-          <w:b/>
-          <w:bCs/>
-          <w:color w:val="1B2430"/>
-          <w:sz w:val="22"/>
-          <w:szCs w:val="22"/>
-        </w:rPr>
-        <w:t xml:space="preserve">Data owners. </w:t>
-      </w:r>
-      <w:r>
-        <w:rPr>
-          <w:rFonts w:ascii="Calibri" w:cs="Calibri" w:eastAsia="Calibri" w:hAnsi="Calibri"/>
-          <w:color w:val="1B2430"/>
-          <w:sz w:val="22"/>
-          <w:szCs w:val="22"/>
-        </w:rPr>
-        <w:t xml:space="preserve">A name against each area for the inventory, the reconciliation and the sign-off.</w:t>
-      </w:r>
-    </w:p>
-    <w:p>
-      <w:pPr>
-        <w:pStyle w:val="ListParagraph"/>
-        <w:numPr>
-          <w:ilvl w:val="0"/>
-          <w:numId w:val="2"/>
-        </w:numPr>
-        <w:spacing w:after="60" w:line="264"/>
-      </w:pPr>
-      <w:r>
-        <w:rPr>
-          <w:rFonts w:ascii="Calibri" w:cs="Calibri" w:eastAsia="Calibri" w:hAnsi="Calibri"/>
-          <w:b/>
-          <w:bCs/>
-          <w:color w:val="1B2430"/>
-          <w:sz w:val="22"/>
-          <w:szCs w:val="22"/>
-        </w:rPr>
-        <w:t xml:space="preserve">Roles. </w:t>
-      </w:r>
-      <w:r>
-        <w:rPr>
-          <w:rFonts w:ascii="Calibri" w:cs="Calibri" w:eastAsia="Calibri" w:hAnsi="Calibri"/>
-          <w:color w:val="1B2430"/>
-          <w:sz w:val="22"/>
-          <w:szCs w:val="22"/>
-        </w:rPr>
-        <w:t xml:space="preserve">Who may create systems, close issues, approve releases; who is read-only.</w:t>
-      </w:r>
-    </w:p>
-    <w:p>
-      <w:pPr>
-        <w:pStyle w:val="ListParagraph"/>
-        <w:numPr>
-          <w:ilvl w:val="0"/>
-          <w:numId w:val="2"/>
-        </w:numPr>
-        <w:spacing w:after="60" w:line="264"/>
-      </w:pPr>
-      <w:r>
-        <w:rPr>
-          <w:rFonts w:ascii="Calibri" w:cs="Calibri" w:eastAsia="Calibri" w:hAnsi="Calibri"/>
-          <w:b/>
-          <w:bCs/>
-          <w:color w:val="1B2430"/>
-          <w:sz w:val="22"/>
-          <w:szCs w:val="22"/>
-        </w:rPr>
-        <w:t xml:space="preserve">Where Grafana reads from today, </w:t>
-      </w:r>
-      <w:r>
-        <w:rPr>
-          <w:rFonts w:ascii="Calibri" w:cs="Calibri" w:eastAsia="Calibri" w:hAnsi="Calibri"/>
-          <w:color w:val="1B2430"/>
-          <w:sz w:val="22"/>
-          <w:szCs w:val="22"/>
-        </w:rPr>
-        <w:t xml:space="preserve">its retention and how far back data still exists, since that decides how telemetry gets in.</w:t>
-      </w:r>
-    </w:p>
     <w:sectPr>
       <w:footerReference w:type="default" r:id="rId7"/>
       <w:pgSz w:w="11906" w:h="16838" w:orient="portrait"/>

</xml_diff>

<commit_message>
Fleet database plan: entry-app bullet removed; trackable sentence says SQL table
Co-Authored-By: Claude Fable 5.1 <noreply@anthropic.com>
</commit_message>
<xml_diff>
--- a/docs/database/PikPak Fleet Database Plan.docx
+++ b/docs/database/PikPak Fleet Database Plan.docx
@@ -147,20 +147,6 @@
     </w:p>
     <w:p>
       <w:pPr>
-        <w:spacing w:after="120" w:line="276"/>
-      </w:pPr>
-      <w:r>
-        <w:rPr>
-          <w:rFonts w:ascii="Calibri" w:cs="Calibri" w:eastAsia="Calibri" w:hAnsi="Calibri"/>
-          <w:color w:val="1B2430"/>
-          <w:sz w:val="22"/>
-          <w:szCs w:val="22"/>
-        </w:rPr>
-        <w:t xml:space="preserve">Two layers, each replaceable on its own.</w:t>
-      </w:r>
-    </w:p>
-    <w:p>
-      <w:pPr>
         <w:pStyle w:val="ListParagraph"/>
         <w:numPr>
           <w:ilvl w:val="0"/>
@@ -187,36 +173,6 @@
           <w:szCs w:val="22"/>
         </w:rPr>
         <w:t xml:space="preserve">Azure Database for PostgreSQL holds every record: the relational tables, JSON where a record is naturally a document, and the time series through TimescaleDB. Spreadsheets become read-only views of it, never the other way round.</w:t>
-      </w:r>
-    </w:p>
-    <w:p>
-      <w:pPr>
-        <w:pStyle w:val="ListParagraph"/>
-        <w:numPr>
-          <w:ilvl w:val="0"/>
-          <w:numId w:val="2"/>
-        </w:numPr>
-        <w:spacing w:after="60" w:line="264"/>
-      </w:pPr>
-      <w:r>
-        <w:rPr>
-          <w:rFonts w:ascii="Calibri" w:cs="Calibri" w:eastAsia="Calibri" w:hAnsi="Calibri"/>
-          <w:b/>
-          <w:bCs/>
-          <w:color w:val="1B2430"/>
-          <w:sz w:val="22"/>
-          <w:szCs w:val="22"/>
-        </w:rPr>
-        <w:t xml:space="preserve">One entry app. </w:t>
-      </w:r>
-      <w:r>
-        <w:rPr>
-          <w:rFonts w:ascii="Calibri" w:cs="Calibri" w:eastAsia="Calibri" w:hAnsi="Calibri"/>
-          <w:color w:val="1B2430"/>
-          <w:sz w:val="22"/>
-          <w:szCs w:val="22"/>
-        </w:rPr>
-        <w:t xml:space="preserve">A small internal web app for adding and editing records, with sign-in through the company Microsoft account, roles, and a full change history on every row. Phase one is a generated admin interface, not bespoke screens.</w:t>
       </w:r>
     </w:p>
     <w:p>
@@ -294,7 +250,7 @@
           <w:sz w:val="22"/>
           <w:szCs w:val="22"/>
         </w:rPr>
-        <w:t xml:space="preserve">Every table carries who created and last changed a row and when, and the entry app writes a history row for every change on the core tables. "What did this system's line assignment look like on 3 March" is a single query. Nothing is ever hard-deleted; rows are retired with an end date.</w:t>
+        <w:t xml:space="preserve">Every SQL table carries who created and last changed a row and when, and the entry app writes a history row for every change on the core tables. "What did this system's line assignment look like on 3 March" is a single query. Nothing is ever hard-deleted; rows are retired with an end date.</w:t>
       </w:r>
     </w:p>
     <w:p>

</xml_diff>

<commit_message>
Fleet database plan: engine section cut to the two-line callout
Co-Authored-By: Claude Fable 5.1 <noreply@anthropic.com>
</commit_message>
<xml_diff>
--- a/docs/database/PikPak Fleet Database Plan.docx
+++ b/docs/database/PikPak Fleet Database Plan.docx
@@ -368,51 +368,9 @@
               <w:t xml:space="preserve">Suggested long-term: Azure Database for PostgreSQL Flexible Server, with the TimescaleDB extension, one database for everything.</w:t>
             </w:r>
           </w:p>
-          <w:p>
-            <w:pPr>
-              <w:spacing w:after="80" w:line="264"/>
-            </w:pPr>
-            <w:r>
-              <w:rPr>
-                <w:rFonts w:ascii="Calibri" w:cs="Calibri" w:eastAsia="Calibri" w:hAnsi="Calibri"/>
-                <w:color w:val="1B2430"/>
-                <w:sz w:val="22"/>
-                <w:szCs w:val="22"/>
-              </w:rPr>
-              <w:t xml:space="preserve">Relational tables for the fleet, JSON columns where a record is naturally a document, and TimescaleDB hypertables for the telemetry, all under one backup, one sign-in and one connection string. Django speaks PostgreSQL natively, Grafana has a first-class PostgreSQL data source, and Excel and Power BI connect through the PostgreSQL connector.</w:t>
-            </w:r>
-          </w:p>
-          <w:p>
-            <w:pPr>
-              <w:spacing w:after="80" w:line="264"/>
-            </w:pPr>
-            <w:r>
-              <w:rPr>
-                <w:rFonts w:ascii="Calibri" w:cs="Calibri" w:eastAsia="Calibri" w:hAnsi="Calibri"/>
-                <w:color w:val="1B2430"/>
-                <w:sz w:val="22"/>
-                <w:szCs w:val="22"/>
-              </w:rPr>
-              <w:t xml:space="preserve">What we give up against Azure SQL: built-in temporal tables (row history comes from the app instead), the Excel SQL Server connector people have seen before (the PostgreSQL one needs a one-time driver install), and built-in long-term backup retention (a weekly dump covers it). What we gain: no second store for telemetry, no cross-store joins, and a smaller bill.</w:t>
-            </w:r>
-          </w:p>
         </w:tc>
       </w:tr>
     </w:tbl>
-    <w:p>
-      <w:pPr>
-        <w:spacing w:after="120" w:line="276"/>
-      </w:pPr>
-      <w:r>
-        <w:rPr>
-          <w:rFonts w:ascii="Calibri" w:cs="Calibri" w:eastAsia="Calibri" w:hAnsi="Calibri"/>
-          <w:color w:val="1B2430"/>
-          <w:sz w:val="22"/>
-          <w:szCs w:val="22"/>
-        </w:rPr>
-        <w:t xml:space="preserve">Not recommended: Dataverse or SharePoint lists (licensing per user, weak relational model, hard to query from outside), a separate NoSQL store (this is relational data with many-to-one links everywhere), or a separate time-series service now that Timescale lives inside the same database.</w:t>
-      </w:r>
-    </w:p>
     <w:p>
       <w:r>
         <w:br w:type="page"/>

</xml_diff>

<commit_message>
Fleet database plan: areas summary table removed
Co-Authored-By: Claude Fable 5.1 <noreply@anthropic.com>
</commit_message>
<xml_diff>
--- a/docs/database/PikPak Fleet Database Plan.docx
+++ b/docs/database/PikPak Fleet Database Plan.docx
@@ -440,817 +440,6 @@
         </w:drawing>
       </w:r>
     </w:p>
-    <w:tbl>
-      <w:tblPr>
-        <w:tblW w:type="dxa" w:w="9638"/>
-        <w:tblBorders>
-          <w:top w:val="single" w:color="auto" w:sz="4"/>
-          <w:left w:val="single" w:color="auto" w:sz="4"/>
-          <w:bottom w:val="single" w:color="auto" w:sz="4"/>
-          <w:right w:val="single" w:color="auto" w:sz="4"/>
-          <w:insideH w:val="single" w:color="auto" w:sz="4"/>
-          <w:insideV w:val="single" w:color="auto" w:sz="4"/>
-        </w:tblBorders>
-      </w:tblPr>
-      <w:tblGrid>
-        <w:gridCol w:w="2400"/>
-        <w:gridCol w:w="3200"/>
-        <w:gridCol w:w="4038"/>
-      </w:tblGrid>
-      <w:tr>
-        <w:trPr>
-          <w:tblHeader/>
-        </w:trPr>
-        <w:tc>
-          <w:tcPr>
-            <w:tcW w:type="dxa" w:w="2400"/>
-            <w:tcBorders>
-              <w:top w:val="single" w:color="D6DAD3" w:sz="4"/>
-              <w:left w:val="single" w:color="D6DAD3" w:sz="4"/>
-              <w:bottom w:val="single" w:color="D6DAD3" w:sz="4"/>
-              <w:right w:val="single" w:color="D6DAD3" w:sz="4"/>
-            </w:tcBorders>
-            <w:shd w:fill="ECEEE9" w:color="auto" w:val="clear"/>
-            <w:tcMar>
-              <w:top w:type="dxa" w:w="60"/>
-              <w:left w:type="dxa" w:w="100"/>
-              <w:bottom w:type="dxa" w:w="60"/>
-              <w:right w:type="dxa" w:w="100"/>
-            </w:tcMar>
-          </w:tcPr>
-          <w:p>
-            <w:pPr>
-              <w:spacing w:after="0" w:line="252"/>
-            </w:pPr>
-            <w:r>
-              <w:rPr>
-                <w:rFonts w:ascii="Calibri" w:cs="Calibri" w:eastAsia="Calibri" w:hAnsi="Calibri"/>
-                <w:b/>
-                <w:bCs/>
-                <w:color w:val="4A5563"/>
-                <w:sz w:val="19"/>
-                <w:szCs w:val="19"/>
-              </w:rPr>
-              <w:t xml:space="preserve">Area</w:t>
-            </w:r>
-          </w:p>
-        </w:tc>
-        <w:tc>
-          <w:tcPr>
-            <w:tcW w:type="dxa" w:w="3200"/>
-            <w:tcBorders>
-              <w:top w:val="single" w:color="D6DAD3" w:sz="4"/>
-              <w:left w:val="single" w:color="D6DAD3" w:sz="4"/>
-              <w:bottom w:val="single" w:color="D6DAD3" w:sz="4"/>
-              <w:right w:val="single" w:color="D6DAD3" w:sz="4"/>
-            </w:tcBorders>
-            <w:shd w:fill="ECEEE9" w:color="auto" w:val="clear"/>
-            <w:tcMar>
-              <w:top w:type="dxa" w:w="60"/>
-              <w:left w:type="dxa" w:w="100"/>
-              <w:bottom w:type="dxa" w:w="60"/>
-              <w:right w:type="dxa" w:w="100"/>
-            </w:tcMar>
-          </w:tcPr>
-          <w:p>
-            <w:pPr>
-              <w:spacing w:after="0" w:line="252"/>
-            </w:pPr>
-            <w:r>
-              <w:rPr>
-                <w:rFonts w:ascii="Calibri" w:cs="Calibri" w:eastAsia="Calibri" w:hAnsi="Calibri"/>
-                <w:b/>
-                <w:bCs/>
-                <w:color w:val="4A5563"/>
-                <w:sz w:val="19"/>
-                <w:szCs w:val="19"/>
-              </w:rPr>
-              <w:t xml:space="preserve">Tables</w:t>
-            </w:r>
-          </w:p>
-        </w:tc>
-        <w:tc>
-          <w:tcPr>
-            <w:tcW w:type="dxa" w:w="4038"/>
-            <w:tcBorders>
-              <w:top w:val="single" w:color="D6DAD3" w:sz="4"/>
-              <w:left w:val="single" w:color="D6DAD3" w:sz="4"/>
-              <w:bottom w:val="single" w:color="D6DAD3" w:sz="4"/>
-              <w:right w:val="single" w:color="D6DAD3" w:sz="4"/>
-            </w:tcBorders>
-            <w:shd w:fill="ECEEE9" w:color="auto" w:val="clear"/>
-            <w:tcMar>
-              <w:top w:type="dxa" w:w="60"/>
-              <w:left w:type="dxa" w:w="100"/>
-              <w:bottom w:type="dxa" w:w="60"/>
-              <w:right w:type="dxa" w:w="100"/>
-            </w:tcMar>
-          </w:tcPr>
-          <w:p>
-            <w:pPr>
-              <w:spacing w:after="0" w:line="252"/>
-            </w:pPr>
-            <w:r>
-              <w:rPr>
-                <w:rFonts w:ascii="Calibri" w:cs="Calibri" w:eastAsia="Calibri" w:hAnsi="Calibri"/>
-                <w:b/>
-                <w:bCs/>
-                <w:color w:val="4A5563"/>
-                <w:sz w:val="19"/>
-                <w:szCs w:val="19"/>
-              </w:rPr>
-              <w:t xml:space="preserve">What it answers</w:t>
-            </w:r>
-          </w:p>
-        </w:tc>
-      </w:tr>
-      <w:tr>
-        <w:trPr>
-          <w:cantSplit/>
-        </w:trPr>
-        <w:tc>
-          <w:tcPr>
-            <w:tcW w:type="dxa" w:w="2400"/>
-            <w:tcBorders>
-              <w:top w:val="single" w:color="D6DAD3" w:sz="4"/>
-              <w:left w:val="single" w:color="D6DAD3" w:sz="4"/>
-              <w:bottom w:val="single" w:color="D6DAD3" w:sz="4"/>
-              <w:right w:val="single" w:color="D6DAD3" w:sz="4"/>
-            </w:tcBorders>
-            <w:tcMar>
-              <w:top w:type="dxa" w:w="60"/>
-              <w:left w:type="dxa" w:w="100"/>
-              <w:bottom w:type="dxa" w:w="60"/>
-              <w:right w:type="dxa" w:w="100"/>
-            </w:tcMar>
-          </w:tcPr>
-          <w:p>
-            <w:pPr>
-              <w:spacing w:after="0" w:line="252"/>
-            </w:pPr>
-            <w:r>
-              <w:rPr>
-                <w:rFonts w:ascii="Calibri" w:cs="Calibri" w:eastAsia="Calibri" w:hAnsi="Calibri"/>
-                <w:color w:val="1B2430"/>
-                <w:sz w:val="22"/>
-                <w:szCs w:val="22"/>
-              </w:rPr>
-              <w:t xml:space="preserve">1 · Customers and people</w:t>
-            </w:r>
-          </w:p>
-        </w:tc>
-        <w:tc>
-          <w:tcPr>
-            <w:tcW w:type="dxa" w:w="3200"/>
-            <w:tcBorders>
-              <w:top w:val="single" w:color="D6DAD3" w:sz="4"/>
-              <w:left w:val="single" w:color="D6DAD3" w:sz="4"/>
-              <w:bottom w:val="single" w:color="D6DAD3" w:sz="4"/>
-              <w:right w:val="single" w:color="D6DAD3" w:sz="4"/>
-            </w:tcBorders>
-            <w:tcMar>
-              <w:top w:type="dxa" w:w="60"/>
-              <w:left w:type="dxa" w:w="100"/>
-              <w:bottom w:type="dxa" w:w="60"/>
-              <w:right w:type="dxa" w:w="100"/>
-            </w:tcMar>
-          </w:tcPr>
-          <w:p>
-            <w:pPr>
-              <w:spacing w:after="0" w:line="252"/>
-            </w:pPr>
-            <w:r>
-              <w:rPr>
-                <w:rFonts w:ascii="Consolas" w:cs="Consolas" w:eastAsia="Consolas" w:hAnsi="Consolas"/>
-                <w:color w:val="1B2430"/>
-                <w:sz w:val="19"/>
-                <w:szCs w:val="19"/>
-              </w:rPr>
-              <w:t xml:space="preserve">customer, site, site_contact, production_line, person</w:t>
-            </w:r>
-          </w:p>
-        </w:tc>
-        <w:tc>
-          <w:tcPr>
-            <w:tcW w:type="dxa" w:w="4038"/>
-            <w:tcBorders>
-              <w:top w:val="single" w:color="D6DAD3" w:sz="4"/>
-              <w:left w:val="single" w:color="D6DAD3" w:sz="4"/>
-              <w:bottom w:val="single" w:color="D6DAD3" w:sz="4"/>
-              <w:right w:val="single" w:color="D6DAD3" w:sz="4"/>
-            </w:tcBorders>
-            <w:tcMar>
-              <w:top w:type="dxa" w:w="60"/>
-              <w:left w:type="dxa" w:w="100"/>
-              <w:bottom w:type="dxa" w:w="60"/>
-              <w:right w:type="dxa" w:w="100"/>
-            </w:tcMar>
-          </w:tcPr>
-          <w:p>
-            <w:pPr>
-              <w:spacing w:after="0" w:line="252"/>
-            </w:pPr>
-            <w:r>
-              <w:rPr>
-                <w:rFonts w:ascii="Calibri" w:cs="Calibri" w:eastAsia="Calibri" w:hAnsi="Calibri"/>
-                <w:color w:val="1B2430"/>
-                <w:sz w:val="22"/>
-                <w:szCs w:val="22"/>
-              </w:rPr>
-              <w:t xml:space="preserve">Who our customers are, where their sites and lines are, who to call.</w:t>
-            </w:r>
-          </w:p>
-        </w:tc>
-      </w:tr>
-      <w:tr>
-        <w:trPr>
-          <w:cantSplit/>
-        </w:trPr>
-        <w:tc>
-          <w:tcPr>
-            <w:tcW w:type="dxa" w:w="2400"/>
-            <w:tcBorders>
-              <w:top w:val="single" w:color="D6DAD3" w:sz="4"/>
-              <w:left w:val="single" w:color="D6DAD3" w:sz="4"/>
-              <w:bottom w:val="single" w:color="D6DAD3" w:sz="4"/>
-              <w:right w:val="single" w:color="D6DAD3" w:sz="4"/>
-            </w:tcBorders>
-            <w:tcMar>
-              <w:top w:type="dxa" w:w="60"/>
-              <w:left w:type="dxa" w:w="100"/>
-              <w:bottom w:type="dxa" w:w="60"/>
-              <w:right w:type="dxa" w:w="100"/>
-            </w:tcMar>
-          </w:tcPr>
-          <w:p>
-            <w:pPr>
-              <w:spacing w:after="0" w:line="252"/>
-            </w:pPr>
-            <w:r>
-              <w:rPr>
-                <w:rFonts w:ascii="Calibri" w:cs="Calibri" w:eastAsia="Calibri" w:hAnsi="Calibri"/>
-                <w:color w:val="1B2430"/>
-                <w:sz w:val="22"/>
-                <w:szCs w:val="22"/>
-              </w:rPr>
-              <w:t xml:space="preserve">2 · Fleet</w:t>
-            </w:r>
-          </w:p>
-        </w:tc>
-        <w:tc>
-          <w:tcPr>
-            <w:tcW w:type="dxa" w:w="3200"/>
-            <w:tcBorders>
-              <w:top w:val="single" w:color="D6DAD3" w:sz="4"/>
-              <w:left w:val="single" w:color="D6DAD3" w:sz="4"/>
-              <w:bottom w:val="single" w:color="D6DAD3" w:sz="4"/>
-              <w:right w:val="single" w:color="D6DAD3" w:sz="4"/>
-            </w:tcBorders>
-            <w:tcMar>
-              <w:top w:type="dxa" w:w="60"/>
-              <w:left w:type="dxa" w:w="100"/>
-              <w:bottom w:type="dxa" w:w="60"/>
-              <w:right w:type="dxa" w:w="100"/>
-            </w:tcMar>
-          </w:tcPr>
-          <w:p>
-            <w:pPr>
-              <w:spacing w:after="0" w:line="252"/>
-            </w:pPr>
-            <w:r>
-              <w:rPr>
-                <w:rFonts w:ascii="Consolas" w:cs="Consolas" w:eastAsia="Consolas" w:hAnsi="Consolas"/>
-                <w:color w:val="1B2430"/>
-                <w:sz w:val="19"/>
-                <w:szCs w:val="19"/>
-              </w:rPr>
-              <w:t xml:space="preserve">system, system_deployment, component_type, component, system_component</w:t>
-            </w:r>
-          </w:p>
-        </w:tc>
-        <w:tc>
-          <w:tcPr>
-            <w:tcW w:type="dxa" w:w="4038"/>
-            <w:tcBorders>
-              <w:top w:val="single" w:color="D6DAD3" w:sz="4"/>
-              <w:left w:val="single" w:color="D6DAD3" w:sz="4"/>
-              <w:bottom w:val="single" w:color="D6DAD3" w:sz="4"/>
-              <w:right w:val="single" w:color="D6DAD3" w:sz="4"/>
-            </w:tcBorders>
-            <w:tcMar>
-              <w:top w:type="dxa" w:w="60"/>
-              <w:left w:type="dxa" w:w="100"/>
-              <w:bottom w:type="dxa" w:w="60"/>
-              <w:right w:type="dxa" w:w="100"/>
-            </w:tcMar>
-          </w:tcPr>
-          <w:p>
-            <w:pPr>
-              <w:spacing w:after="0" w:line="252"/>
-            </w:pPr>
-            <w:r>
-              <w:rPr>
-                <w:rFonts w:ascii="Calibri" w:cs="Calibri" w:eastAsia="Calibri" w:hAnsi="Calibri"/>
-                <w:color w:val="1B2430"/>
-                <w:sz w:val="22"/>
-                <w:szCs w:val="22"/>
-              </w:rPr>
-              <w:t xml:space="preserve">Every PikPak, where it is and was, what is fitted in it.</w:t>
-            </w:r>
-          </w:p>
-        </w:tc>
-      </w:tr>
-      <w:tr>
-        <w:trPr>
-          <w:cantSplit/>
-        </w:trPr>
-        <w:tc>
-          <w:tcPr>
-            <w:tcW w:type="dxa" w:w="2400"/>
-            <w:tcBorders>
-              <w:top w:val="single" w:color="D6DAD3" w:sz="4"/>
-              <w:left w:val="single" w:color="D6DAD3" w:sz="4"/>
-              <w:bottom w:val="single" w:color="D6DAD3" w:sz="4"/>
-              <w:right w:val="single" w:color="D6DAD3" w:sz="4"/>
-            </w:tcBorders>
-            <w:tcMar>
-              <w:top w:type="dxa" w:w="60"/>
-              <w:left w:type="dxa" w:w="100"/>
-              <w:bottom w:type="dxa" w:w="60"/>
-              <w:right w:type="dxa" w:w="100"/>
-            </w:tcMar>
-          </w:tcPr>
-          <w:p>
-            <w:pPr>
-              <w:spacing w:after="0" w:line="252"/>
-            </w:pPr>
-            <w:r>
-              <w:rPr>
-                <w:rFonts w:ascii="Calibri" w:cs="Calibri" w:eastAsia="Calibri" w:hAnsi="Calibri"/>
-                <w:color w:val="1B2430"/>
-                <w:sz w:val="22"/>
-                <w:szCs w:val="22"/>
-              </w:rPr>
-              <w:t xml:space="preserve">3 · Products and trays</w:t>
-            </w:r>
-          </w:p>
-        </w:tc>
-        <w:tc>
-          <w:tcPr>
-            <w:tcW w:type="dxa" w:w="3200"/>
-            <w:tcBorders>
-              <w:top w:val="single" w:color="D6DAD3" w:sz="4"/>
-              <w:left w:val="single" w:color="D6DAD3" w:sz="4"/>
-              <w:bottom w:val="single" w:color="D6DAD3" w:sz="4"/>
-              <w:right w:val="single" w:color="D6DAD3" w:sz="4"/>
-            </w:tcBorders>
-            <w:tcMar>
-              <w:top w:type="dxa" w:w="60"/>
-              <w:left w:type="dxa" w:w="100"/>
-              <w:bottom w:type="dxa" w:w="60"/>
-              <w:right w:type="dxa" w:w="100"/>
-            </w:tcMar>
-          </w:tcPr>
-          <w:p>
-            <w:pPr>
-              <w:spacing w:after="0" w:line="252"/>
-            </w:pPr>
-            <w:r>
-              <w:rPr>
-                <w:rFonts w:ascii="Consolas" w:cs="Consolas" w:eastAsia="Consolas" w:hAnsi="Consolas"/>
-                <w:color w:val="1B2430"/>
-                <w:sz w:val="19"/>
-                <w:szCs w:val="19"/>
-              </w:rPr>
-              <w:t xml:space="preserve">sku, sku_attachment, tray</w:t>
-            </w:r>
-          </w:p>
-        </w:tc>
-        <w:tc>
-          <w:tcPr>
-            <w:tcW w:type="dxa" w:w="4038"/>
-            <w:tcBorders>
-              <w:top w:val="single" w:color="D6DAD3" w:sz="4"/>
-              <w:left w:val="single" w:color="D6DAD3" w:sz="4"/>
-              <w:bottom w:val="single" w:color="D6DAD3" w:sz="4"/>
-              <w:right w:val="single" w:color="D6DAD3" w:sz="4"/>
-            </w:tcBorders>
-            <w:tcMar>
-              <w:top w:type="dxa" w:w="60"/>
-              <w:left w:type="dxa" w:w="100"/>
-              <w:bottom w:type="dxa" w:w="60"/>
-              <w:right w:type="dxa" w:w="100"/>
-            </w:tcMar>
-          </w:tcPr>
-          <w:p>
-            <w:pPr>
-              <w:spacing w:after="0" w:line="252"/>
-            </w:pPr>
-            <w:r>
-              <w:rPr>
-                <w:rFonts w:ascii="Calibri" w:cs="Calibri" w:eastAsia="Calibri" w:hAnsi="Calibri"/>
-                <w:color w:val="1B2430"/>
-                <w:sz w:val="22"/>
-                <w:szCs w:val="22"/>
-              </w:rPr>
-              <w:t xml:space="preserve">Every product line, its pictures, and the tray it is packed in. A SKU is the same wherever it is packed, so it belongs to no one customer.</w:t>
-            </w:r>
-          </w:p>
-        </w:tc>
-      </w:tr>
-      <w:tr>
-        <w:trPr>
-          <w:cantSplit/>
-        </w:trPr>
-        <w:tc>
-          <w:tcPr>
-            <w:tcW w:type="dxa" w:w="2400"/>
-            <w:tcBorders>
-              <w:top w:val="single" w:color="D6DAD3" w:sz="4"/>
-              <w:left w:val="single" w:color="D6DAD3" w:sz="4"/>
-              <w:bottom w:val="single" w:color="D6DAD3" w:sz="4"/>
-              <w:right w:val="single" w:color="D6DAD3" w:sz="4"/>
-            </w:tcBorders>
-            <w:tcMar>
-              <w:top w:type="dxa" w:w="60"/>
-              <w:left w:type="dxa" w:w="100"/>
-              <w:bottom w:type="dxa" w:w="60"/>
-              <w:right w:type="dxa" w:w="100"/>
-            </w:tcMar>
-          </w:tcPr>
-          <w:p>
-            <w:pPr>
-              <w:spacing w:after="0" w:line="252"/>
-            </w:pPr>
-            <w:r>
-              <w:rPr>
-                <w:rFonts w:ascii="Calibri" w:cs="Calibri" w:eastAsia="Calibri" w:hAnsi="Calibri"/>
-                <w:color w:val="1B2430"/>
-                <w:sz w:val="22"/>
-                <w:szCs w:val="22"/>
-              </w:rPr>
-              <w:t xml:space="preserve">4 · Maintenance</w:t>
-            </w:r>
-          </w:p>
-        </w:tc>
-        <w:tc>
-          <w:tcPr>
-            <w:tcW w:type="dxa" w:w="3200"/>
-            <w:tcBorders>
-              <w:top w:val="single" w:color="D6DAD3" w:sz="4"/>
-              <w:left w:val="single" w:color="D6DAD3" w:sz="4"/>
-              <w:bottom w:val="single" w:color="D6DAD3" w:sz="4"/>
-              <w:right w:val="single" w:color="D6DAD3" w:sz="4"/>
-            </w:tcBorders>
-            <w:tcMar>
-              <w:top w:type="dxa" w:w="60"/>
-              <w:left w:type="dxa" w:w="100"/>
-              <w:bottom w:type="dxa" w:w="60"/>
-              <w:right w:type="dxa" w:w="100"/>
-            </w:tcMar>
-          </w:tcPr>
-          <w:p>
-            <w:pPr>
-              <w:spacing w:after="0" w:line="252"/>
-            </w:pPr>
-            <w:r>
-              <w:rPr>
-                <w:rFonts w:ascii="Consolas" w:cs="Consolas" w:eastAsia="Consolas" w:hAnsi="Consolas"/>
-                <w:color w:val="1B2430"/>
-                <w:sz w:val="19"/>
-                <w:szCs w:val="19"/>
-              </w:rPr>
-              <w:t xml:space="preserve">maintenance_event, maintenance_action, maintenance_schedule</w:t>
-            </w:r>
-          </w:p>
-        </w:tc>
-        <w:tc>
-          <w:tcPr>
-            <w:tcW w:type="dxa" w:w="4038"/>
-            <w:tcBorders>
-              <w:top w:val="single" w:color="D6DAD3" w:sz="4"/>
-              <w:left w:val="single" w:color="D6DAD3" w:sz="4"/>
-              <w:bottom w:val="single" w:color="D6DAD3" w:sz="4"/>
-              <w:right w:val="single" w:color="D6DAD3" w:sz="4"/>
-            </w:tcBorders>
-            <w:tcMar>
-              <w:top w:type="dxa" w:w="60"/>
-              <w:left w:type="dxa" w:w="100"/>
-              <w:bottom w:type="dxa" w:w="60"/>
-              <w:right w:type="dxa" w:w="100"/>
-            </w:tcMar>
-          </w:tcPr>
-          <w:p>
-            <w:pPr>
-              <w:spacing w:after="0" w:line="252"/>
-            </w:pPr>
-            <w:r>
-              <w:rPr>
-                <w:rFonts w:ascii="Calibri" w:cs="Calibri" w:eastAsia="Calibri" w:hAnsi="Calibri"/>
-                <w:color w:val="1B2430"/>
-                <w:sz w:val="22"/>
-                <w:szCs w:val="22"/>
-              </w:rPr>
-              <w:t xml:space="preserve">What was done to each system, by whom, and what is due.</w:t>
-            </w:r>
-          </w:p>
-        </w:tc>
-      </w:tr>
-      <w:tr>
-        <w:trPr>
-          <w:cantSplit/>
-        </w:trPr>
-        <w:tc>
-          <w:tcPr>
-            <w:tcW w:type="dxa" w:w="2400"/>
-            <w:tcBorders>
-              <w:top w:val="single" w:color="D6DAD3" w:sz="4"/>
-              <w:left w:val="single" w:color="D6DAD3" w:sz="4"/>
-              <w:bottom w:val="single" w:color="D6DAD3" w:sz="4"/>
-              <w:right w:val="single" w:color="D6DAD3" w:sz="4"/>
-            </w:tcBorders>
-            <w:tcMar>
-              <w:top w:type="dxa" w:w="60"/>
-              <w:left w:type="dxa" w:w="100"/>
-              <w:bottom w:type="dxa" w:w="60"/>
-              <w:right w:type="dxa" w:w="100"/>
-            </w:tcMar>
-          </w:tcPr>
-          <w:p>
-            <w:pPr>
-              <w:spacing w:after="0" w:line="252"/>
-            </w:pPr>
-            <w:r>
-              <w:rPr>
-                <w:rFonts w:ascii="Calibri" w:cs="Calibri" w:eastAsia="Calibri" w:hAnsi="Calibri"/>
-                <w:color w:val="1B2430"/>
-                <w:sz w:val="22"/>
-                <w:szCs w:val="22"/>
-              </w:rPr>
-              <w:t xml:space="preserve">5 · Issues and root causes</w:t>
-            </w:r>
-          </w:p>
-        </w:tc>
-        <w:tc>
-          <w:tcPr>
-            <w:tcW w:type="dxa" w:w="3200"/>
-            <w:tcBorders>
-              <w:top w:val="single" w:color="D6DAD3" w:sz="4"/>
-              <w:left w:val="single" w:color="D6DAD3" w:sz="4"/>
-              <w:bottom w:val="single" w:color="D6DAD3" w:sz="4"/>
-              <w:right w:val="single" w:color="D6DAD3" w:sz="4"/>
-            </w:tcBorders>
-            <w:tcMar>
-              <w:top w:type="dxa" w:w="60"/>
-              <w:left w:type="dxa" w:w="100"/>
-              <w:bottom w:type="dxa" w:w="60"/>
-              <w:right w:type="dxa" w:w="100"/>
-            </w:tcMar>
-          </w:tcPr>
-          <w:p>
-            <w:pPr>
-              <w:spacing w:after="0" w:line="252"/>
-            </w:pPr>
-            <w:r>
-              <w:rPr>
-                <w:rFonts w:ascii="Consolas" w:cs="Consolas" w:eastAsia="Consolas" w:hAnsi="Consolas"/>
-                <w:color w:val="1B2430"/>
-                <w:sz w:val="19"/>
-                <w:szCs w:val="19"/>
-              </w:rPr>
-              <w:t xml:space="preserve">issue, root_cause, issue_attachment, issue_maintenance</w:t>
-            </w:r>
-          </w:p>
-        </w:tc>
-        <w:tc>
-          <w:tcPr>
-            <w:tcW w:type="dxa" w:w="4038"/>
-            <w:tcBorders>
-              <w:top w:val="single" w:color="D6DAD3" w:sz="4"/>
-              <w:left w:val="single" w:color="D6DAD3" w:sz="4"/>
-              <w:bottom w:val="single" w:color="D6DAD3" w:sz="4"/>
-              <w:right w:val="single" w:color="D6DAD3" w:sz="4"/>
-            </w:tcBorders>
-            <w:tcMar>
-              <w:top w:type="dxa" w:w="60"/>
-              <w:left w:type="dxa" w:w="100"/>
-              <w:bottom w:type="dxa" w:w="60"/>
-              <w:right w:type="dxa" w:w="100"/>
-            </w:tcMar>
-          </w:tcPr>
-          <w:p>
-            <w:pPr>
-              <w:spacing w:after="0" w:line="252"/>
-            </w:pPr>
-            <w:r>
-              <w:rPr>
-                <w:rFonts w:ascii="Calibri" w:cs="Calibri" w:eastAsia="Calibri" w:hAnsi="Calibri"/>
-                <w:color w:val="1B2430"/>
-                <w:sz w:val="22"/>
-                <w:szCs w:val="22"/>
-              </w:rPr>
-              <w:t xml:space="preserve">What went wrong, why, and what fixed it.</w:t>
-            </w:r>
-          </w:p>
-        </w:tc>
-      </w:tr>
-      <w:tr>
-        <w:trPr>
-          <w:cantSplit/>
-        </w:trPr>
-        <w:tc>
-          <w:tcPr>
-            <w:tcW w:type="dxa" w:w="2400"/>
-            <w:tcBorders>
-              <w:top w:val="single" w:color="D6DAD3" w:sz="4"/>
-              <w:left w:val="single" w:color="D6DAD3" w:sz="4"/>
-              <w:bottom w:val="single" w:color="D6DAD3" w:sz="4"/>
-              <w:right w:val="single" w:color="D6DAD3" w:sz="4"/>
-            </w:tcBorders>
-            <w:tcMar>
-              <w:top w:type="dxa" w:w="60"/>
-              <w:left w:type="dxa" w:w="100"/>
-              <w:bottom w:type="dxa" w:w="60"/>
-              <w:right w:type="dxa" w:w="100"/>
-            </w:tcMar>
-          </w:tcPr>
-          <w:p>
-            <w:pPr>
-              <w:spacing w:after="0" w:line="252"/>
-            </w:pPr>
-            <w:r>
-              <w:rPr>
-                <w:rFonts w:ascii="Calibri" w:cs="Calibri" w:eastAsia="Calibri" w:hAnsi="Calibri"/>
-                <w:color w:val="1B2430"/>
-                <w:sz w:val="22"/>
-                <w:szCs w:val="22"/>
-              </w:rPr>
-              <w:t xml:space="preserve">6 · Software</w:t>
-            </w:r>
-          </w:p>
-        </w:tc>
-        <w:tc>
-          <w:tcPr>
-            <w:tcW w:type="dxa" w:w="3200"/>
-            <w:tcBorders>
-              <w:top w:val="single" w:color="D6DAD3" w:sz="4"/>
-              <w:left w:val="single" w:color="D6DAD3" w:sz="4"/>
-              <w:bottom w:val="single" w:color="D6DAD3" w:sz="4"/>
-              <w:right w:val="single" w:color="D6DAD3" w:sz="4"/>
-            </w:tcBorders>
-            <w:tcMar>
-              <w:top w:type="dxa" w:w="60"/>
-              <w:left w:type="dxa" w:w="100"/>
-              <w:bottom w:type="dxa" w:w="60"/>
-              <w:right w:type="dxa" w:w="100"/>
-            </w:tcMar>
-          </w:tcPr>
-          <w:p>
-            <w:pPr>
-              <w:spacing w:after="0" w:line="252"/>
-            </w:pPr>
-            <w:r>
-              <w:rPr>
-                <w:rFonts w:ascii="Consolas" w:cs="Consolas" w:eastAsia="Consolas" w:hAnsi="Consolas"/>
-                <w:color w:val="1B2430"/>
-                <w:sz w:val="19"/>
-                <w:szCs w:val="19"/>
-              </w:rPr>
-              <w:t xml:space="preserve">software_package, software_release, system_software</w:t>
-            </w:r>
-          </w:p>
-        </w:tc>
-        <w:tc>
-          <w:tcPr>
-            <w:tcW w:type="dxa" w:w="4038"/>
-            <w:tcBorders>
-              <w:top w:val="single" w:color="D6DAD3" w:sz="4"/>
-              <w:left w:val="single" w:color="D6DAD3" w:sz="4"/>
-              <w:bottom w:val="single" w:color="D6DAD3" w:sz="4"/>
-              <w:right w:val="single" w:color="D6DAD3" w:sz="4"/>
-            </w:tcBorders>
-            <w:tcMar>
-              <w:top w:type="dxa" w:w="60"/>
-              <w:left w:type="dxa" w:w="100"/>
-              <w:bottom w:type="dxa" w:w="60"/>
-              <w:right w:type="dxa" w:w="100"/>
-            </w:tcMar>
-          </w:tcPr>
-          <w:p>
-            <w:pPr>
-              <w:spacing w:after="0" w:line="252"/>
-            </w:pPr>
-            <w:r>
-              <w:rPr>
-                <w:rFonts w:ascii="Calibri" w:cs="Calibri" w:eastAsia="Calibri" w:hAnsi="Calibri"/>
-                <w:color w:val="1B2430"/>
-                <w:sz w:val="22"/>
-                <w:szCs w:val="22"/>
-              </w:rPr>
-              <w:t xml:space="preserve">Which release each system runs and which are approved.</w:t>
-            </w:r>
-          </w:p>
-        </w:tc>
-      </w:tr>
-      <w:tr>
-        <w:trPr>
-          <w:cantSplit/>
-        </w:trPr>
-        <w:tc>
-          <w:tcPr>
-            <w:tcW w:type="dxa" w:w="2400"/>
-            <w:tcBorders>
-              <w:top w:val="single" w:color="D6DAD3" w:sz="4"/>
-              <w:left w:val="single" w:color="D6DAD3" w:sz="4"/>
-              <w:bottom w:val="single" w:color="D6DAD3" w:sz="4"/>
-              <w:right w:val="single" w:color="D6DAD3" w:sz="4"/>
-            </w:tcBorders>
-            <w:tcMar>
-              <w:top w:type="dxa" w:w="60"/>
-              <w:left w:type="dxa" w:w="100"/>
-              <w:bottom w:type="dxa" w:w="60"/>
-              <w:right w:type="dxa" w:w="100"/>
-            </w:tcMar>
-          </w:tcPr>
-          <w:p>
-            <w:pPr>
-              <w:spacing w:after="0" w:line="252"/>
-            </w:pPr>
-            <w:r>
-              <w:rPr>
-                <w:rFonts w:ascii="Calibri" w:cs="Calibri" w:eastAsia="Calibri" w:hAnsi="Calibri"/>
-                <w:color w:val="1B2430"/>
-                <w:sz w:val="22"/>
-                <w:szCs w:val="22"/>
-              </w:rPr>
-              <w:t xml:space="preserve">7 · Production</w:t>
-            </w:r>
-          </w:p>
-        </w:tc>
-        <w:tc>
-          <w:tcPr>
-            <w:tcW w:type="dxa" w:w="3200"/>
-            <w:tcBorders>
-              <w:top w:val="single" w:color="D6DAD3" w:sz="4"/>
-              <w:left w:val="single" w:color="D6DAD3" w:sz="4"/>
-              <w:bottom w:val="single" w:color="D6DAD3" w:sz="4"/>
-              <w:right w:val="single" w:color="D6DAD3" w:sz="4"/>
-            </w:tcBorders>
-            <w:tcMar>
-              <w:top w:type="dxa" w:w="60"/>
-              <w:left w:type="dxa" w:w="100"/>
-              <w:bottom w:type="dxa" w:w="60"/>
-              <w:right w:type="dxa" w:w="100"/>
-            </w:tcMar>
-          </w:tcPr>
-          <w:p>
-            <w:pPr>
-              <w:spacing w:after="0" w:line="252"/>
-            </w:pPr>
-            <w:r>
-              <w:rPr>
-                <w:rFonts w:ascii="Consolas" w:cs="Consolas" w:eastAsia="Consolas" w:hAnsi="Consolas"/>
-                <w:color w:val="1B2430"/>
-                <w:sz w:val="19"/>
-                <w:szCs w:val="19"/>
-              </w:rPr>
-              <w:t xml:space="preserve">production_run, production_day</w:t>
-            </w:r>
-          </w:p>
-        </w:tc>
-        <w:tc>
-          <w:tcPr>
-            <w:tcW w:type="dxa" w:w="4038"/>
-            <w:tcBorders>
-              <w:top w:val="single" w:color="D6DAD3" w:sz="4"/>
-              <w:left w:val="single" w:color="D6DAD3" w:sz="4"/>
-              <w:bottom w:val="single" w:color="D6DAD3" w:sz="4"/>
-              <w:right w:val="single" w:color="D6DAD3" w:sz="4"/>
-            </w:tcBorders>
-            <w:tcMar>
-              <w:top w:type="dxa" w:w="60"/>
-              <w:left w:type="dxa" w:w="100"/>
-              <w:bottom w:type="dxa" w:w="60"/>
-              <w:right w:type="dxa" w:w="100"/>
-            </w:tcMar>
-          </w:tcPr>
-          <w:p>
-            <w:pPr>
-              <w:spacing w:after="0" w:line="252"/>
-            </w:pPr>
-            <w:r>
-              <w:rPr>
-                <w:rFonts w:ascii="Calibri" w:cs="Calibri" w:eastAsia="Calibri" w:hAnsi="Calibri"/>
-                <w:color w:val="1B2430"/>
-                <w:sz w:val="22"/>
-                <w:szCs w:val="22"/>
-              </w:rPr>
-              <w:t xml:space="preserve">Which SKU went into which tray on which system on which day, and how many. Fed from Elastic, not typed.</w:t>
-            </w:r>
-          </w:p>
-        </w:tc>
-      </w:tr>
-    </w:tbl>
     <w:p>
       <w:pPr>
         <w:pStyle w:val="Heading2"/>

</xml_diff>